<commit_message>
Atualizar tarefas individuais e Moodle
</commit_message>
<xml_diff>
--- a/Manual/UFCD0754_Tarefas_Individuais.docx
+++ b/Manual/UFCD0754_Tarefas_Individuais.docx
@@ -380,23 +380,13 @@
           <w:szCs w:val="24"/>
         </w:rPr>
       </w:pPr>
-      <w:proofErr w:type="gramStart"/>
-      <w:r>
-        <w:rPr>
-          <w:rFonts w:ascii="Segoe UI Emoji" w:hAnsi="Segoe UI Emoji"/>
-          <w:sz w:val="20"/>
-          <w:szCs w:val="24"/>
-        </w:rPr>
-        <w:t>Criar uma nova</w:t>
-      </w:r>
-      <w:proofErr w:type="gramEnd"/>
-      <w:r>
-        <w:rPr>
-          <w:rFonts w:ascii="Segoe UI Emoji" w:hAnsi="Segoe UI Emoji"/>
-          <w:sz w:val="20"/>
-          <w:szCs w:val="24"/>
-        </w:rPr>
-        <w:t xml:space="preserve"> cópia em cada tarefa e manter as versões anteriores.</w:t>
+      <w:r>
+        <w:rPr>
+          <w:rFonts w:ascii="Segoe UI Emoji" w:hAnsi="Segoe UI Emoji"/>
+          <w:sz w:val="20"/>
+          <w:szCs w:val="24"/>
+        </w:rPr>
+        <w:t>Criar uma nova cópia em cada tarefa e manter as versões anteriores.</w:t>
       </w:r>
     </w:p>
     <w:p>
@@ -657,25 +647,7 @@
           <w:sz w:val="20"/>
           <w:szCs w:val="24"/>
         </w:rPr>
-        <w:t xml:space="preserve">Dentro da pasta da Drive, </w:t>
-      </w:r>
-      <w:proofErr w:type="gramStart"/>
-      <w:r>
-        <w:rPr>
-          <w:rFonts w:ascii="Segoe UI Emoji" w:hAnsi="Segoe UI Emoji"/>
-          <w:sz w:val="20"/>
-          <w:szCs w:val="24"/>
-        </w:rPr>
-        <w:t>criar um novo</w:t>
-      </w:r>
-      <w:proofErr w:type="gramEnd"/>
-      <w:r>
-        <w:rPr>
-          <w:rFonts w:ascii="Segoe UI Emoji" w:hAnsi="Segoe UI Emoji"/>
-          <w:sz w:val="20"/>
-          <w:szCs w:val="24"/>
-        </w:rPr>
-        <w:t xml:space="preserve"> documento no Google Docs.</w:t>
+        <w:t>Dentro da pasta da Drive, criar um novo documento no Google Docs.</w:t>
       </w:r>
     </w:p>
     <w:p>
@@ -752,25 +724,7 @@
           <w:szCs w:val="24"/>
         </w:rPr>
         <w:lastRenderedPageBreak/>
-        <w:t xml:space="preserve">Confirmar que a pasta está partilhada com a formadora, o Google </w:t>
-      </w:r>
-      <w:proofErr w:type="spellStart"/>
-      <w:r>
-        <w:rPr>
-          <w:rFonts w:ascii="Segoe UI Emoji" w:hAnsi="Segoe UI Emoji"/>
-          <w:sz w:val="20"/>
-          <w:szCs w:val="24"/>
-        </w:rPr>
-        <w:t>Docs</w:t>
-      </w:r>
-      <w:proofErr w:type="spellEnd"/>
-      <w:r>
-        <w:rPr>
-          <w:rFonts w:ascii="Segoe UI Emoji" w:hAnsi="Segoe UI Emoji"/>
-          <w:sz w:val="20"/>
-          <w:szCs w:val="24"/>
-        </w:rPr>
-        <w:t xml:space="preserve"> está dentro da pasta e todos os elementos do grupo conseguem abrir e editar o documento.</w:t>
+        <w:t>Confirmar que a pasta está partilhada com a formadora, o Google Docs está dentro da pasta e todos os elementos do grupo conseguem abrir e editar o documento.</w:t>
       </w:r>
     </w:p>
     <w:p>
@@ -864,25 +818,7 @@
           <w:sz w:val="20"/>
           <w:szCs w:val="24"/>
         </w:rPr>
-        <w:t xml:space="preserve">Um Google </w:t>
-      </w:r>
-      <w:proofErr w:type="spellStart"/>
-      <w:r>
-        <w:rPr>
-          <w:rFonts w:ascii="Segoe UI Emoji" w:hAnsi="Segoe UI Emoji"/>
-          <w:sz w:val="20"/>
-          <w:szCs w:val="24"/>
-        </w:rPr>
-        <w:t>Docs</w:t>
-      </w:r>
-      <w:proofErr w:type="spellEnd"/>
-      <w:r>
-        <w:rPr>
-          <w:rFonts w:ascii="Segoe UI Emoji" w:hAnsi="Segoe UI Emoji"/>
-          <w:sz w:val="20"/>
-          <w:szCs w:val="24"/>
-        </w:rPr>
-        <w:t xml:space="preserve"> «Grupo [n.º] — Documento partilhado» dentro da pasta da Drive e partilhado com o grupo.</w:t>
+        <w:t>Um Google Docs «Grupo [n.º] — Documento partilhado» dentro da pasta da Drive e partilhado com o grupo.</w:t>
       </w:r>
     </w:p>
     <w:p>
@@ -4382,7 +4318,7 @@
           <w:sz w:val="22"/>
           <w:szCs w:val="24"/>
         </w:rPr>
-        <w:t>Controlar a identidade e a paginação de diferentes secções de um documento.</w:t>
+        <w:t>Controlar a configuração, a identidade e a paginação de diferentes secções e preparar uma cópia em Livro dobrado.</w:t>
       </w:r>
     </w:p>
     <w:p>
@@ -4406,115 +4342,188 @@
     <w:p>
       <w:pPr>
         <w:pStyle w:val="Listacommarcas"/>
-        <w:spacing w:after="40"/>
-        <w:rPr>
-          <w:rFonts w:ascii="Segoe UI Emoji" w:hAnsi="Segoe UI Emoji"/>
-          <w:sz w:val="20"/>
-          <w:szCs w:val="24"/>
-        </w:rPr>
-      </w:pPr>
-      <w:r>
-        <w:rPr>
-          <w:rFonts w:ascii="Segoe UI Emoji" w:hAnsi="Segoe UI Emoji"/>
-          <w:sz w:val="20"/>
-          <w:szCs w:val="24"/>
-        </w:rPr>
-        <w:t>Realizar «Cabeçalhos e rodapés» e guardar como «2026-07_10_Cabecalhos_PrimeiroNome.docx».</w:t>
+        <w:ind w:left="403" w:hanging="230"/>
+        <w:rPr>
+          <w:rFonts w:ascii="Segoe UI Emoji" w:hAnsi="Segoe UI Emoji"/>
+          <w:szCs w:val="24"/>
+        </w:rPr>
+      </w:pPr>
+      <w:r>
+        <w:rPr>
+          <w:rFonts w:ascii="Segoe UI Emoji" w:hAnsi="Segoe UI Emoji"/>
+          <w:szCs w:val="24"/>
+        </w:rPr>
+        <w:t xml:space="preserve">Realizar «Cabeçalhos e rodapés» e guardar como 2026-07_10_Cabecalhos_PrimeiroNome.docx. </w:t>
       </w:r>
     </w:p>
     <w:p>
       <w:pPr>
         <w:pStyle w:val="Listacommarcas"/>
-        <w:spacing w:after="40"/>
-        <w:rPr>
-          <w:rFonts w:ascii="Segoe UI Emoji" w:hAnsi="Segoe UI Emoji"/>
-          <w:sz w:val="20"/>
-          <w:szCs w:val="24"/>
-        </w:rPr>
-      </w:pPr>
-      <w:r>
-        <w:rPr>
-          <w:rFonts w:ascii="Segoe UI Emoji" w:hAnsi="Segoe UI Emoji"/>
-          <w:sz w:val="20"/>
-          <w:szCs w:val="24"/>
-        </w:rPr>
-        <w:t>Configurar primeira página diferente e páginas pares e ímpares diferentes; inserir numeração automática.</w:t>
+        <w:ind w:left="403" w:hanging="230"/>
+        <w:rPr>
+          <w:rFonts w:ascii="Segoe UI Emoji" w:hAnsi="Segoe UI Emoji"/>
+          <w:szCs w:val="24"/>
+        </w:rPr>
+      </w:pPr>
+      <w:r>
+        <w:rPr>
+          <w:rFonts w:ascii="Segoe UI Emoji" w:hAnsi="Segoe UI Emoji"/>
+          <w:szCs w:val="24"/>
+        </w:rPr>
+        <w:t xml:space="preserve">Configurar a primeira página diferente, páginas pares e ímpares diferentes, numeração automática e a opção «Ligar ao anterior». </w:t>
       </w:r>
     </w:p>
     <w:p>
       <w:pPr>
         <w:pStyle w:val="Listacommarcas"/>
-        <w:spacing w:after="40"/>
-        <w:rPr>
-          <w:rFonts w:ascii="Segoe UI Emoji" w:hAnsi="Segoe UI Emoji"/>
-          <w:sz w:val="20"/>
-          <w:szCs w:val="24"/>
-        </w:rPr>
-      </w:pPr>
-      <w:r>
-        <w:rPr>
-          <w:rFonts w:ascii="Segoe UI Emoji" w:hAnsi="Segoe UI Emoji"/>
-          <w:sz w:val="20"/>
-          <w:szCs w:val="24"/>
-        </w:rPr>
-        <w:t>Realizar «Configuração de página» e guardar como «2026-07_11_Configuracao_PrimeiroNome.docx».</w:t>
+        <w:ind w:left="403" w:hanging="230"/>
+        <w:rPr>
+          <w:rFonts w:ascii="Segoe UI Emoji" w:hAnsi="Segoe UI Emoji"/>
+          <w:szCs w:val="24"/>
+        </w:rPr>
+      </w:pPr>
+      <w:r>
+        <w:rPr>
+          <w:rFonts w:ascii="Segoe UI Emoji" w:hAnsi="Segoe UI Emoji"/>
+          <w:szCs w:val="24"/>
+        </w:rPr>
+        <w:t xml:space="preserve">Criar três secções funcionais e configurar cabeçalhos e rodapés independentes. </w:t>
       </w:r>
     </w:p>
     <w:p>
       <w:pPr>
         <w:pStyle w:val="Listacommarcas"/>
-        <w:spacing w:after="40"/>
-        <w:rPr>
-          <w:rFonts w:ascii="Segoe UI Emoji" w:hAnsi="Segoe UI Emoji"/>
-          <w:sz w:val="20"/>
-          <w:szCs w:val="24"/>
-        </w:rPr>
-      </w:pPr>
-      <w:r>
-        <w:rPr>
-          <w:rFonts w:ascii="Segoe UI Emoji" w:hAnsi="Segoe UI Emoji"/>
-          <w:sz w:val="20"/>
-          <w:szCs w:val="24"/>
-        </w:rPr>
-        <w:t>Criar pelo menos três secções e aplicar cabeçalhos diferentes, controlando «Ligar ao anterior».</w:t>
+        <w:ind w:left="403" w:hanging="230"/>
+        <w:rPr>
+          <w:rFonts w:ascii="Segoe UI Emoji" w:hAnsi="Segoe UI Emoji"/>
+          <w:szCs w:val="24"/>
+        </w:rPr>
+      </w:pPr>
+      <w:r>
+        <w:rPr>
+          <w:rFonts w:ascii="Segoe UI Emoji" w:hAnsi="Segoe UI Emoji"/>
+          <w:szCs w:val="24"/>
+        </w:rPr>
+        <w:t xml:space="preserve">Realizar «Configuração de página», guardar como 2026-07_11_Configuracao_PrimeiroNome.docx e concluir as experiências de tamanho e orientação, margens, quebras, marca de água e pré-visualização. </w:t>
       </w:r>
     </w:p>
     <w:p>
       <w:pPr>
         <w:pStyle w:val="Listacommarcas"/>
-        <w:spacing w:after="40"/>
-        <w:rPr>
-          <w:rFonts w:ascii="Segoe UI Emoji" w:hAnsi="Segoe UI Emoji"/>
-          <w:sz w:val="20"/>
-          <w:szCs w:val="24"/>
-        </w:rPr>
-      </w:pPr>
-      <w:r>
-        <w:rPr>
-          <w:rFonts w:ascii="Segoe UI Emoji" w:hAnsi="Segoe UI Emoji"/>
-          <w:sz w:val="20"/>
-          <w:szCs w:val="24"/>
-        </w:rPr>
-        <w:t>Alterar a orientação ou as margens apenas numa secção e iniciar a numeração do corpo no número indicado.</w:t>
+        <w:ind w:left="403" w:hanging="230"/>
+        <w:rPr>
+          <w:rFonts w:ascii="Segoe UI Emoji" w:hAnsi="Segoe UI Emoji"/>
+          <w:szCs w:val="24"/>
+        </w:rPr>
+      </w:pPr>
+      <w:r>
+        <w:rPr>
+          <w:rFonts w:ascii="Segoe UI Emoji" w:hAnsi="Segoe UI Emoji"/>
+          <w:szCs w:val="24"/>
+        </w:rPr>
+        <w:t xml:space="preserve">Criar uma nova cópia com quatro páginas e guardá-la como 2026-07_11_Configuracao_Livro_PrimeiroNome.docx. </w:t>
       </w:r>
     </w:p>
     <w:p>
       <w:pPr>
         <w:pStyle w:val="Listacommarcas"/>
-        <w:spacing w:after="40"/>
-        <w:rPr>
-          <w:rFonts w:ascii="Segoe UI Emoji" w:hAnsi="Segoe UI Emoji"/>
-          <w:sz w:val="20"/>
-          <w:szCs w:val="24"/>
-        </w:rPr>
-      </w:pPr>
-      <w:r>
-        <w:rPr>
-          <w:rFonts w:ascii="Segoe UI Emoji" w:hAnsi="Segoe UI Emoji"/>
-          <w:sz w:val="20"/>
-          <w:szCs w:val="24"/>
-        </w:rPr>
-        <w:t>Verificar a pré-visualização e guardar os dois ficheiros no computador e na Drive.</w:t>
+        <w:ind w:left="403" w:hanging="230"/>
+        <w:rPr>
+          <w:rFonts w:ascii="Segoe UI Emoji" w:hAnsi="Segoe UI Emoji"/>
+          <w:szCs w:val="24"/>
+        </w:rPr>
+      </w:pPr>
+      <w:r>
+        <w:rPr>
+          <w:rFonts w:ascii="Segoe UI Emoji" w:hAnsi="Segoe UI Emoji"/>
+          <w:szCs w:val="24"/>
+        </w:rPr>
+        <w:t xml:space="preserve">Confirmar que o número total de páginas da nova cópia é múltiplo de quatro. </w:t>
+      </w:r>
+    </w:p>
+    <w:p>
+      <w:pPr>
+        <w:pStyle w:val="Listacommarcas"/>
+        <w:ind w:left="403" w:hanging="230"/>
+        <w:rPr>
+          <w:rFonts w:ascii="Segoe UI Emoji" w:hAnsi="Segoe UI Emoji"/>
+          <w:szCs w:val="24"/>
+        </w:rPr>
+      </w:pPr>
+      <w:r>
+        <w:rPr>
+          <w:rFonts w:ascii="Segoe UI Emoji" w:hAnsi="Segoe UI Emoji"/>
+          <w:szCs w:val="24"/>
+        </w:rPr>
+        <w:t xml:space="preserve">Aplicar «Livro dobrado», definir uma margem de encadernação adequada e verificar a disposição em </w:t>
+      </w:r>
+      <w:r>
+        <w:rPr>
+          <w:rFonts w:ascii="Segoe UI Emoji" w:hAnsi="Segoe UI Emoji"/>
+          <w:b/>
+          <w:bCs/>
+          <w:szCs w:val="24"/>
+        </w:rPr>
+        <w:t>Ficheiro → Imprimir</w:t>
+      </w:r>
+      <w:r>
+        <w:rPr>
+          <w:rFonts w:ascii="Segoe UI Emoji" w:hAnsi="Segoe UI Emoji"/>
+          <w:szCs w:val="24"/>
+        </w:rPr>
+        <w:t xml:space="preserve">. </w:t>
+      </w:r>
+    </w:p>
+    <w:p>
+      <w:pPr>
+        <w:pStyle w:val="Listacommarcas"/>
+        <w:ind w:left="403" w:hanging="230"/>
+        <w:rPr>
+          <w:rFonts w:ascii="Segoe UI Emoji" w:hAnsi="Segoe UI Emoji"/>
+          <w:szCs w:val="24"/>
+        </w:rPr>
+      </w:pPr>
+      <w:r>
+        <w:rPr>
+          <w:rFonts w:ascii="Segoe UI Emoji" w:hAnsi="Segoe UI Emoji"/>
+          <w:szCs w:val="24"/>
+        </w:rPr>
+        <w:t xml:space="preserve">Se estiver disponível, observar também a opção de impressão frente e verso pelo lado mais curto. Não é necessário imprimir. </w:t>
+      </w:r>
+    </w:p>
+    <w:p>
+      <w:pPr>
+        <w:pStyle w:val="Listacommarcas"/>
+        <w:ind w:left="403" w:hanging="230"/>
+        <w:rPr>
+          <w:rFonts w:ascii="Segoe UI Emoji" w:hAnsi="Segoe UI Emoji"/>
+          <w:szCs w:val="24"/>
+        </w:rPr>
+      </w:pPr>
+      <w:r>
+        <w:rPr>
+          <w:rFonts w:ascii="Segoe UI Emoji" w:hAnsi="Segoe UI Emoji"/>
+          <w:szCs w:val="24"/>
+        </w:rPr>
+        <w:t xml:space="preserve">Se a versão utilizada não disponibilizar «Livro dobrado», identificar a versão, explicar a limitação e indicar como a configuração seria realizada no Word para computador. </w:t>
+      </w:r>
+    </w:p>
+    <w:p>
+      <w:pPr>
+        <w:pStyle w:val="Listacommarcas"/>
+        <w:rPr>
+          <w:rFonts w:ascii="Segoe UI Emoji" w:hAnsi="Segoe UI Emoji"/>
+          <w:sz w:val="20"/>
+          <w:szCs w:val="24"/>
+        </w:rPr>
+      </w:pPr>
+      <w:r>
+        <w:rPr>
+          <w:rFonts w:ascii="Segoe UI Emoji" w:hAnsi="Segoe UI Emoji"/>
+          <w:sz w:val="20"/>
+          <w:szCs w:val="24"/>
+        </w:rPr>
+        <w:t>Guardar os três ficheiros na pasta «Tarefas individuais» do computador e na pasta com o mesmo nome na Drive.</w:t>
       </w:r>
     </w:p>
     <w:p>
@@ -4549,7 +4558,7 @@
           <w:sz w:val="22"/>
           <w:szCs w:val="24"/>
         </w:rPr>
-        <w:t>Descrever uma situação em que desligou «Ligar ao anterior» e explicar o resultado.</w:t>
+        <w:t>Explicar a finalidade de «Livro dobrado», indicar o que observou na pré-visualização e registar qualquer limitação da versão utilizada.</w:t>
       </w:r>
     </w:p>
     <w:p>
@@ -4585,7 +4594,7 @@
           <w:sz w:val="22"/>
           <w:szCs w:val="24"/>
         </w:rPr>
-        <w:t>Ficheiros 10 e 11 concluídos nos dois locais e gestão de secções explicada no Moodle.</w:t>
+        <w:t>Ficheiros 10 e 11 concluídos, incluindo a cópia em Livro dobrado, nos dois locais; resultado ou limitação da versão registado no Moodle.</w:t>
       </w:r>
     </w:p>
     <w:p>
@@ -4617,17 +4626,17 @@
         <w:ind w:left="173"/>
         <w:rPr>
           <w:rFonts w:ascii="Segoe UI Emoji" w:hAnsi="Segoe UI Emoji"/>
-          <w:sz w:val="20"/>
-          <w:szCs w:val="24"/>
-        </w:rPr>
-      </w:pPr>
-      <w:r>
-        <w:rPr>
-          <w:rFonts w:ascii="Segoe UI Emoji" w:hAnsi="Segoe UI Emoji"/>
-          <w:sz w:val="20"/>
-          <w:szCs w:val="24"/>
-        </w:rPr>
-        <w:t>☐ Primeira página e pares/ímpares configurados.</w:t>
+          <w:szCs w:val="24"/>
+        </w:rPr>
+      </w:pPr>
+      <w:r>
+        <w:rPr>
+          <w:rFonts w:ascii="Segoe UI Emoji" w:hAnsi="Segoe UI Emoji"/>
+          <w:b/>
+          <w:bCs/>
+          <w:szCs w:val="24"/>
+        </w:rPr>
+        <w:t>Ficheiro 10 — Cabeçalhos, rodapés e secções</w:t>
       </w:r>
     </w:p>
     <w:p>
@@ -4641,17 +4650,39 @@
         <w:ind w:left="173"/>
         <w:rPr>
           <w:rFonts w:ascii="Segoe UI Emoji" w:hAnsi="Segoe UI Emoji"/>
-          <w:sz w:val="20"/>
-          <w:szCs w:val="24"/>
-        </w:rPr>
-      </w:pPr>
-      <w:r>
-        <w:rPr>
-          <w:rFonts w:ascii="Segoe UI Emoji" w:hAnsi="Segoe UI Emoji"/>
-          <w:sz w:val="20"/>
-          <w:szCs w:val="24"/>
-        </w:rPr>
+          <w:szCs w:val="24"/>
+        </w:rPr>
+      </w:pPr>
+      <w:r>
+        <w:rPr>
+          <w:rFonts w:ascii="Segoe UI Emoji" w:hAnsi="Segoe UI Emoji"/>
+          <w:szCs w:val="24"/>
+        </w:rPr>
+        <w:t>☐ Primeira página e páginas pares/ímpares configuradas.</w:t>
+      </w:r>
+      <w:r>
+        <w:rPr>
+          <w:rFonts w:ascii="Segoe UI Emoji" w:hAnsi="Segoe UI Emoji"/>
+          <w:szCs w:val="24"/>
+        </w:rPr>
+        <w:br/>
         <w:t>☐ Três secções funcionais.</w:t>
+      </w:r>
+      <w:r>
+        <w:rPr>
+          <w:rFonts w:ascii="Segoe UI Emoji" w:hAnsi="Segoe UI Emoji"/>
+          <w:szCs w:val="24"/>
+        </w:rPr>
+        <w:br/>
+        <w:t>☐ Cabeçalhos e rodapés independentes.</w:t>
+      </w:r>
+      <w:r>
+        <w:rPr>
+          <w:rFonts w:ascii="Segoe UI Emoji" w:hAnsi="Segoe UI Emoji"/>
+          <w:szCs w:val="24"/>
+        </w:rPr>
+        <w:br/>
+        <w:t>☐ Paginação automática e sequencial correta.</w:t>
       </w:r>
     </w:p>
     <w:p>
@@ -4665,17 +4696,17 @@
         <w:ind w:left="173"/>
         <w:rPr>
           <w:rFonts w:ascii="Segoe UI Emoji" w:hAnsi="Segoe UI Emoji"/>
-          <w:sz w:val="20"/>
-          <w:szCs w:val="24"/>
-        </w:rPr>
-      </w:pPr>
-      <w:r>
-        <w:rPr>
-          <w:rFonts w:ascii="Segoe UI Emoji" w:hAnsi="Segoe UI Emoji"/>
-          <w:sz w:val="20"/>
-          <w:szCs w:val="24"/>
-        </w:rPr>
-        <w:t>☐ Cabeçalhos independentes.</w:t>
+          <w:szCs w:val="24"/>
+        </w:rPr>
+      </w:pPr>
+      <w:r>
+        <w:rPr>
+          <w:rFonts w:ascii="Segoe UI Emoji" w:hAnsi="Segoe UI Emoji"/>
+          <w:b/>
+          <w:bCs/>
+          <w:szCs w:val="24"/>
+        </w:rPr>
+        <w:t>Ficheiro 11 — Configuração de página</w:t>
       </w:r>
     </w:p>
     <w:p>
@@ -4689,17 +4720,46 @@
         <w:ind w:left="173"/>
         <w:rPr>
           <w:rFonts w:ascii="Segoe UI Emoji" w:hAnsi="Segoe UI Emoji"/>
-          <w:sz w:val="20"/>
-          <w:szCs w:val="24"/>
-        </w:rPr>
-      </w:pPr>
-      <w:r>
-        <w:rPr>
-          <w:rFonts w:ascii="Segoe UI Emoji" w:hAnsi="Segoe UI Emoji"/>
-          <w:sz w:val="20"/>
-          <w:szCs w:val="24"/>
-        </w:rPr>
-        <w:t>☐ Paginação automática correta.</w:t>
+          <w:szCs w:val="24"/>
+        </w:rPr>
+      </w:pPr>
+      <w:r>
+        <w:rPr>
+          <w:rFonts w:ascii="Segoe UI Emoji" w:hAnsi="Segoe UI Emoji"/>
+          <w:szCs w:val="24"/>
+        </w:rPr>
+        <w:t>☐ Experiências propostas no ficheiro 11 concluídas.</w:t>
+      </w:r>
+      <w:r>
+        <w:rPr>
+          <w:rFonts w:ascii="Segoe UI Emoji" w:hAnsi="Segoe UI Emoji"/>
+          <w:szCs w:val="24"/>
+        </w:rPr>
+        <w:br/>
+        <w:t>☐ Cópia com quatro páginas configurada em Livro dobrado.</w:t>
+      </w:r>
+      <w:r>
+        <w:rPr>
+          <w:rFonts w:ascii="Segoe UI Emoji" w:hAnsi="Segoe UI Emoji"/>
+          <w:szCs w:val="24"/>
+        </w:rPr>
+        <w:br/>
+        <w:t>☐ Pré-visualização da impressão verificada.</w:t>
+      </w:r>
+      <w:r>
+        <w:rPr>
+          <w:rFonts w:ascii="Segoe UI Emoji" w:hAnsi="Segoe UI Emoji"/>
+          <w:szCs w:val="24"/>
+        </w:rPr>
+        <w:br/>
+        <w:t>☐ Eventual limitação da versão utilizada identificada e registada</w:t>
+      </w:r>
+      <w:r>
+        <w:rPr>
+          <w:rFonts w:ascii="Segoe UI Emoji" w:hAnsi="Segoe UI Emoji"/>
+          <w:szCs w:val="24"/>
+        </w:rPr>
+        <w:t>.</w:t>
       </w:r>
     </w:p>
     <w:p>
@@ -4870,133 +4930,145 @@
       <w:pPr>
         <w:pStyle w:val="Listacommarcas"/>
         <w:spacing w:after="40"/>
-        <w:rPr>
-          <w:rFonts w:ascii="Segoe UI Emoji" w:hAnsi="Segoe UI Emoji"/>
-          <w:sz w:val="20"/>
-          <w:szCs w:val="24"/>
-        </w:rPr>
-      </w:pPr>
-      <w:r>
-        <w:rPr>
-          <w:rFonts w:ascii="Segoe UI Emoji" w:hAnsi="Segoe UI Emoji"/>
-          <w:sz w:val="20"/>
-          <w:szCs w:val="24"/>
-        </w:rPr>
-        <w:t>Realizar «Estilos e documentos longos» e guardar como «2026-07_12_Documento_Longo_PrimeiroNome.docx».</w:t>
+        <w:ind w:left="403" w:hanging="230"/>
+        <w:rPr>
+          <w:rFonts w:ascii="Segoe UI Emoji" w:hAnsi="Segoe UI Emoji"/>
+          <w:szCs w:val="24"/>
+        </w:rPr>
+      </w:pPr>
+      <w:r>
+        <w:rPr>
+          <w:rFonts w:ascii="Segoe UI Emoji" w:hAnsi="Segoe UI Emoji"/>
+          <w:szCs w:val="24"/>
+        </w:rPr>
+        <w:t xml:space="preserve">Realizar «Estilos e documentos longos» e guardar como 2026-07_12_Documento_Longo_PrimeiroNome.docx. </w:t>
       </w:r>
     </w:p>
     <w:p>
       <w:pPr>
         <w:pStyle w:val="Listacommarcas"/>
         <w:spacing w:after="40"/>
-        <w:rPr>
-          <w:rFonts w:ascii="Segoe UI Emoji" w:hAnsi="Segoe UI Emoji"/>
-          <w:sz w:val="20"/>
-          <w:szCs w:val="24"/>
-        </w:rPr>
-      </w:pPr>
-      <w:r>
-        <w:rPr>
-          <w:rFonts w:ascii="Segoe UI Emoji" w:hAnsi="Segoe UI Emoji"/>
-          <w:sz w:val="20"/>
-          <w:szCs w:val="24"/>
-        </w:rPr>
-        <w:t>Organizar pelo menos três capítulos e seis subsecções com Título 1, Título 2 e, quando necessário, Título 3.</w:t>
+        <w:ind w:left="403" w:hanging="230"/>
+        <w:rPr>
+          <w:rFonts w:ascii="Segoe UI Emoji" w:hAnsi="Segoe UI Emoji"/>
+          <w:szCs w:val="24"/>
+        </w:rPr>
+      </w:pPr>
+      <w:r>
+        <w:rPr>
+          <w:rFonts w:ascii="Segoe UI Emoji" w:hAnsi="Segoe UI Emoji"/>
+          <w:szCs w:val="24"/>
+        </w:rPr>
+        <w:t xml:space="preserve">Organizar pelo menos três capítulos e seis subsecções, aplicando os estilos Título 1, Título 2 e, quando necessário, Título 3. </w:t>
       </w:r>
     </w:p>
     <w:p>
       <w:pPr>
         <w:pStyle w:val="Listacommarcas"/>
         <w:spacing w:after="40"/>
-        <w:rPr>
-          <w:rFonts w:ascii="Segoe UI Emoji" w:hAnsi="Segoe UI Emoji"/>
-          <w:sz w:val="20"/>
-          <w:szCs w:val="24"/>
-        </w:rPr>
-      </w:pPr>
-      <w:r>
-        <w:rPr>
-          <w:rFonts w:ascii="Segoe UI Emoji" w:hAnsi="Segoe UI Emoji"/>
-          <w:sz w:val="20"/>
-          <w:szCs w:val="24"/>
-        </w:rPr>
-        <w:t>Modificar um estilo e verificar a propagação da alteração.</w:t>
+        <w:ind w:left="403" w:hanging="230"/>
+        <w:rPr>
+          <w:rFonts w:ascii="Segoe UI Emoji" w:hAnsi="Segoe UI Emoji"/>
+          <w:szCs w:val="24"/>
+        </w:rPr>
+      </w:pPr>
+      <w:r>
+        <w:rPr>
+          <w:rFonts w:ascii="Segoe UI Emoji" w:hAnsi="Segoe UI Emoji"/>
+          <w:szCs w:val="24"/>
+        </w:rPr>
+        <w:t xml:space="preserve">Modificar um dos estilos utilizados e verificar a propagação automática da alteração ao longo do documento. </w:t>
       </w:r>
     </w:p>
     <w:p>
       <w:pPr>
         <w:pStyle w:val="Listacommarcas"/>
         <w:spacing w:after="40"/>
-        <w:rPr>
-          <w:rFonts w:ascii="Segoe UI Emoji" w:hAnsi="Segoe UI Emoji"/>
-          <w:sz w:val="20"/>
-          <w:szCs w:val="24"/>
-        </w:rPr>
-      </w:pPr>
-      <w:r>
-        <w:rPr>
-          <w:rFonts w:ascii="Segoe UI Emoji" w:hAnsi="Segoe UI Emoji"/>
-          <w:sz w:val="20"/>
-          <w:szCs w:val="24"/>
-        </w:rPr>
-        <w:t>Associar uma lista multinível à hierarquia dos títulos.</w:t>
+        <w:ind w:left="403" w:hanging="230"/>
+        <w:rPr>
+          <w:rFonts w:ascii="Segoe UI Emoji" w:hAnsi="Segoe UI Emoji"/>
+          <w:szCs w:val="24"/>
+        </w:rPr>
+      </w:pPr>
+      <w:r>
+        <w:rPr>
+          <w:rFonts w:ascii="Segoe UI Emoji" w:hAnsi="Segoe UI Emoji"/>
+          <w:szCs w:val="24"/>
+        </w:rPr>
+        <w:t xml:space="preserve">Associar uma lista multinível à hierarquia dos títulos. </w:t>
       </w:r>
     </w:p>
     <w:p>
       <w:pPr>
         <w:pStyle w:val="Listacommarcas"/>
         <w:spacing w:after="40"/>
-        <w:rPr>
-          <w:rFonts w:ascii="Segoe UI Emoji" w:hAnsi="Segoe UI Emoji"/>
-          <w:sz w:val="20"/>
-          <w:szCs w:val="24"/>
-        </w:rPr>
-      </w:pPr>
-      <w:r>
-        <w:rPr>
-          <w:rFonts w:ascii="Segoe UI Emoji" w:hAnsi="Segoe UI Emoji"/>
-          <w:sz w:val="20"/>
-          <w:szCs w:val="24"/>
-        </w:rPr>
-        <w:t>Usar quebras de página e de secção adequadas; criar cabeçalhos independentes e paginação automática.</w:t>
+        <w:ind w:left="403" w:hanging="230"/>
+        <w:rPr>
+          <w:rFonts w:ascii="Segoe UI Emoji" w:hAnsi="Segoe UI Emoji"/>
+          <w:szCs w:val="24"/>
+        </w:rPr>
+      </w:pPr>
+      <w:r>
+        <w:rPr>
+          <w:rFonts w:ascii="Segoe UI Emoji" w:hAnsi="Segoe UI Emoji"/>
+          <w:szCs w:val="24"/>
+        </w:rPr>
+        <w:t xml:space="preserve">Utilizar quebras de página e de secção adequadas. </w:t>
       </w:r>
     </w:p>
     <w:p>
       <w:pPr>
         <w:pStyle w:val="Listacommarcas"/>
         <w:spacing w:after="40"/>
-        <w:rPr>
-          <w:rFonts w:ascii="Segoe UI Emoji" w:hAnsi="Segoe UI Emoji"/>
-          <w:sz w:val="20"/>
-          <w:szCs w:val="24"/>
-        </w:rPr>
-      </w:pPr>
-      <w:r>
-        <w:rPr>
-          <w:rFonts w:ascii="Segoe UI Emoji" w:hAnsi="Segoe UI Emoji"/>
-          <w:sz w:val="20"/>
-          <w:szCs w:val="24"/>
-        </w:rPr>
-        <w:t>Verificar toda a hierarquia no Painel de Navegação e corrigir títulos fora de nível.</w:t>
+        <w:ind w:left="403" w:hanging="230"/>
+        <w:rPr>
+          <w:rFonts w:ascii="Segoe UI Emoji" w:hAnsi="Segoe UI Emoji"/>
+          <w:szCs w:val="24"/>
+        </w:rPr>
+      </w:pPr>
+      <w:r>
+        <w:rPr>
+          <w:rFonts w:ascii="Segoe UI Emoji" w:hAnsi="Segoe UI Emoji"/>
+          <w:szCs w:val="24"/>
+        </w:rPr>
+        <w:t xml:space="preserve">Criar cabeçalhos independentes e aplicar paginação automática. </w:t>
       </w:r>
     </w:p>
     <w:p>
       <w:pPr>
         <w:pStyle w:val="Listacommarcas"/>
         <w:spacing w:after="40"/>
-        <w:rPr>
-          <w:rFonts w:ascii="Segoe UI Emoji" w:hAnsi="Segoe UI Emoji"/>
-          <w:sz w:val="20"/>
-          <w:szCs w:val="24"/>
-        </w:rPr>
-      </w:pPr>
-      <w:r>
-        <w:rPr>
-          <w:rFonts w:ascii="Segoe UI Emoji" w:hAnsi="Segoe UI Emoji"/>
-          <w:sz w:val="20"/>
-          <w:szCs w:val="24"/>
-        </w:rPr>
-        <w:t>Guardar o ficheiro no computador e na Drive.</w:t>
+        <w:ind w:left="403" w:hanging="230"/>
+        <w:rPr>
+          <w:rFonts w:ascii="Segoe UI Emoji" w:hAnsi="Segoe UI Emoji"/>
+          <w:szCs w:val="24"/>
+        </w:rPr>
+      </w:pPr>
+      <w:r>
+        <w:rPr>
+          <w:rFonts w:ascii="Segoe UI Emoji" w:hAnsi="Segoe UI Emoji"/>
+          <w:szCs w:val="24"/>
+        </w:rPr>
+        <w:t xml:space="preserve">Verificar toda a hierarquia no Painel de Navegação e corrigir eventuais títulos fora de nível. </w:t>
+      </w:r>
+    </w:p>
+    <w:p>
+      <w:pPr>
+        <w:pStyle w:val="Listacommarcas"/>
+        <w:spacing w:after="40"/>
+        <w:rPr>
+          <w:rFonts w:ascii="Segoe UI Emoji" w:hAnsi="Segoe UI Emoji"/>
+          <w:sz w:val="20"/>
+          <w:szCs w:val="24"/>
+        </w:rPr>
+      </w:pPr>
+      <w:r>
+        <w:rPr>
+          <w:rFonts w:ascii="Segoe UI Emoji" w:hAnsi="Segoe UI Emoji"/>
+          <w:sz w:val="20"/>
+          <w:szCs w:val="24"/>
+        </w:rPr>
+        <w:t>Guardar o ficheiro na pasta «Tarefas individuais» do computador e na pasta com o mesmo nome na Drive.</w:t>
       </w:r>
     </w:p>
     <w:p>
@@ -5111,76 +5183,40 @@
         </w:rPr>
         <w:t>☐ Estrutura mínima cumprida.</w:t>
       </w:r>
-    </w:p>
-    <w:p>
-      <w:pPr>
-        <w:pStyle w:val="Listacommarcas"/>
-        <w:numPr>
-          <w:ilvl w:val="0"/>
-          <w:numId w:val="0"/>
-        </w:numPr>
-        <w:spacing w:after="40"/>
-        <w:ind w:left="173"/>
-        <w:rPr>
-          <w:rFonts w:ascii="Segoe UI Emoji" w:hAnsi="Segoe UI Emoji"/>
-          <w:sz w:val="20"/>
-          <w:szCs w:val="24"/>
-        </w:rPr>
-      </w:pPr>
-      <w:r>
-        <w:rPr>
-          <w:rFonts w:ascii="Segoe UI Emoji" w:hAnsi="Segoe UI Emoji"/>
-          <w:sz w:val="20"/>
-          <w:szCs w:val="24"/>
-        </w:rPr>
+      <w:r>
+        <w:rPr>
+          <w:rFonts w:ascii="Segoe UI Emoji" w:hAnsi="Segoe UI Emoji"/>
+          <w:sz w:val="20"/>
+          <w:szCs w:val="24"/>
+        </w:rPr>
+        <w:br/>
         <w:t>☐ Estilos e lista multinível coerentes.</w:t>
       </w:r>
-    </w:p>
-    <w:p>
-      <w:pPr>
-        <w:pStyle w:val="Listacommarcas"/>
-        <w:numPr>
-          <w:ilvl w:val="0"/>
-          <w:numId w:val="0"/>
-        </w:numPr>
-        <w:spacing w:after="40"/>
-        <w:ind w:left="173"/>
-        <w:rPr>
-          <w:rFonts w:ascii="Segoe UI Emoji" w:hAnsi="Segoe UI Emoji"/>
-          <w:sz w:val="20"/>
-          <w:szCs w:val="24"/>
-        </w:rPr>
-      </w:pPr>
-      <w:r>
-        <w:rPr>
-          <w:rFonts w:ascii="Segoe UI Emoji" w:hAnsi="Segoe UI Emoji"/>
-          <w:sz w:val="20"/>
-          <w:szCs w:val="24"/>
-        </w:rPr>
-        <w:t>☐ Secções e paginação corretas.</w:t>
-      </w:r>
-    </w:p>
-    <w:p>
-      <w:pPr>
-        <w:pStyle w:val="Listacommarcas"/>
-        <w:numPr>
-          <w:ilvl w:val="0"/>
-          <w:numId w:val="0"/>
-        </w:numPr>
-        <w:spacing w:after="40"/>
-        <w:ind w:left="173"/>
-        <w:rPr>
-          <w:rFonts w:ascii="Segoe UI Emoji" w:hAnsi="Segoe UI Emoji"/>
-          <w:sz w:val="20"/>
-          <w:szCs w:val="24"/>
-        </w:rPr>
-      </w:pPr>
-      <w:r>
-        <w:rPr>
-          <w:rFonts w:ascii="Segoe UI Emoji" w:hAnsi="Segoe UI Emoji"/>
-          <w:sz w:val="20"/>
-          <w:szCs w:val="24"/>
-        </w:rPr>
+      <w:r>
+        <w:rPr>
+          <w:rFonts w:ascii="Segoe UI Emoji" w:hAnsi="Segoe UI Emoji"/>
+          <w:sz w:val="20"/>
+          <w:szCs w:val="24"/>
+        </w:rPr>
+        <w:br/>
+        <w:t>☐ Secções, cabeçalhos e paginação corretos.</w:t>
+      </w:r>
+      <w:r>
+        <w:rPr>
+          <w:rFonts w:ascii="Segoe UI Emoji" w:hAnsi="Segoe UI Emoji"/>
+          <w:sz w:val="20"/>
+          <w:szCs w:val="24"/>
+        </w:rPr>
+        <w:br/>
+        <w:t>☐ Alteração global de um estilo verificada.</w:t>
+      </w:r>
+      <w:r>
+        <w:rPr>
+          <w:rFonts w:ascii="Segoe UI Emoji" w:hAnsi="Segoe UI Emoji"/>
+          <w:sz w:val="20"/>
+          <w:szCs w:val="24"/>
+        </w:rPr>
+        <w:br/>
         <w:t>☐ Hierarquia validada no Painel de Navegação.</w:t>
       </w:r>
     </w:p>
@@ -5192,6 +5228,23 @@
           <w:szCs w:val="24"/>
         </w:rPr>
       </w:pPr>
+    </w:p>
+    <w:p>
+      <w:pPr>
+        <w:rPr>
+          <w:rFonts w:ascii="Segoe UI Emoji" w:hAnsi="Segoe UI Emoji"/>
+          <w:sz w:val="22"/>
+          <w:szCs w:val="24"/>
+        </w:rPr>
+      </w:pPr>
+      <w:r>
+        <w:rPr>
+          <w:rFonts w:ascii="Segoe UI Emoji" w:hAnsi="Segoe UI Emoji"/>
+          <w:sz w:val="22"/>
+          <w:szCs w:val="24"/>
+        </w:rPr>
+        <w:t>As funcionalidades experimentadas nesta tarefa deverão ser aplicadas posteriormente no Projeto Final — Documento Profissional, sempre que forem adequadas ao conteúdo desenvolvido.</w:t>
+      </w:r>
       <w:r>
         <w:rPr>
           <w:rFonts w:ascii="Segoe UI Emoji" w:hAnsi="Segoe UI Emoji"/>
@@ -5352,133 +5405,199 @@
       <w:pPr>
         <w:pStyle w:val="Listacommarcas"/>
         <w:spacing w:after="40"/>
-        <w:rPr>
-          <w:rFonts w:ascii="Segoe UI Emoji" w:hAnsi="Segoe UI Emoji"/>
-          <w:sz w:val="20"/>
-          <w:szCs w:val="24"/>
-        </w:rPr>
-      </w:pPr>
-      <w:r>
-        <w:rPr>
-          <w:rFonts w:ascii="Segoe UI Emoji" w:hAnsi="Segoe UI Emoji"/>
-          <w:sz w:val="20"/>
-          <w:szCs w:val="24"/>
-        </w:rPr>
-        <w:t>Realizar «Inserir o seu primeiro índice.docx» e guardar como «2026-07_13_Indice_PrimeiroNome.docx».</w:t>
+        <w:ind w:left="403" w:hanging="230"/>
+        <w:rPr>
+          <w:rFonts w:ascii="Segoe UI Emoji" w:hAnsi="Segoe UI Emoji"/>
+          <w:szCs w:val="24"/>
+        </w:rPr>
+      </w:pPr>
+      <w:r>
+        <w:rPr>
+          <w:rFonts w:ascii="Segoe UI Emoji" w:hAnsi="Segoe UI Emoji"/>
+          <w:szCs w:val="24"/>
+        </w:rPr>
+        <w:t xml:space="preserve">Realizar «Inserir o seu primeiro índice.docx» e guardar como 2026-07_13_Indice_PrimeiroNome.docx. </w:t>
       </w:r>
     </w:p>
     <w:p>
       <w:pPr>
         <w:pStyle w:val="Listacommarcas"/>
         <w:spacing w:after="40"/>
-        <w:rPr>
-          <w:rFonts w:ascii="Segoe UI Emoji" w:hAnsi="Segoe UI Emoji"/>
-          <w:sz w:val="20"/>
-          <w:szCs w:val="24"/>
-        </w:rPr>
-      </w:pPr>
-      <w:r>
-        <w:rPr>
-          <w:rFonts w:ascii="Segoe UI Emoji" w:hAnsi="Segoe UI Emoji"/>
-          <w:sz w:val="20"/>
-          <w:szCs w:val="24"/>
-        </w:rPr>
-        <w:t>Inserir e personalizar um índice automático; demonstrar as duas opções de atualização sem editar manualmente o índice.</w:t>
+        <w:ind w:left="403" w:hanging="230"/>
+        <w:rPr>
+          <w:rFonts w:ascii="Segoe UI Emoji" w:hAnsi="Segoe UI Emoji"/>
+          <w:szCs w:val="24"/>
+        </w:rPr>
+      </w:pPr>
+      <w:r>
+        <w:rPr>
+          <w:rFonts w:ascii="Segoe UI Emoji" w:hAnsi="Segoe UI Emoji"/>
+          <w:szCs w:val="24"/>
+        </w:rPr>
+        <w:t xml:space="preserve">Inserir e personalizar um índice automático. </w:t>
       </w:r>
     </w:p>
     <w:p>
       <w:pPr>
         <w:pStyle w:val="Listacommarcas"/>
         <w:spacing w:after="40"/>
-        <w:rPr>
-          <w:rFonts w:ascii="Segoe UI Emoji" w:hAnsi="Segoe UI Emoji"/>
-          <w:sz w:val="20"/>
-          <w:szCs w:val="24"/>
-        </w:rPr>
-      </w:pPr>
-      <w:r>
-        <w:rPr>
-          <w:rFonts w:ascii="Segoe UI Emoji" w:hAnsi="Segoe UI Emoji"/>
-          <w:sz w:val="20"/>
-          <w:szCs w:val="24"/>
-        </w:rPr>
-        <w:t>Realizar «Navegação e referências» e guardar como «2026-07_14_Navegacao_PrimeiroNome.docx».</w:t>
+        <w:ind w:left="403" w:hanging="230"/>
+        <w:rPr>
+          <w:rFonts w:ascii="Segoe UI Emoji" w:hAnsi="Segoe UI Emoji"/>
+          <w:szCs w:val="24"/>
+        </w:rPr>
+      </w:pPr>
+      <w:r>
+        <w:rPr>
+          <w:rFonts w:ascii="Segoe UI Emoji" w:hAnsi="Segoe UI Emoji"/>
+          <w:szCs w:val="24"/>
+        </w:rPr>
+        <w:t xml:space="preserve">Demonstrar as duas opções de atualização — apenas os números de página e o índice inteiro — sem editar manualmente o índice. </w:t>
       </w:r>
     </w:p>
     <w:p>
       <w:pPr>
         <w:pStyle w:val="Listacommarcas"/>
         <w:spacing w:after="40"/>
-        <w:rPr>
-          <w:rFonts w:ascii="Segoe UI Emoji" w:hAnsi="Segoe UI Emoji"/>
-          <w:sz w:val="20"/>
-          <w:szCs w:val="24"/>
-        </w:rPr>
-      </w:pPr>
-      <w:r>
-        <w:rPr>
-          <w:rFonts w:ascii="Segoe UI Emoji" w:hAnsi="Segoe UI Emoji"/>
-          <w:sz w:val="20"/>
-          <w:szCs w:val="24"/>
-        </w:rPr>
-        <w:t>Criar dois marcadores, duas hiperligações internas e duas referências cruzadas: uma para um título e outra para uma figura ou tabela.</w:t>
+        <w:ind w:left="403" w:hanging="230"/>
+        <w:rPr>
+          <w:rFonts w:ascii="Segoe UI Emoji" w:hAnsi="Segoe UI Emoji"/>
+          <w:szCs w:val="24"/>
+        </w:rPr>
+      </w:pPr>
+      <w:r>
+        <w:rPr>
+          <w:rFonts w:ascii="Segoe UI Emoji" w:hAnsi="Segoe UI Emoji"/>
+          <w:szCs w:val="24"/>
+        </w:rPr>
+        <w:t xml:space="preserve">Realizar «Navegação e referências» e guardar como 2026-07_14_Navegacao_PrimeiroNome.docx. </w:t>
       </w:r>
     </w:p>
     <w:p>
       <w:pPr>
         <w:pStyle w:val="Listacommarcas"/>
         <w:spacing w:after="40"/>
-        <w:rPr>
-          <w:rFonts w:ascii="Segoe UI Emoji" w:hAnsi="Segoe UI Emoji"/>
-          <w:sz w:val="20"/>
-          <w:szCs w:val="24"/>
-        </w:rPr>
-      </w:pPr>
-      <w:r>
-        <w:rPr>
-          <w:rFonts w:ascii="Segoe UI Emoji" w:hAnsi="Segoe UI Emoji"/>
-          <w:sz w:val="20"/>
-          <w:szCs w:val="24"/>
-        </w:rPr>
-        <w:t>Inserir legendas, uma nota de rodapé e testar Painel de Navegação, Localizar e Ir para.</w:t>
+        <w:ind w:left="403" w:hanging="230"/>
+        <w:rPr>
+          <w:rFonts w:ascii="Segoe UI Emoji" w:hAnsi="Segoe UI Emoji"/>
+          <w:szCs w:val="24"/>
+        </w:rPr>
+      </w:pPr>
+      <w:r>
+        <w:rPr>
+          <w:rFonts w:ascii="Segoe UI Emoji" w:hAnsi="Segoe UI Emoji"/>
+          <w:szCs w:val="24"/>
+        </w:rPr>
+        <w:t xml:space="preserve">Criar dois marcadores e duas hiperligações internas. </w:t>
       </w:r>
     </w:p>
     <w:p>
       <w:pPr>
         <w:pStyle w:val="Listacommarcas"/>
         <w:spacing w:after="40"/>
-        <w:rPr>
-          <w:rFonts w:ascii="Segoe UI Emoji" w:hAnsi="Segoe UI Emoji"/>
-          <w:sz w:val="20"/>
-          <w:szCs w:val="24"/>
-        </w:rPr>
-      </w:pPr>
-      <w:r>
-        <w:rPr>
-          <w:rFonts w:ascii="Segoe UI Emoji" w:hAnsi="Segoe UI Emoji"/>
-          <w:sz w:val="20"/>
-          <w:szCs w:val="24"/>
-        </w:rPr>
-        <w:t>Atualizar todos os campos e testar todas as ligações.</w:t>
+        <w:ind w:left="403" w:hanging="230"/>
+        <w:rPr>
+          <w:rFonts w:ascii="Segoe UI Emoji" w:hAnsi="Segoe UI Emoji"/>
+          <w:szCs w:val="24"/>
+        </w:rPr>
+      </w:pPr>
+      <w:r>
+        <w:rPr>
+          <w:rFonts w:ascii="Segoe UI Emoji" w:hAnsi="Segoe UI Emoji"/>
+          <w:szCs w:val="24"/>
+        </w:rPr>
+        <w:t xml:space="preserve">Inserir duas referências cruzadas: uma para um título e outra para uma figura ou tabela. </w:t>
       </w:r>
     </w:p>
     <w:p>
       <w:pPr>
         <w:pStyle w:val="Listacommarcas"/>
         <w:spacing w:after="40"/>
-        <w:rPr>
-          <w:rFonts w:ascii="Segoe UI Emoji" w:hAnsi="Segoe UI Emoji"/>
-          <w:sz w:val="20"/>
-          <w:szCs w:val="24"/>
-        </w:rPr>
-      </w:pPr>
-      <w:r>
-        <w:rPr>
-          <w:rFonts w:ascii="Segoe UI Emoji" w:hAnsi="Segoe UI Emoji"/>
-          <w:sz w:val="20"/>
-          <w:szCs w:val="24"/>
-        </w:rPr>
-        <w:t>Guardar os dois ficheiros no computador e na Drive.</w:t>
+        <w:ind w:left="403" w:hanging="230"/>
+        <w:rPr>
+          <w:rFonts w:ascii="Segoe UI Emoji" w:hAnsi="Segoe UI Emoji"/>
+          <w:szCs w:val="24"/>
+        </w:rPr>
+      </w:pPr>
+      <w:r>
+        <w:rPr>
+          <w:rFonts w:ascii="Segoe UI Emoji" w:hAnsi="Segoe UI Emoji"/>
+          <w:szCs w:val="24"/>
+        </w:rPr>
+        <w:t xml:space="preserve">Inserir legendas nas figuras ou tabelas utilizadas. </w:t>
+      </w:r>
+    </w:p>
+    <w:p>
+      <w:pPr>
+        <w:pStyle w:val="Listacommarcas"/>
+        <w:spacing w:after="40"/>
+        <w:ind w:left="403" w:hanging="230"/>
+        <w:rPr>
+          <w:rFonts w:ascii="Segoe UI Emoji" w:hAnsi="Segoe UI Emoji"/>
+          <w:szCs w:val="24"/>
+        </w:rPr>
+      </w:pPr>
+      <w:r>
+        <w:rPr>
+          <w:rFonts w:ascii="Segoe UI Emoji" w:hAnsi="Segoe UI Emoji"/>
+          <w:szCs w:val="24"/>
+        </w:rPr>
+        <w:t xml:space="preserve">Inserir pelo menos uma nota de rodapé. </w:t>
+      </w:r>
+    </w:p>
+    <w:p>
+      <w:pPr>
+        <w:pStyle w:val="Listacommarcas"/>
+        <w:spacing w:after="40"/>
+        <w:ind w:left="403" w:hanging="230"/>
+        <w:rPr>
+          <w:rFonts w:ascii="Segoe UI Emoji" w:hAnsi="Segoe UI Emoji"/>
+          <w:szCs w:val="24"/>
+        </w:rPr>
+      </w:pPr>
+      <w:r>
+        <w:rPr>
+          <w:rFonts w:ascii="Segoe UI Emoji" w:hAnsi="Segoe UI Emoji"/>
+          <w:szCs w:val="24"/>
+        </w:rPr>
+        <w:t xml:space="preserve">Testar o Painel de Navegação e os comandos Localizar e Ir para. </w:t>
+      </w:r>
+    </w:p>
+    <w:p>
+      <w:pPr>
+        <w:pStyle w:val="Listacommarcas"/>
+        <w:spacing w:after="40"/>
+        <w:ind w:left="403" w:hanging="230"/>
+        <w:rPr>
+          <w:rFonts w:ascii="Segoe UI Emoji" w:hAnsi="Segoe UI Emoji"/>
+          <w:szCs w:val="24"/>
+        </w:rPr>
+      </w:pPr>
+      <w:r>
+        <w:rPr>
+          <w:rFonts w:ascii="Segoe UI Emoji" w:hAnsi="Segoe UI Emoji"/>
+          <w:szCs w:val="24"/>
+        </w:rPr>
+        <w:t xml:space="preserve">Atualizar todos os campos e testar as hiperligações e referências. </w:t>
+      </w:r>
+    </w:p>
+    <w:p>
+      <w:pPr>
+        <w:pStyle w:val="Listacommarcas"/>
+        <w:spacing w:after="40"/>
+        <w:rPr>
+          <w:rFonts w:ascii="Segoe UI Emoji" w:hAnsi="Segoe UI Emoji"/>
+          <w:sz w:val="20"/>
+          <w:szCs w:val="24"/>
+        </w:rPr>
+      </w:pPr>
+      <w:r>
+        <w:rPr>
+          <w:rFonts w:ascii="Segoe UI Emoji" w:hAnsi="Segoe UI Emoji"/>
+          <w:sz w:val="20"/>
+          <w:szCs w:val="24"/>
+        </w:rPr>
+        <w:t>Guardar os dois ficheiros na pasta «Tarefas individuais» do computador e na pasta com o mesmo nome na Drive.</w:t>
       </w:r>
     </w:p>
     <w:p>
@@ -5591,79 +5710,52 @@
           <w:sz w:val="20"/>
           <w:szCs w:val="24"/>
         </w:rPr>
-        <w:t>☐ Índice automático atualizado.</w:t>
-      </w:r>
-    </w:p>
-    <w:p>
-      <w:pPr>
-        <w:pStyle w:val="Listacommarcas"/>
-        <w:numPr>
-          <w:ilvl w:val="0"/>
-          <w:numId w:val="0"/>
-        </w:numPr>
-        <w:spacing w:after="40"/>
-        <w:ind w:left="173"/>
-        <w:rPr>
-          <w:rFonts w:ascii="Segoe UI Emoji" w:hAnsi="Segoe UI Emoji"/>
-          <w:sz w:val="20"/>
-          <w:szCs w:val="24"/>
-        </w:rPr>
-      </w:pPr>
-      <w:r>
-        <w:rPr>
-          <w:rFonts w:ascii="Segoe UI Emoji" w:hAnsi="Segoe UI Emoji"/>
-          <w:sz w:val="20"/>
-          <w:szCs w:val="24"/>
-        </w:rPr>
-        <w:t>☐ Dois marcadores e duas hiperligações funcionais.</w:t>
-      </w:r>
-    </w:p>
-    <w:p>
-      <w:pPr>
-        <w:pStyle w:val="Listacommarcas"/>
-        <w:numPr>
-          <w:ilvl w:val="0"/>
-          <w:numId w:val="0"/>
-        </w:numPr>
-        <w:spacing w:after="40"/>
-        <w:ind w:left="173"/>
-        <w:rPr>
-          <w:rFonts w:ascii="Segoe UI Emoji" w:hAnsi="Segoe UI Emoji"/>
-          <w:sz w:val="20"/>
-          <w:szCs w:val="24"/>
-        </w:rPr>
-      </w:pPr>
-      <w:r>
-        <w:rPr>
-          <w:rFonts w:ascii="Segoe UI Emoji" w:hAnsi="Segoe UI Emoji"/>
-          <w:sz w:val="20"/>
-          <w:szCs w:val="24"/>
-        </w:rPr>
-        <w:t>☐ Duas referências cruzadas e uma nota de rodapé.</w:t>
-      </w:r>
-    </w:p>
-    <w:p>
-      <w:pPr>
-        <w:pStyle w:val="Listacommarcas"/>
-        <w:numPr>
-          <w:ilvl w:val="0"/>
-          <w:numId w:val="0"/>
-        </w:numPr>
-        <w:spacing w:after="40"/>
-        <w:ind w:left="173"/>
-        <w:rPr>
-          <w:rFonts w:ascii="Segoe UI Emoji" w:hAnsi="Segoe UI Emoji"/>
-          <w:sz w:val="20"/>
-          <w:szCs w:val="24"/>
-        </w:rPr>
-      </w:pPr>
-      <w:r>
-        <w:rPr>
-          <w:rFonts w:ascii="Segoe UI Emoji" w:hAnsi="Segoe UI Emoji"/>
-          <w:sz w:val="20"/>
-          <w:szCs w:val="24"/>
-        </w:rPr>
-        <w:t>☐ Todos os campos e ligações testados.</w:t>
+        <w:t>☐ Índice automático inserido e atualizado.</w:t>
+      </w:r>
+      <w:r>
+        <w:rPr>
+          <w:rFonts w:ascii="Segoe UI Emoji" w:hAnsi="Segoe UI Emoji"/>
+          <w:sz w:val="20"/>
+          <w:szCs w:val="24"/>
+        </w:rPr>
+        <w:br/>
+        <w:t>☐ Duas opções de atualização do índice testadas.</w:t>
+      </w:r>
+      <w:r>
+        <w:rPr>
+          <w:rFonts w:ascii="Segoe UI Emoji" w:hAnsi="Segoe UI Emoji"/>
+          <w:sz w:val="20"/>
+          <w:szCs w:val="24"/>
+        </w:rPr>
+        <w:br/>
+        <w:t>☐ Dois marcadores e duas hiperligações internas funcionais.</w:t>
+      </w:r>
+      <w:r>
+        <w:rPr>
+          <w:rFonts w:ascii="Segoe UI Emoji" w:hAnsi="Segoe UI Emoji"/>
+          <w:sz w:val="20"/>
+          <w:szCs w:val="24"/>
+        </w:rPr>
+        <w:br/>
+        <w:t>☐ Duas referências cruzadas funcionais.</w:t>
+      </w:r>
+      <w:r>
+        <w:rPr>
+          <w:rFonts w:ascii="Segoe UI Emoji" w:hAnsi="Segoe UI Emoji"/>
+          <w:sz w:val="20"/>
+          <w:szCs w:val="24"/>
+        </w:rPr>
+        <w:br/>
+        <w:t>☐ Legendas e uma nota de rodapé inseridas.</w:t>
+      </w:r>
+      <w:r>
+        <w:rPr>
+          <w:rFonts w:ascii="Segoe UI Emoji" w:hAnsi="Segoe UI Emoji"/>
+          <w:sz w:val="20"/>
+          <w:szCs w:val="24"/>
+        </w:rPr>
+        <w:br/>
+        <w:t>☐ Todos os campos, hiperligações e referências testados.</w:t>
       </w:r>
     </w:p>
     <w:p>
@@ -5674,14 +5766,44 @@
           <w:szCs w:val="24"/>
         </w:rPr>
       </w:pPr>
-      <w:r>
+    </w:p>
+    <w:p>
+      <w:pPr>
         <w:rPr>
           <w:rFonts w:ascii="Segoe UI Emoji" w:hAnsi="Segoe UI Emoji"/>
           <w:sz w:val="22"/>
           <w:szCs w:val="24"/>
         </w:rPr>
-        <w:br w:type="page"/>
-      </w:r>
+      </w:pPr>
+      <w:r>
+        <w:rPr>
+          <w:rFonts w:ascii="Segoe UI Emoji" w:hAnsi="Segoe UI Emoji"/>
+          <w:sz w:val="22"/>
+          <w:szCs w:val="24"/>
+        </w:rPr>
+        <w:t>Os elementos trabalhados nesta tarefa deverão ser utilizados posteriormente no Projeto Final — Documento Profissional, de acordo com os requisitos do respetivo enunciado.</w:t>
+      </w:r>
+    </w:p>
+    <w:p>
+      <w:pPr>
+        <w:rPr>
+          <w:rFonts w:ascii="Segoe UI Emoji" w:hAnsi="Segoe UI Emoji"/>
+          <w:sz w:val="22"/>
+          <w:szCs w:val="24"/>
+        </w:rPr>
+        <w:sectPr>
+          <w:headerReference w:type="even" r:id="rId8"/>
+          <w:headerReference w:type="default" r:id="rId9"/>
+          <w:footerReference w:type="even" r:id="rId10"/>
+          <w:footerReference w:type="default" r:id="rId11"/>
+          <w:headerReference w:type="first" r:id="rId12"/>
+          <w:footerReference w:type="first" r:id="rId13"/>
+          <w:pgSz w:w="11909" w:h="16834"/>
+          <w:pgMar w:top="893" w:right="1037" w:bottom="893" w:left="1037" w:header="720" w:footer="720" w:gutter="0"/>
+          <w:cols w:space="720"/>
+          <w:docGrid w:linePitch="360"/>
+        </w:sectPr>
+      </w:pPr>
     </w:p>
     <w:p>
       <w:pPr>
@@ -5699,7 +5821,15 @@
           <w:szCs w:val="32"/>
         </w:rPr>
         <w:lastRenderedPageBreak/>
-        <w:t>TI11 — Reunir documentos e realizar a revisão entre pares</w:t>
+        <w:t xml:space="preserve">TI11 — </w:t>
+      </w:r>
+      <w:r>
+        <w:rPr>
+          <w:rFonts w:ascii="Segoe UI Emoji" w:hAnsi="Segoe UI Emoji"/>
+          <w:sz w:val="36"/>
+          <w:szCs w:val="32"/>
+        </w:rPr>
+        <w:t>Desenvolver e realizar a revisão entre pares do Projeto Final</w:t>
       </w:r>
     </w:p>
     <w:tbl>
@@ -5709,7 +5839,7 @@
       </w:tblPr>
       <w:tblGrid>
         <w:gridCol w:w="1297"/>
-        <w:gridCol w:w="6507"/>
+        <w:gridCol w:w="8778"/>
       </w:tblGrid>
       <w:tr>
         <w:trPr>
@@ -5771,7 +5901,7 @@
                 <w:sz w:val="22"/>
                 <w:szCs w:val="24"/>
               </w:rPr>
-              <w:t>Trabalho com vários documentos; comparação; modo de revisão</w:t>
+              <w:t>Documentos longos; estrutura e formatação; comparação; comentários; Controlo de Alterações</w:t>
             </w:r>
           </w:p>
         </w:tc>
@@ -5809,7 +5939,7 @@
           <w:sz w:val="22"/>
           <w:szCs w:val="24"/>
         </w:rPr>
-        <w:t>Reunir conteúdos e melhorar um documento através de revisão colaborativa fundamentada.</w:t>
+        <w:t>Desenvolver o Projeto Final — Documento Profissional e melhorar o documento através de uma revisão entre pares fundamentada.</w:t>
       </w:r>
     </w:p>
     <w:p>
@@ -5834,171 +5964,531 @@
       <w:pPr>
         <w:pStyle w:val="Listacommarcas"/>
         <w:spacing w:after="40"/>
-        <w:rPr>
-          <w:rFonts w:ascii="Segoe UI Emoji" w:hAnsi="Segoe UI Emoji"/>
-          <w:sz w:val="20"/>
-          <w:szCs w:val="24"/>
-        </w:rPr>
-      </w:pPr>
-      <w:r>
-        <w:rPr>
-          <w:rFonts w:ascii="Segoe UI Emoji" w:hAnsi="Segoe UI Emoji"/>
-          <w:sz w:val="20"/>
-          <w:szCs w:val="24"/>
-        </w:rPr>
-        <w:t>Realizar «Reunir documentos» e guardar como «2026-07_15_Reunir_PrimeiroNome.docx».</w:t>
+        <w:ind w:left="403" w:hanging="230"/>
+        <w:rPr>
+          <w:rFonts w:ascii="Segoe UI Emoji" w:hAnsi="Segoe UI Emoji"/>
+          <w:szCs w:val="24"/>
+        </w:rPr>
+      </w:pPr>
+      <w:r>
+        <w:rPr>
+          <w:rFonts w:ascii="Segoe UI Emoji" w:hAnsi="Segoe UI Emoji"/>
+          <w:szCs w:val="24"/>
+        </w:rPr>
+        <w:t xml:space="preserve">Abrir a versão em desenvolvimento do Projeto Final — Documento Profissional. </w:t>
       </w:r>
     </w:p>
     <w:p>
       <w:pPr>
         <w:pStyle w:val="Listacommarcas"/>
         <w:spacing w:after="40"/>
-        <w:rPr>
-          <w:rFonts w:ascii="Segoe UI Emoji" w:hAnsi="Segoe UI Emoji"/>
-          <w:sz w:val="20"/>
-          <w:szCs w:val="24"/>
-        </w:rPr>
-      </w:pPr>
-      <w:r>
-        <w:rPr>
-          <w:rFonts w:ascii="Segoe UI Emoji" w:hAnsi="Segoe UI Emoji"/>
-          <w:sz w:val="20"/>
-          <w:szCs w:val="24"/>
-        </w:rPr>
-        <w:t>Inserir ou combinar os conteúdos indicados, remover repetições e uniformizar estilos, cabeçalhos, paginação e formatação.</w:t>
+        <w:ind w:left="403" w:hanging="230"/>
+        <w:rPr>
+          <w:rFonts w:ascii="Segoe UI Emoji" w:hAnsi="Segoe UI Emoji"/>
+          <w:szCs w:val="24"/>
+        </w:rPr>
+      </w:pPr>
+      <w:r>
+        <w:rPr>
+          <w:rFonts w:ascii="Segoe UI Emoji" w:hAnsi="Segoe UI Emoji"/>
+          <w:szCs w:val="24"/>
+        </w:rPr>
+        <w:t xml:space="preserve">Desenvolver e organizar os conteúdos obrigatórios indicados no respetivo enunciado. </w:t>
       </w:r>
     </w:p>
     <w:p>
       <w:pPr>
         <w:pStyle w:val="Listacommarcas"/>
         <w:spacing w:after="40"/>
-        <w:rPr>
-          <w:rFonts w:ascii="Segoe UI Emoji" w:hAnsi="Segoe UI Emoji"/>
-          <w:sz w:val="20"/>
-          <w:szCs w:val="24"/>
-        </w:rPr>
-      </w:pPr>
-      <w:r>
-        <w:rPr>
-          <w:rFonts w:ascii="Segoe UI Emoji" w:hAnsi="Segoe UI Emoji"/>
-          <w:sz w:val="20"/>
-          <w:szCs w:val="24"/>
-        </w:rPr>
-        <w:t>Criar uma cópia para revisão com o nome «2026-07_16_Revisao_Entre_Pares_PrimeiroNome.docx».</w:t>
+        <w:ind w:left="403" w:hanging="230"/>
+        <w:rPr>
+          <w:rFonts w:ascii="Segoe UI Emoji" w:hAnsi="Segoe UI Emoji"/>
+          <w:szCs w:val="24"/>
+        </w:rPr>
+      </w:pPr>
+      <w:r>
+        <w:rPr>
+          <w:rFonts w:ascii="Segoe UI Emoji" w:hAnsi="Segoe UI Emoji"/>
+          <w:szCs w:val="24"/>
+        </w:rPr>
+        <w:t xml:space="preserve">Confirmar que o documento contém: </w:t>
+      </w:r>
+    </w:p>
+    <w:p>
+      <w:pPr>
+        <w:pStyle w:val="Listacommarcas"/>
+        <w:numPr>
+          <w:ilvl w:val="0"/>
+          <w:numId w:val="12"/>
+        </w:numPr>
+        <w:spacing w:after="40"/>
+        <w:rPr>
+          <w:rFonts w:ascii="Segoe UI Emoji" w:hAnsi="Segoe UI Emoji"/>
+          <w:szCs w:val="24"/>
+        </w:rPr>
+      </w:pPr>
+      <w:r>
+        <w:rPr>
+          <w:rFonts w:ascii="Segoe UI Emoji" w:hAnsi="Segoe UI Emoji"/>
+          <w:szCs w:val="24"/>
+        </w:rPr>
+        <w:t xml:space="preserve">capa; </w:t>
+      </w:r>
+    </w:p>
+    <w:p>
+      <w:pPr>
+        <w:pStyle w:val="Listacommarcas"/>
+        <w:numPr>
+          <w:ilvl w:val="0"/>
+          <w:numId w:val="12"/>
+        </w:numPr>
+        <w:spacing w:after="40"/>
+        <w:rPr>
+          <w:rFonts w:ascii="Segoe UI Emoji" w:hAnsi="Segoe UI Emoji"/>
+          <w:szCs w:val="24"/>
+        </w:rPr>
+      </w:pPr>
+      <w:r>
+        <w:rPr>
+          <w:rFonts w:ascii="Segoe UI Emoji" w:hAnsi="Segoe UI Emoji"/>
+          <w:szCs w:val="24"/>
+        </w:rPr>
+        <w:t xml:space="preserve">índice; </w:t>
+      </w:r>
+    </w:p>
+    <w:p>
+      <w:pPr>
+        <w:pStyle w:val="Listacommarcas"/>
+        <w:numPr>
+          <w:ilvl w:val="0"/>
+          <w:numId w:val="12"/>
+        </w:numPr>
+        <w:spacing w:after="40"/>
+        <w:rPr>
+          <w:rFonts w:ascii="Segoe UI Emoji" w:hAnsi="Segoe UI Emoji"/>
+          <w:szCs w:val="24"/>
+        </w:rPr>
+      </w:pPr>
+      <w:r>
+        <w:rPr>
+          <w:rFonts w:ascii="Segoe UI Emoji" w:hAnsi="Segoe UI Emoji"/>
+          <w:szCs w:val="24"/>
+        </w:rPr>
+        <w:t xml:space="preserve">introdução; </w:t>
+      </w:r>
+    </w:p>
+    <w:p>
+      <w:pPr>
+        <w:pStyle w:val="Listacommarcas"/>
+        <w:numPr>
+          <w:ilvl w:val="0"/>
+          <w:numId w:val="12"/>
+        </w:numPr>
+        <w:spacing w:after="40"/>
+        <w:rPr>
+          <w:rFonts w:ascii="Segoe UI Emoji" w:hAnsi="Segoe UI Emoji"/>
+          <w:szCs w:val="24"/>
+        </w:rPr>
+      </w:pPr>
+      <w:r>
+        <w:rPr>
+          <w:rFonts w:ascii="Segoe UI Emoji" w:hAnsi="Segoe UI Emoji"/>
+          <w:szCs w:val="24"/>
+        </w:rPr>
+        <w:t xml:space="preserve">desenvolvimento; </w:t>
+      </w:r>
+    </w:p>
+    <w:p>
+      <w:pPr>
+        <w:pStyle w:val="Listacommarcas"/>
+        <w:numPr>
+          <w:ilvl w:val="0"/>
+          <w:numId w:val="12"/>
+        </w:numPr>
+        <w:spacing w:after="40"/>
+        <w:rPr>
+          <w:rFonts w:ascii="Segoe UI Emoji" w:hAnsi="Segoe UI Emoji"/>
+          <w:szCs w:val="24"/>
+        </w:rPr>
+      </w:pPr>
+      <w:r>
+        <w:rPr>
+          <w:rFonts w:ascii="Segoe UI Emoji" w:hAnsi="Segoe UI Emoji"/>
+          <w:szCs w:val="24"/>
+        </w:rPr>
+        <w:t xml:space="preserve">conclusão; </w:t>
+      </w:r>
+    </w:p>
+    <w:p>
+      <w:pPr>
+        <w:pStyle w:val="Listacommarcas"/>
+        <w:numPr>
+          <w:ilvl w:val="0"/>
+          <w:numId w:val="12"/>
+        </w:numPr>
+        <w:spacing w:after="40"/>
+        <w:rPr>
+          <w:rFonts w:ascii="Segoe UI Emoji" w:hAnsi="Segoe UI Emoji"/>
+          <w:szCs w:val="24"/>
+        </w:rPr>
+      </w:pPr>
+      <w:r>
+        <w:rPr>
+          <w:rFonts w:ascii="Segoe UI Emoji" w:hAnsi="Segoe UI Emoji"/>
+          <w:szCs w:val="24"/>
+        </w:rPr>
+        <w:t xml:space="preserve">referências; </w:t>
+      </w:r>
+    </w:p>
+    <w:p>
+      <w:pPr>
+        <w:pStyle w:val="Listacommarcas"/>
+        <w:numPr>
+          <w:ilvl w:val="0"/>
+          <w:numId w:val="12"/>
+        </w:numPr>
+        <w:spacing w:after="40"/>
+        <w:rPr>
+          <w:rFonts w:ascii="Segoe UI Emoji" w:hAnsi="Segoe UI Emoji"/>
+          <w:szCs w:val="24"/>
+        </w:rPr>
+      </w:pPr>
+      <w:r>
+        <w:rPr>
+          <w:rFonts w:ascii="Segoe UI Emoji" w:hAnsi="Segoe UI Emoji"/>
+          <w:szCs w:val="24"/>
+        </w:rPr>
+        <w:t xml:space="preserve">anexos, quando necessários. </w:t>
       </w:r>
     </w:p>
     <w:p>
       <w:pPr>
         <w:pStyle w:val="Listacommarcas"/>
         <w:spacing w:after="40"/>
-        <w:rPr>
-          <w:rFonts w:ascii="Segoe UI Emoji" w:hAnsi="Segoe UI Emoji"/>
-          <w:sz w:val="20"/>
-          <w:szCs w:val="24"/>
-        </w:rPr>
-      </w:pPr>
-      <w:r>
-        <w:rPr>
-          <w:rFonts w:ascii="Segoe UI Emoji" w:hAnsi="Segoe UI Emoji"/>
-          <w:sz w:val="20"/>
-          <w:szCs w:val="24"/>
-        </w:rPr>
-        <w:t>Trocar a cópia com um colega da sala, sem trabalhar simultaneamente no mesmo ficheiro.</w:t>
+        <w:ind w:left="403" w:hanging="230"/>
+        <w:rPr>
+          <w:rFonts w:ascii="Segoe UI Emoji" w:hAnsi="Segoe UI Emoji"/>
+          <w:szCs w:val="24"/>
+        </w:rPr>
+      </w:pPr>
+      <w:r>
+        <w:rPr>
+          <w:rFonts w:ascii="Segoe UI Emoji" w:hAnsi="Segoe UI Emoji"/>
+          <w:szCs w:val="24"/>
+        </w:rPr>
+        <w:t xml:space="preserve">Aplicar uma hierarquia coerente com os estilos Título 1, Título 2 e Título 3. </w:t>
       </w:r>
     </w:p>
     <w:p>
       <w:pPr>
         <w:pStyle w:val="Listacommarcas"/>
         <w:spacing w:after="40"/>
-        <w:rPr>
-          <w:rFonts w:ascii="Segoe UI Emoji" w:hAnsi="Segoe UI Emoji"/>
-          <w:sz w:val="20"/>
-          <w:szCs w:val="24"/>
-        </w:rPr>
-      </w:pPr>
-      <w:r>
-        <w:rPr>
-          <w:rFonts w:ascii="Segoe UI Emoji" w:hAnsi="Segoe UI Emoji"/>
-          <w:sz w:val="20"/>
-          <w:szCs w:val="24"/>
-        </w:rPr>
-        <w:t>O colega deve ativar o Controlo de Alterações e efetuar pelo menos cinco propostas de alteração pertinentes.</w:t>
+        <w:ind w:left="403" w:hanging="230"/>
+        <w:rPr>
+          <w:rFonts w:ascii="Segoe UI Emoji" w:hAnsi="Segoe UI Emoji"/>
+          <w:szCs w:val="24"/>
+        </w:rPr>
+      </w:pPr>
+      <w:r>
+        <w:rPr>
+          <w:rFonts w:ascii="Segoe UI Emoji" w:hAnsi="Segoe UI Emoji"/>
+          <w:szCs w:val="24"/>
+        </w:rPr>
+        <w:t xml:space="preserve">Integrar os elementos técnicos obrigatórios indicados no enunciado do Projeto Final. </w:t>
       </w:r>
     </w:p>
     <w:p>
       <w:pPr>
         <w:pStyle w:val="Listacommarcas"/>
         <w:spacing w:after="40"/>
-        <w:rPr>
-          <w:rFonts w:ascii="Segoe UI Emoji" w:hAnsi="Segoe UI Emoji"/>
-          <w:sz w:val="20"/>
-          <w:szCs w:val="24"/>
-        </w:rPr>
-      </w:pPr>
-      <w:r>
-        <w:rPr>
-          <w:rFonts w:ascii="Segoe UI Emoji" w:hAnsi="Segoe UI Emoji"/>
-          <w:sz w:val="20"/>
-          <w:szCs w:val="24"/>
-        </w:rPr>
-        <w:t>O colega deve inserir pelo menos três comentários: um aspeto positivo, uma melhoria de conteúdo e uma melhoria de apresentação ou legibilidade.</w:t>
+        <w:ind w:left="403" w:hanging="230"/>
+        <w:rPr>
+          <w:rFonts w:ascii="Segoe UI Emoji" w:hAnsi="Segoe UI Emoji"/>
+          <w:szCs w:val="24"/>
+        </w:rPr>
+      </w:pPr>
+      <w:r>
+        <w:rPr>
+          <w:rFonts w:ascii="Segoe UI Emoji" w:hAnsi="Segoe UI Emoji"/>
+          <w:szCs w:val="24"/>
+        </w:rPr>
+        <w:t xml:space="preserve">Explicar e demonstrar a impressão em série, de acordo com o enunciado. </w:t>
       </w:r>
     </w:p>
     <w:p>
       <w:pPr>
         <w:pStyle w:val="Listacommarcas"/>
         <w:spacing w:after="40"/>
-        <w:rPr>
-          <w:rFonts w:ascii="Segoe UI Emoji" w:hAnsi="Segoe UI Emoji"/>
-          <w:sz w:val="20"/>
-          <w:szCs w:val="24"/>
-        </w:rPr>
-      </w:pPr>
-      <w:r>
-        <w:rPr>
-          <w:rFonts w:ascii="Segoe UI Emoji" w:hAnsi="Segoe UI Emoji"/>
-          <w:sz w:val="20"/>
-          <w:szCs w:val="24"/>
-        </w:rPr>
-        <w:t>No final do documento, o colega deve escrever um feedback entre 80 e 120 palavras, identificando pontos fortes e prioridades de melhoria.</w:t>
+        <w:ind w:left="403" w:hanging="230"/>
+        <w:rPr>
+          <w:rFonts w:ascii="Segoe UI Emoji" w:hAnsi="Segoe UI Emoji"/>
+          <w:szCs w:val="24"/>
+        </w:rPr>
+      </w:pPr>
+      <w:r>
+        <w:rPr>
+          <w:rFonts w:ascii="Segoe UI Emoji" w:hAnsi="Segoe UI Emoji"/>
+          <w:szCs w:val="24"/>
+        </w:rPr>
+        <w:t xml:space="preserve">Identificar e explicar eventuais funcionalidades que não estejam disponíveis na versão do Word utilizada. </w:t>
       </w:r>
     </w:p>
     <w:p>
       <w:pPr>
         <w:pStyle w:val="Listacommarcas"/>
         <w:spacing w:after="40"/>
-        <w:rPr>
-          <w:rFonts w:ascii="Segoe UI Emoji" w:hAnsi="Segoe UI Emoji"/>
-          <w:sz w:val="20"/>
-          <w:szCs w:val="24"/>
-        </w:rPr>
-      </w:pPr>
-      <w:r>
-        <w:rPr>
-          <w:rFonts w:ascii="Segoe UI Emoji" w:hAnsi="Segoe UI Emoji"/>
-          <w:sz w:val="20"/>
-          <w:szCs w:val="24"/>
-        </w:rPr>
-        <w:t>Depois de receber o ficheiro revisto, analisar cada alteração e comentário; aceitar ou rejeitar de forma fundamentada, sem apagar o registo antes da análise.</w:t>
+        <w:ind w:left="403" w:hanging="230"/>
+        <w:rPr>
+          <w:rFonts w:ascii="Segoe UI Emoji" w:hAnsi="Segoe UI Emoji"/>
+          <w:szCs w:val="24"/>
+        </w:rPr>
+      </w:pPr>
+      <w:r>
+        <w:rPr>
+          <w:rFonts w:ascii="Segoe UI Emoji" w:hAnsi="Segoe UI Emoji"/>
+          <w:szCs w:val="24"/>
+        </w:rPr>
+        <w:t xml:space="preserve">Confirmar que o documento apresenta entre 8 e 12 páginas de conteúdo e não ultrapassa 20 páginas no total, incluindo os anexos. </w:t>
       </w:r>
     </w:p>
     <w:p>
       <w:pPr>
         <w:pStyle w:val="Listacommarcas"/>
         <w:spacing w:after="40"/>
-        <w:rPr>
-          <w:rFonts w:ascii="Segoe UI Emoji" w:hAnsi="Segoe UI Emoji"/>
-          <w:sz w:val="20"/>
-          <w:szCs w:val="24"/>
-        </w:rPr>
-      </w:pPr>
-      <w:r>
-        <w:rPr>
-          <w:rFonts w:ascii="Segoe UI Emoji" w:hAnsi="Segoe UI Emoji"/>
-          <w:sz w:val="20"/>
-          <w:szCs w:val="24"/>
-        </w:rPr>
-        <w:t>Guardar os ficheiros 15 e 16 no computador e na Drive.</w:t>
+        <w:ind w:left="403" w:hanging="230"/>
+        <w:rPr>
+          <w:rFonts w:ascii="Segoe UI Emoji" w:hAnsi="Segoe UI Emoji"/>
+          <w:szCs w:val="24"/>
+        </w:rPr>
+      </w:pPr>
+      <w:r>
+        <w:rPr>
+          <w:rFonts w:ascii="Segoe UI Emoji" w:hAnsi="Segoe UI Emoji"/>
+          <w:szCs w:val="24"/>
+        </w:rPr>
+        <w:t xml:space="preserve">Guardar a versão em desenvolvimento como 2026-07_15_Projeto_Final_Desenvolvimento_PrimeiroNome.docx. </w:t>
+      </w:r>
+    </w:p>
+    <w:p>
+      <w:pPr>
+        <w:pStyle w:val="Listacommarcas"/>
+        <w:spacing w:after="40"/>
+        <w:ind w:left="403" w:hanging="230"/>
+        <w:rPr>
+          <w:rFonts w:ascii="Segoe UI Emoji" w:hAnsi="Segoe UI Emoji"/>
+          <w:szCs w:val="24"/>
+        </w:rPr>
+      </w:pPr>
+      <w:r>
+        <w:rPr>
+          <w:rFonts w:ascii="Segoe UI Emoji" w:hAnsi="Segoe UI Emoji"/>
+          <w:szCs w:val="24"/>
+        </w:rPr>
+        <w:t xml:space="preserve">Criar uma cópia para revisão com o nome 2026-07_16_Revisao_Entre_Pares_PrimeiroNome.docx. </w:t>
+      </w:r>
+    </w:p>
+    <w:p>
+      <w:pPr>
+        <w:pStyle w:val="Listacommarcas"/>
+        <w:spacing w:after="40"/>
+        <w:ind w:left="403" w:hanging="230"/>
+        <w:rPr>
+          <w:rFonts w:ascii="Segoe UI Emoji" w:hAnsi="Segoe UI Emoji"/>
+          <w:szCs w:val="24"/>
+        </w:rPr>
+      </w:pPr>
+      <w:r>
+        <w:rPr>
+          <w:rFonts w:ascii="Segoe UI Emoji" w:hAnsi="Segoe UI Emoji"/>
+          <w:szCs w:val="24"/>
+        </w:rPr>
+        <w:t xml:space="preserve">Trocar a cópia com um/a colega da sala, sem trabalhar simultaneamente no mesmo ficheiro. </w:t>
+      </w:r>
+    </w:p>
+    <w:p>
+      <w:pPr>
+        <w:pStyle w:val="Listacommarcas"/>
+        <w:spacing w:after="40"/>
+        <w:ind w:left="403" w:hanging="230"/>
+        <w:rPr>
+          <w:rFonts w:ascii="Segoe UI Emoji" w:hAnsi="Segoe UI Emoji"/>
+          <w:szCs w:val="24"/>
+        </w:rPr>
+      </w:pPr>
+      <w:r>
+        <w:rPr>
+          <w:rFonts w:ascii="Segoe UI Emoji" w:hAnsi="Segoe UI Emoji"/>
+          <w:szCs w:val="24"/>
+        </w:rPr>
+        <w:t xml:space="preserve">O/A colega deve ativar o Controlo de Alterações e efetuar pelo menos cinco propostas de alteração pertinentes. </w:t>
+      </w:r>
+    </w:p>
+    <w:p>
+      <w:pPr>
+        <w:pStyle w:val="Listacommarcas"/>
+        <w:spacing w:after="40"/>
+        <w:ind w:left="403" w:hanging="230"/>
+        <w:rPr>
+          <w:rFonts w:ascii="Segoe UI Emoji" w:hAnsi="Segoe UI Emoji"/>
+          <w:szCs w:val="24"/>
+        </w:rPr>
+      </w:pPr>
+      <w:r>
+        <w:rPr>
+          <w:rFonts w:ascii="Segoe UI Emoji" w:hAnsi="Segoe UI Emoji"/>
+          <w:szCs w:val="24"/>
+        </w:rPr>
+        <w:t xml:space="preserve">O/A colega deve inserir pelo menos três comentários: </w:t>
+      </w:r>
+    </w:p>
+    <w:p>
+      <w:pPr>
+        <w:pStyle w:val="Listacommarcas"/>
+        <w:numPr>
+          <w:ilvl w:val="0"/>
+          <w:numId w:val="12"/>
+        </w:numPr>
+        <w:spacing w:after="40"/>
+        <w:rPr>
+          <w:rFonts w:ascii="Segoe UI Emoji" w:hAnsi="Segoe UI Emoji"/>
+          <w:szCs w:val="24"/>
+        </w:rPr>
+      </w:pPr>
+      <w:r>
+        <w:rPr>
+          <w:rFonts w:ascii="Segoe UI Emoji" w:hAnsi="Segoe UI Emoji"/>
+          <w:szCs w:val="24"/>
+        </w:rPr>
+        <w:t xml:space="preserve">um aspeto positivo; </w:t>
+      </w:r>
+    </w:p>
+    <w:p>
+      <w:pPr>
+        <w:pStyle w:val="Listacommarcas"/>
+        <w:numPr>
+          <w:ilvl w:val="0"/>
+          <w:numId w:val="12"/>
+        </w:numPr>
+        <w:spacing w:after="40"/>
+        <w:rPr>
+          <w:rFonts w:ascii="Segoe UI Emoji" w:hAnsi="Segoe UI Emoji"/>
+          <w:szCs w:val="24"/>
+        </w:rPr>
+      </w:pPr>
+      <w:r>
+        <w:rPr>
+          <w:rFonts w:ascii="Segoe UI Emoji" w:hAnsi="Segoe UI Emoji"/>
+          <w:szCs w:val="24"/>
+        </w:rPr>
+        <w:t xml:space="preserve">uma melhoria de conteúdo; </w:t>
+      </w:r>
+    </w:p>
+    <w:p>
+      <w:pPr>
+        <w:pStyle w:val="Listacommarcas"/>
+        <w:numPr>
+          <w:ilvl w:val="0"/>
+          <w:numId w:val="12"/>
+        </w:numPr>
+        <w:spacing w:after="40"/>
+        <w:rPr>
+          <w:rFonts w:ascii="Segoe UI Emoji" w:hAnsi="Segoe UI Emoji"/>
+          <w:szCs w:val="24"/>
+        </w:rPr>
+      </w:pPr>
+      <w:r>
+        <w:rPr>
+          <w:rFonts w:ascii="Segoe UI Emoji" w:hAnsi="Segoe UI Emoji"/>
+          <w:szCs w:val="24"/>
+        </w:rPr>
+        <w:t xml:space="preserve">uma melhoria de apresentação ou legibilidade. </w:t>
+      </w:r>
+    </w:p>
+    <w:p>
+      <w:pPr>
+        <w:pStyle w:val="Listacommarcas"/>
+        <w:spacing w:after="40"/>
+        <w:ind w:left="403" w:hanging="230"/>
+        <w:rPr>
+          <w:rFonts w:ascii="Segoe UI Emoji" w:hAnsi="Segoe UI Emoji"/>
+          <w:szCs w:val="24"/>
+        </w:rPr>
+      </w:pPr>
+      <w:r>
+        <w:rPr>
+          <w:rFonts w:ascii="Segoe UI Emoji" w:hAnsi="Segoe UI Emoji"/>
+          <w:szCs w:val="24"/>
+        </w:rPr>
+        <w:t xml:space="preserve">No final do documento, o/a colega deve escrever um feedback entre 80 e 120 palavras, identificando os pontos fortes e as prioridades de melhoria. </w:t>
+      </w:r>
+    </w:p>
+    <w:p>
+      <w:pPr>
+        <w:pStyle w:val="Listacommarcas"/>
+        <w:spacing w:after="40"/>
+        <w:ind w:left="403" w:hanging="230"/>
+        <w:rPr>
+          <w:rFonts w:ascii="Segoe UI Emoji" w:hAnsi="Segoe UI Emoji"/>
+          <w:szCs w:val="24"/>
+        </w:rPr>
+      </w:pPr>
+      <w:r>
+        <w:rPr>
+          <w:rFonts w:ascii="Segoe UI Emoji" w:hAnsi="Segoe UI Emoji"/>
+          <w:szCs w:val="24"/>
+        </w:rPr>
+        <w:t xml:space="preserve">Depois de receber o ficheiro revisto, analisar cada alteração e comentário, sem apagar ou aceitar todas as alterações antes de concluir a análise. </w:t>
+      </w:r>
+    </w:p>
+    <w:p>
+      <w:pPr>
+        <w:pStyle w:val="Listacommarcas"/>
+        <w:spacing w:after="40"/>
+        <w:ind w:left="403" w:hanging="230"/>
+        <w:rPr>
+          <w:rFonts w:ascii="Segoe UI Emoji" w:hAnsi="Segoe UI Emoji"/>
+          <w:szCs w:val="24"/>
+        </w:rPr>
+      </w:pPr>
+      <w:r>
+        <w:rPr>
+          <w:rFonts w:ascii="Segoe UI Emoji" w:hAnsi="Segoe UI Emoji"/>
+          <w:szCs w:val="24"/>
+        </w:rPr>
+        <w:t xml:space="preserve">Preparar as decisões sobre as sugestões que serão aplicadas na TI12. </w:t>
+      </w:r>
+    </w:p>
+    <w:p>
+      <w:pPr>
+        <w:pStyle w:val="Listacommarcas"/>
+        <w:spacing w:after="40"/>
+        <w:ind w:hanging="218"/>
+        <w:rPr>
+          <w:rFonts w:ascii="Segoe UI Emoji" w:hAnsi="Segoe UI Emoji"/>
+          <w:szCs w:val="24"/>
+        </w:rPr>
+      </w:pPr>
+      <w:r>
+        <w:rPr>
+          <w:rFonts w:ascii="Segoe UI Emoji" w:hAnsi="Segoe UI Emoji"/>
+          <w:szCs w:val="24"/>
+        </w:rPr>
+        <w:t>Guardar os dois ficheiros na pasta «Tarefas individuais» do computador e na pasta com o mesmo nome na</w:t>
+      </w:r>
+      <w:r>
+        <w:rPr>
+          <w:rFonts w:ascii="Segoe UI Emoji" w:hAnsi="Segoe UI Emoji"/>
+          <w:sz w:val="20"/>
+          <w:szCs w:val="24"/>
+        </w:rPr>
+        <w:t xml:space="preserve"> </w:t>
+      </w:r>
+      <w:r>
+        <w:rPr>
+          <w:rFonts w:ascii="Segoe UI Emoji" w:hAnsi="Segoe UI Emoji"/>
+          <w:szCs w:val="24"/>
+        </w:rPr>
+        <w:t>Drive.</w:t>
       </w:r>
     </w:p>
     <w:p>
@@ -6069,7 +6559,7 @@
           <w:sz w:val="22"/>
           <w:szCs w:val="24"/>
         </w:rPr>
-        <w:t>Ficheiros 15 e 16 nos dois locais, com alterações registadas, comentários, feedback do colega e decisões do autor.</w:t>
+        <w:t>Projeto Final desenvolvido; ficheiros 15 e 16 guardados nos dois locais; revisão entre pares concluída com alterações, comentários e feedback do/a colega; decisões do/a autor/a registadas no Moodle.</w:t>
       </w:r>
     </w:p>
     <w:p>
@@ -6087,6 +6577,7 @@
           <w:sz w:val="28"/>
           <w:szCs w:val="28"/>
         </w:rPr>
+        <w:lastRenderedPageBreak/>
         <w:t>Verificação antes de concluir</w:t>
       </w:r>
     </w:p>
@@ -6111,103 +6602,106 @@
           <w:sz w:val="20"/>
           <w:szCs w:val="24"/>
         </w:rPr>
-        <w:t>☐ Conteúdos reunidos e estilos uniformizados.</w:t>
-      </w:r>
-    </w:p>
-    <w:p>
-      <w:pPr>
-        <w:pStyle w:val="Listacommarcas"/>
-        <w:numPr>
-          <w:ilvl w:val="0"/>
-          <w:numId w:val="0"/>
-        </w:numPr>
-        <w:spacing w:after="40"/>
-        <w:ind w:left="173"/>
-        <w:rPr>
-          <w:rFonts w:ascii="Segoe UI Emoji" w:hAnsi="Segoe UI Emoji"/>
-          <w:sz w:val="20"/>
-          <w:szCs w:val="24"/>
-        </w:rPr>
-      </w:pPr>
-      <w:r>
-        <w:rPr>
-          <w:rFonts w:ascii="Segoe UI Emoji" w:hAnsi="Segoe UI Emoji"/>
-          <w:sz w:val="20"/>
-          <w:szCs w:val="24"/>
-        </w:rPr>
+        <w:t>☐ Estrutura obrigatória do Projeto Final completa.</w:t>
+      </w:r>
+      <w:r>
+        <w:rPr>
+          <w:rFonts w:ascii="Segoe UI Emoji" w:hAnsi="Segoe UI Emoji"/>
+          <w:sz w:val="20"/>
+          <w:szCs w:val="24"/>
+        </w:rPr>
+        <w:br/>
+        <w:t>☐ Conteúdos do Projeto Final desenvolvidos.</w:t>
+      </w:r>
+      <w:r>
+        <w:rPr>
+          <w:rFonts w:ascii="Segoe UI Emoji" w:hAnsi="Segoe UI Emoji"/>
+          <w:sz w:val="20"/>
+          <w:szCs w:val="24"/>
+        </w:rPr>
+        <w:br/>
+        <w:t>☐ Três níveis de títulos aplicados corretamente.</w:t>
+      </w:r>
+      <w:r>
+        <w:rPr>
+          <w:rFonts w:ascii="Segoe UI Emoji" w:hAnsi="Segoe UI Emoji"/>
+          <w:sz w:val="20"/>
+          <w:szCs w:val="24"/>
+        </w:rPr>
+        <w:br/>
+        <w:t>☐ Elementos técnicos obrigatórios integrados.</w:t>
+      </w:r>
+      <w:r>
+        <w:rPr>
+          <w:rFonts w:ascii="Segoe UI Emoji" w:hAnsi="Segoe UI Emoji"/>
+          <w:sz w:val="20"/>
+          <w:szCs w:val="24"/>
+        </w:rPr>
+        <w:br/>
+        <w:t>☐ Impressão em série explicada e demonstrada.</w:t>
+      </w:r>
+      <w:r>
+        <w:rPr>
+          <w:rFonts w:ascii="Segoe UI Emoji" w:hAnsi="Segoe UI Emoji"/>
+          <w:sz w:val="20"/>
+          <w:szCs w:val="24"/>
+        </w:rPr>
+        <w:br/>
+        <w:t>☐ Limitações da versão identificadas, quando aplicável.</w:t>
+      </w:r>
+      <w:r>
+        <w:rPr>
+          <w:rFonts w:ascii="Segoe UI Emoji" w:hAnsi="Segoe UI Emoji"/>
+          <w:sz w:val="20"/>
+          <w:szCs w:val="24"/>
+        </w:rPr>
+        <w:br/>
+        <w:t>☐ Limites de páginas verificados.</w:t>
+      </w:r>
+      <w:r>
+        <w:rPr>
+          <w:rFonts w:ascii="Segoe UI Emoji" w:hAnsi="Segoe UI Emoji"/>
+          <w:sz w:val="20"/>
+          <w:szCs w:val="24"/>
+        </w:rPr>
+        <w:br/>
         <w:t>☐ Pelo menos cinco alterações registadas.</w:t>
       </w:r>
-    </w:p>
-    <w:p>
-      <w:pPr>
-        <w:pStyle w:val="Listacommarcas"/>
-        <w:numPr>
-          <w:ilvl w:val="0"/>
-          <w:numId w:val="0"/>
-        </w:numPr>
-        <w:spacing w:after="40"/>
-        <w:ind w:left="173"/>
-        <w:rPr>
-          <w:rFonts w:ascii="Segoe UI Emoji" w:hAnsi="Segoe UI Emoji"/>
-          <w:sz w:val="20"/>
-          <w:szCs w:val="24"/>
-        </w:rPr>
-      </w:pPr>
-      <w:r>
-        <w:rPr>
-          <w:rFonts w:ascii="Segoe UI Emoji" w:hAnsi="Segoe UI Emoji"/>
-          <w:sz w:val="20"/>
-          <w:szCs w:val="24"/>
-        </w:rPr>
+      <w:r>
+        <w:rPr>
+          <w:rFonts w:ascii="Segoe UI Emoji" w:hAnsi="Segoe UI Emoji"/>
+          <w:sz w:val="20"/>
+          <w:szCs w:val="24"/>
+        </w:rPr>
+        <w:br/>
         <w:t>☐ Pelo menos três comentários inseridos.</w:t>
       </w:r>
-    </w:p>
-    <w:p>
-      <w:pPr>
-        <w:pStyle w:val="Listacommarcas"/>
-        <w:numPr>
-          <w:ilvl w:val="0"/>
-          <w:numId w:val="0"/>
-        </w:numPr>
-        <w:spacing w:after="40"/>
-        <w:ind w:left="173"/>
-        <w:rPr>
-          <w:rFonts w:ascii="Segoe UI Emoji" w:hAnsi="Segoe UI Emoji"/>
-          <w:sz w:val="20"/>
-          <w:szCs w:val="24"/>
-        </w:rPr>
-      </w:pPr>
-      <w:r>
-        <w:rPr>
-          <w:rFonts w:ascii="Segoe UI Emoji" w:hAnsi="Segoe UI Emoji"/>
-          <w:sz w:val="20"/>
-          <w:szCs w:val="24"/>
-        </w:rPr>
+      <w:r>
+        <w:rPr>
+          <w:rFonts w:ascii="Segoe UI Emoji" w:hAnsi="Segoe UI Emoji"/>
+          <w:sz w:val="20"/>
+          <w:szCs w:val="24"/>
+        </w:rPr>
+        <w:br/>
         <w:t>☐ Feedback entre 80 e 120 palavras.</w:t>
       </w:r>
-    </w:p>
-    <w:p>
-      <w:pPr>
-        <w:pStyle w:val="Listacommarcas"/>
-        <w:numPr>
-          <w:ilvl w:val="0"/>
-          <w:numId w:val="0"/>
-        </w:numPr>
-        <w:spacing w:after="40"/>
-        <w:ind w:left="173"/>
-        <w:rPr>
-          <w:rFonts w:ascii="Segoe UI Emoji" w:hAnsi="Segoe UI Emoji"/>
-          <w:sz w:val="20"/>
-          <w:szCs w:val="24"/>
-        </w:rPr>
-      </w:pPr>
-      <w:r>
-        <w:rPr>
-          <w:rFonts w:ascii="Segoe UI Emoji" w:hAnsi="Segoe UI Emoji"/>
-          <w:sz w:val="20"/>
-          <w:szCs w:val="24"/>
-        </w:rPr>
-        <w:t>☐ Decisões do autor justificadas no Moodle.</w:t>
+      <w:r>
+        <w:rPr>
+          <w:rFonts w:ascii="Segoe UI Emoji" w:hAnsi="Segoe UI Emoji"/>
+          <w:sz w:val="20"/>
+          <w:szCs w:val="24"/>
+        </w:rPr>
+        <w:br/>
+        <w:t>☐ Feedback recebido analisado.</w:t>
+      </w:r>
+      <w:r>
+        <w:rPr>
+          <w:rFonts w:ascii="Segoe UI Emoji" w:hAnsi="Segoe UI Emoji"/>
+          <w:sz w:val="20"/>
+          <w:szCs w:val="24"/>
+        </w:rPr>
+        <w:br/>
+        <w:t>☐ Decisões do/a autor/a justificadas no Moodle.</w:t>
       </w:r>
     </w:p>
     <w:p>
@@ -6217,15 +6711,15 @@
           <w:sz w:val="22"/>
           <w:szCs w:val="24"/>
         </w:rPr>
-      </w:pPr>
-      <w:r>
-        <w:rPr>
-          <w:rFonts w:ascii="Segoe UI Emoji" w:hAnsi="Segoe UI Emoji"/>
-          <w:sz w:val="22"/>
-          <w:szCs w:val="24"/>
-        </w:rPr>
-        <w:br w:type="page"/>
-      </w:r>
+        <w:sectPr>
+          <w:footerReference w:type="default" r:id="rId14"/>
+          <w:pgSz w:w="11909" w:h="16834"/>
+          <w:pgMar w:top="893" w:right="1037" w:bottom="893" w:left="1037" w:header="720" w:footer="720" w:gutter="0"/>
+          <w:pgNumType w:start="1"/>
+          <w:cols w:space="720"/>
+          <w:docGrid w:linePitch="360"/>
+        </w:sectPr>
+      </w:pPr>
     </w:p>
     <w:p>
       <w:pPr>
@@ -6356,7 +6850,7 @@
           <w:sz w:val="22"/>
           <w:szCs w:val="24"/>
         </w:rPr>
-        <w:t>Concluir o projeto, disponibilizar o PDF com permissões de leitura e refletir sobre a evolução das aprendizagens.</w:t>
+        <w:t>Concluir o Projeto Final — Documento Profissional, aplicar o feedback recebido, verificar o funcionamento do documento e preparar as versões finais em DOCX e PDF.</w:t>
       </w:r>
     </w:p>
     <w:p>
@@ -6380,163 +6874,538 @@
     <w:p>
       <w:pPr>
         <w:pStyle w:val="Listacommarcas"/>
+        <w:rPr>
+          <w:rFonts w:ascii="Segoe UI Emoji" w:hAnsi="Segoe UI Emoji"/>
+          <w:szCs w:val="24"/>
+        </w:rPr>
+      </w:pPr>
+      <w:r>
+        <w:rPr>
+          <w:rFonts w:ascii="Segoe UI Emoji" w:hAnsi="Segoe UI Emoji"/>
+          <w:szCs w:val="24"/>
+        </w:rPr>
+        <w:t xml:space="preserve">Criar uma nova cópia da versão do Projeto Final revista na TI11. </w:t>
+      </w:r>
+    </w:p>
+    <w:p>
+      <w:pPr>
+        <w:pStyle w:val="Listacommarcas"/>
+        <w:rPr>
+          <w:rFonts w:ascii="Segoe UI Emoji" w:hAnsi="Segoe UI Emoji"/>
+          <w:szCs w:val="24"/>
+        </w:rPr>
+      </w:pPr>
+      <w:r>
+        <w:rPr>
+          <w:rFonts w:ascii="Segoe UI Emoji" w:hAnsi="Segoe UI Emoji"/>
+          <w:szCs w:val="24"/>
+        </w:rPr>
+        <w:t xml:space="preserve">Guardar a cópia com o nome 2026-07_Projeto_Final_PrimeiroNome.docx. </w:t>
+      </w:r>
+    </w:p>
+    <w:p>
+      <w:pPr>
+        <w:pStyle w:val="Listacommarcas"/>
+        <w:rPr>
+          <w:rFonts w:ascii="Segoe UI Emoji" w:hAnsi="Segoe UI Emoji"/>
+          <w:szCs w:val="24"/>
+        </w:rPr>
+      </w:pPr>
+      <w:r>
+        <w:rPr>
+          <w:rFonts w:ascii="Segoe UI Emoji" w:hAnsi="Segoe UI Emoji"/>
+          <w:szCs w:val="24"/>
+        </w:rPr>
+        <w:t xml:space="preserve">Analisar o feedback recebido durante a revisão entre pares e aplicar as melhorias pertinentes. </w:t>
+      </w:r>
+    </w:p>
+    <w:p>
+      <w:pPr>
+        <w:pStyle w:val="Listacommarcas"/>
+        <w:rPr>
+          <w:rFonts w:ascii="Segoe UI Emoji" w:hAnsi="Segoe UI Emoji"/>
+          <w:szCs w:val="24"/>
+        </w:rPr>
+      </w:pPr>
+      <w:r>
+        <w:rPr>
+          <w:rFonts w:ascii="Segoe UI Emoji" w:hAnsi="Segoe UI Emoji"/>
+          <w:szCs w:val="24"/>
+        </w:rPr>
+        <w:t xml:space="preserve">Registar as principais alterações realizadas e justificar qualquer sugestão que não seja aplicada. </w:t>
+      </w:r>
+    </w:p>
+    <w:p>
+      <w:pPr>
+        <w:pStyle w:val="Listacommarcas"/>
+        <w:rPr>
+          <w:rFonts w:ascii="Segoe UI Emoji" w:hAnsi="Segoe UI Emoji"/>
+          <w:szCs w:val="24"/>
+        </w:rPr>
+      </w:pPr>
+      <w:r>
+        <w:rPr>
+          <w:rFonts w:ascii="Segoe UI Emoji" w:hAnsi="Segoe UI Emoji"/>
+          <w:szCs w:val="24"/>
+        </w:rPr>
+        <w:t xml:space="preserve">Executar a revisão ortográfica e gramatical e confirmar que o idioma de revisão está definido como Português de Portugal. </w:t>
+      </w:r>
+    </w:p>
+    <w:p>
+      <w:pPr>
+        <w:pStyle w:val="Listacommarcas"/>
+        <w:rPr>
+          <w:rFonts w:ascii="Segoe UI Emoji" w:hAnsi="Segoe UI Emoji"/>
+          <w:szCs w:val="24"/>
+        </w:rPr>
+      </w:pPr>
+      <w:r>
+        <w:rPr>
+          <w:rFonts w:ascii="Segoe UI Emoji" w:hAnsi="Segoe UI Emoji"/>
+          <w:szCs w:val="24"/>
+        </w:rPr>
+        <w:t xml:space="preserve">Verificar os estilos, listas, tabelas, imagens, cabeçalhos, rodapés, numeração e quebras. </w:t>
+      </w:r>
+    </w:p>
+    <w:p>
+      <w:pPr>
+        <w:pStyle w:val="Listacommarcas"/>
+        <w:rPr>
+          <w:rFonts w:ascii="Segoe UI Emoji" w:hAnsi="Segoe UI Emoji"/>
+          <w:szCs w:val="24"/>
+        </w:rPr>
+      </w:pPr>
+      <w:r>
+        <w:rPr>
+          <w:rFonts w:ascii="Segoe UI Emoji" w:hAnsi="Segoe UI Emoji"/>
+          <w:szCs w:val="24"/>
+        </w:rPr>
+        <w:t xml:space="preserve">Atualizar: </w:t>
+      </w:r>
+    </w:p>
+    <w:p>
+      <w:pPr>
+        <w:pStyle w:val="Listacommarcas"/>
+        <w:numPr>
+          <w:ilvl w:val="0"/>
+          <w:numId w:val="12"/>
+        </w:numPr>
         <w:spacing w:after="40"/>
         <w:rPr>
           <w:rFonts w:ascii="Segoe UI Emoji" w:hAnsi="Segoe UI Emoji"/>
-          <w:sz w:val="20"/>
-          <w:szCs w:val="24"/>
-        </w:rPr>
-      </w:pPr>
-      <w:proofErr w:type="gramStart"/>
-      <w:r>
-        <w:rPr>
-          <w:rFonts w:ascii="Segoe UI Emoji" w:hAnsi="Segoe UI Emoji"/>
-          <w:sz w:val="20"/>
-          <w:szCs w:val="24"/>
-        </w:rPr>
-        <w:t>Criar uma nova</w:t>
-      </w:r>
-      <w:proofErr w:type="gramEnd"/>
-      <w:r>
-        <w:rPr>
-          <w:rFonts w:ascii="Segoe UI Emoji" w:hAnsi="Segoe UI Emoji"/>
-          <w:sz w:val="20"/>
-          <w:szCs w:val="24"/>
-        </w:rPr>
-        <w:t xml:space="preserve"> cópia do ficheiro anterior com o nome «2026-07_11_Projeto_Final_Ana.docx».</w:t>
+          <w:szCs w:val="24"/>
+        </w:rPr>
+      </w:pPr>
+      <w:r>
+        <w:rPr>
+          <w:rFonts w:ascii="Segoe UI Emoji" w:hAnsi="Segoe UI Emoji"/>
+          <w:szCs w:val="24"/>
+        </w:rPr>
+        <w:t xml:space="preserve">o índice; </w:t>
       </w:r>
     </w:p>
     <w:p>
       <w:pPr>
         <w:pStyle w:val="Listacommarcas"/>
+        <w:numPr>
+          <w:ilvl w:val="0"/>
+          <w:numId w:val="12"/>
+        </w:numPr>
         <w:spacing w:after="40"/>
         <w:rPr>
           <w:rFonts w:ascii="Segoe UI Emoji" w:hAnsi="Segoe UI Emoji"/>
-          <w:sz w:val="20"/>
-          <w:szCs w:val="24"/>
-        </w:rPr>
-      </w:pPr>
-      <w:r>
-        <w:rPr>
-          <w:rFonts w:ascii="Segoe UI Emoji" w:hAnsi="Segoe UI Emoji"/>
-          <w:sz w:val="20"/>
-          <w:szCs w:val="24"/>
-        </w:rPr>
-        <w:t>Ler o feedback recebido na avaliação entre pares e aplicar as correções pertinentes.</w:t>
+          <w:szCs w:val="24"/>
+        </w:rPr>
+      </w:pPr>
+      <w:r>
+        <w:rPr>
+          <w:rFonts w:ascii="Segoe UI Emoji" w:hAnsi="Segoe UI Emoji"/>
+          <w:szCs w:val="24"/>
+        </w:rPr>
+        <w:t xml:space="preserve">os índices de figuras e tabelas; </w:t>
       </w:r>
     </w:p>
     <w:p>
       <w:pPr>
         <w:pStyle w:val="Listacommarcas"/>
+        <w:numPr>
+          <w:ilvl w:val="0"/>
+          <w:numId w:val="12"/>
+        </w:numPr>
         <w:spacing w:after="40"/>
         <w:rPr>
           <w:rFonts w:ascii="Segoe UI Emoji" w:hAnsi="Segoe UI Emoji"/>
-          <w:sz w:val="20"/>
-          <w:szCs w:val="24"/>
-        </w:rPr>
-      </w:pPr>
-      <w:r>
-        <w:rPr>
-          <w:rFonts w:ascii="Segoe UI Emoji" w:hAnsi="Segoe UI Emoji"/>
-          <w:sz w:val="20"/>
-          <w:szCs w:val="24"/>
-        </w:rPr>
-        <w:t>Executar a revisão ortográfica e gramatical, atualizar todo o índice e verificar a paginação e a pré-visualização de impressão.</w:t>
+          <w:szCs w:val="24"/>
+        </w:rPr>
+      </w:pPr>
+      <w:r>
+        <w:rPr>
+          <w:rFonts w:ascii="Segoe UI Emoji" w:hAnsi="Segoe UI Emoji"/>
+          <w:szCs w:val="24"/>
+        </w:rPr>
+        <w:t xml:space="preserve">as legendas; </w:t>
       </w:r>
     </w:p>
     <w:p>
       <w:pPr>
         <w:pStyle w:val="Listacommarcas"/>
+        <w:numPr>
+          <w:ilvl w:val="0"/>
+          <w:numId w:val="12"/>
+        </w:numPr>
         <w:spacing w:after="40"/>
         <w:rPr>
           <w:rFonts w:ascii="Segoe UI Emoji" w:hAnsi="Segoe UI Emoji"/>
-          <w:sz w:val="20"/>
-          <w:szCs w:val="24"/>
-        </w:rPr>
-      </w:pPr>
-      <w:r>
-        <w:rPr>
-          <w:rFonts w:ascii="Segoe UI Emoji" w:hAnsi="Segoe UI Emoji"/>
-          <w:sz w:val="20"/>
-          <w:szCs w:val="24"/>
-        </w:rPr>
-        <w:t>Acrescentar ao final do documento uma reflexão entre 150 e 200 palavras: aprendizagens mais importantes; principais dificuldades; evolução relativamente às expetativas iniciais; tarefa de que mais gostou; e utilização futura destas competências.</w:t>
+          <w:szCs w:val="24"/>
+        </w:rPr>
+      </w:pPr>
+      <w:r>
+        <w:rPr>
+          <w:rFonts w:ascii="Segoe UI Emoji" w:hAnsi="Segoe UI Emoji"/>
+          <w:szCs w:val="24"/>
+        </w:rPr>
+        <w:t xml:space="preserve">as referências cruzadas; </w:t>
       </w:r>
     </w:p>
     <w:p>
       <w:pPr>
         <w:pStyle w:val="Listacommarcas"/>
+        <w:numPr>
+          <w:ilvl w:val="0"/>
+          <w:numId w:val="12"/>
+        </w:numPr>
         <w:spacing w:after="40"/>
         <w:rPr>
           <w:rFonts w:ascii="Segoe UI Emoji" w:hAnsi="Segoe UI Emoji"/>
-          <w:sz w:val="20"/>
-          <w:szCs w:val="24"/>
-        </w:rPr>
-      </w:pPr>
-      <w:r>
-        <w:rPr>
-          <w:rFonts w:ascii="Segoe UI Emoji" w:hAnsi="Segoe UI Emoji"/>
-          <w:sz w:val="20"/>
-          <w:szCs w:val="24"/>
-        </w:rPr>
-        <w:t>Configurar o documento em «Dobra de livro» (Esquema → Margens → Margens Personalizadas → Várias páginas → Dobra de livro). Exportar a versão final para PDF, mantendo a disposição das páginas, e guardar o ficheiro na pasta partilhada da Drive com o nome «2026-07_11_Projeto_Final_Ana.pdf».</w:t>
+          <w:szCs w:val="24"/>
+        </w:rPr>
+      </w:pPr>
+      <w:r>
+        <w:rPr>
+          <w:rFonts w:ascii="Segoe UI Emoji" w:hAnsi="Segoe UI Emoji"/>
+          <w:szCs w:val="24"/>
+        </w:rPr>
+        <w:t xml:space="preserve">as hiperligações; </w:t>
       </w:r>
     </w:p>
     <w:p>
       <w:pPr>
         <w:pStyle w:val="Listacommarcas"/>
+        <w:numPr>
+          <w:ilvl w:val="0"/>
+          <w:numId w:val="12"/>
+        </w:numPr>
         <w:spacing w:after="40"/>
         <w:rPr>
           <w:rFonts w:ascii="Segoe UI Emoji" w:hAnsi="Segoe UI Emoji"/>
-          <w:sz w:val="20"/>
-          <w:szCs w:val="24"/>
-        </w:rPr>
-      </w:pPr>
-      <w:r>
-        <w:rPr>
-          <w:rFonts w:ascii="Segoe UI Emoji" w:hAnsi="Segoe UI Emoji"/>
-          <w:sz w:val="20"/>
-          <w:szCs w:val="24"/>
-        </w:rPr>
-        <w:t>Nas definições de partilha do PDF, selecionar «Qualquer pessoa com a ligação» e a função «Leitor».</w:t>
+          <w:szCs w:val="24"/>
+        </w:rPr>
+      </w:pPr>
+      <w:r>
+        <w:rPr>
+          <w:rFonts w:ascii="Segoe UI Emoji" w:hAnsi="Segoe UI Emoji"/>
+          <w:szCs w:val="24"/>
+        </w:rPr>
+        <w:t xml:space="preserve">os restantes campos automáticos. </w:t>
       </w:r>
     </w:p>
     <w:p>
       <w:pPr>
         <w:pStyle w:val="Listacommarcas"/>
+        <w:rPr>
+          <w:rFonts w:ascii="Segoe UI Emoji" w:hAnsi="Segoe UI Emoji"/>
+          <w:szCs w:val="24"/>
+        </w:rPr>
+      </w:pPr>
+      <w:r>
+        <w:rPr>
+          <w:rFonts w:ascii="Segoe UI Emoji" w:hAnsi="Segoe UI Emoji"/>
+          <w:szCs w:val="24"/>
+        </w:rPr>
+        <w:t xml:space="preserve">Testar as hiperligações, referências e a navegação interna. </w:t>
+      </w:r>
+    </w:p>
+    <w:p>
+      <w:pPr>
+        <w:pStyle w:val="Listacommarcas"/>
+        <w:rPr>
+          <w:rFonts w:ascii="Segoe UI Emoji" w:hAnsi="Segoe UI Emoji"/>
+          <w:szCs w:val="24"/>
+        </w:rPr>
+      </w:pPr>
+      <w:r>
+        <w:rPr>
+          <w:rFonts w:ascii="Segoe UI Emoji" w:hAnsi="Segoe UI Emoji"/>
+          <w:szCs w:val="24"/>
+        </w:rPr>
+        <w:t xml:space="preserve">Executar a verificação de acessibilidade e analisar os problemas identificados. </w:t>
+      </w:r>
+    </w:p>
+    <w:p>
+      <w:pPr>
+        <w:pStyle w:val="Listacommarcas"/>
+        <w:rPr>
+          <w:rFonts w:ascii="Segoe UI Emoji" w:hAnsi="Segoe UI Emoji"/>
+          <w:szCs w:val="24"/>
+        </w:rPr>
+      </w:pPr>
+      <w:r>
+        <w:rPr>
+          <w:rFonts w:ascii="Segoe UI Emoji" w:hAnsi="Segoe UI Emoji"/>
+          <w:szCs w:val="24"/>
+        </w:rPr>
+        <w:t xml:space="preserve">Em </w:t>
+      </w:r>
+      <w:r>
+        <w:rPr>
+          <w:rFonts w:ascii="Segoe UI Emoji" w:hAnsi="Segoe UI Emoji"/>
+          <w:b/>
+          <w:bCs/>
+          <w:szCs w:val="24"/>
+        </w:rPr>
+        <w:t>Ficheiro → Imprimir</w:t>
+      </w:r>
+      <w:r>
+        <w:rPr>
+          <w:rFonts w:ascii="Segoe UI Emoji" w:hAnsi="Segoe UI Emoji"/>
+          <w:szCs w:val="24"/>
+        </w:rPr>
+        <w:t xml:space="preserve">, confirmar a paginação, as margens, a orientação e a disposição de todas as páginas. </w:t>
+      </w:r>
+    </w:p>
+    <w:p>
+      <w:pPr>
+        <w:pStyle w:val="Listacommarcas"/>
+        <w:rPr>
+          <w:rFonts w:ascii="Segoe UI Emoji" w:hAnsi="Segoe UI Emoji"/>
+          <w:szCs w:val="24"/>
+        </w:rPr>
+      </w:pPr>
+      <w:r>
+        <w:rPr>
+          <w:rFonts w:ascii="Segoe UI Emoji" w:hAnsi="Segoe UI Emoji"/>
+          <w:szCs w:val="24"/>
+        </w:rPr>
+        <w:t xml:space="preserve">Confirmar que o documento apresenta entre 8 e 12 páginas de conteúdo e não ultrapassa 20 páginas no total, incluindo os anexos. </w:t>
+      </w:r>
+    </w:p>
+    <w:p>
+      <w:pPr>
+        <w:pStyle w:val="Listacommarcas"/>
+        <w:rPr>
+          <w:rFonts w:ascii="Segoe UI Emoji" w:hAnsi="Segoe UI Emoji"/>
+          <w:szCs w:val="24"/>
+        </w:rPr>
+      </w:pPr>
+      <w:r>
+        <w:rPr>
+          <w:rFonts w:ascii="Segoe UI Emoji" w:hAnsi="Segoe UI Emoji"/>
+          <w:szCs w:val="24"/>
+        </w:rPr>
+        <w:t xml:space="preserve">Escrever uma reflexão individual final com 5 a 8 frases e entre 150 e 200 palavras, considerando: </w:t>
+      </w:r>
+    </w:p>
+    <w:p>
+      <w:pPr>
+        <w:pStyle w:val="Listacommarcas"/>
+        <w:numPr>
+          <w:ilvl w:val="0"/>
+          <w:numId w:val="12"/>
+        </w:numPr>
         <w:spacing w:after="40"/>
         <w:rPr>
           <w:rFonts w:ascii="Segoe UI Emoji" w:hAnsi="Segoe UI Emoji"/>
-          <w:sz w:val="20"/>
-          <w:szCs w:val="24"/>
-        </w:rPr>
-      </w:pPr>
-      <w:r>
-        <w:rPr>
-          <w:rFonts w:ascii="Segoe UI Emoji" w:hAnsi="Segoe UI Emoji"/>
-          <w:sz w:val="20"/>
-          <w:szCs w:val="24"/>
-        </w:rPr>
-        <w:t>Testar a ligação, preferencialmente numa janela privada, e confirmar que o PDF abre sem permitir alterações.</w:t>
+          <w:szCs w:val="24"/>
+        </w:rPr>
+      </w:pPr>
+      <w:r>
+        <w:rPr>
+          <w:rFonts w:ascii="Segoe UI Emoji" w:hAnsi="Segoe UI Emoji"/>
+          <w:szCs w:val="24"/>
+        </w:rPr>
+        <w:t xml:space="preserve">os conhecimentos aplicados; </w:t>
       </w:r>
     </w:p>
     <w:p>
       <w:pPr>
         <w:pStyle w:val="Listacommarcas"/>
+        <w:numPr>
+          <w:ilvl w:val="0"/>
+          <w:numId w:val="12"/>
+        </w:numPr>
         <w:spacing w:after="40"/>
         <w:rPr>
           <w:rFonts w:ascii="Segoe UI Emoji" w:hAnsi="Segoe UI Emoji"/>
-          <w:sz w:val="20"/>
-          <w:szCs w:val="24"/>
-        </w:rPr>
-      </w:pPr>
-      <w:r>
-        <w:rPr>
-          <w:rFonts w:ascii="Segoe UI Emoji" w:hAnsi="Segoe UI Emoji"/>
-          <w:sz w:val="20"/>
-          <w:szCs w:val="24"/>
-        </w:rPr>
-        <w:t>Publicar no Moodle a ligação de leitura para o PDF final, que deverá ficar pronto para ser partilhado no e-Portfólio.</w:t>
+          <w:szCs w:val="24"/>
+        </w:rPr>
+      </w:pPr>
+      <w:r>
+        <w:rPr>
+          <w:rFonts w:ascii="Segoe UI Emoji" w:hAnsi="Segoe UI Emoji"/>
+          <w:szCs w:val="24"/>
+        </w:rPr>
+        <w:t xml:space="preserve">a funcionalidade considerada mais útil; </w:t>
+      </w:r>
+    </w:p>
+    <w:p>
+      <w:pPr>
+        <w:pStyle w:val="Listacommarcas"/>
+        <w:numPr>
+          <w:ilvl w:val="0"/>
+          <w:numId w:val="12"/>
+        </w:numPr>
+        <w:spacing w:after="40"/>
+        <w:rPr>
+          <w:rFonts w:ascii="Segoe UI Emoji" w:hAnsi="Segoe UI Emoji"/>
+          <w:szCs w:val="24"/>
+        </w:rPr>
+      </w:pPr>
+      <w:r>
+        <w:rPr>
+          <w:rFonts w:ascii="Segoe UI Emoji" w:hAnsi="Segoe UI Emoji"/>
+          <w:szCs w:val="24"/>
+        </w:rPr>
+        <w:t xml:space="preserve">uma dificuldade e a respetiva solução; </w:t>
+      </w:r>
+    </w:p>
+    <w:p>
+      <w:pPr>
+        <w:pStyle w:val="Listacommarcas"/>
+        <w:numPr>
+          <w:ilvl w:val="0"/>
+          <w:numId w:val="12"/>
+        </w:numPr>
+        <w:spacing w:after="40"/>
+        <w:rPr>
+          <w:rFonts w:ascii="Segoe UI Emoji" w:hAnsi="Segoe UI Emoji"/>
+          <w:szCs w:val="24"/>
+        </w:rPr>
+      </w:pPr>
+      <w:r>
+        <w:rPr>
+          <w:rFonts w:ascii="Segoe UI Emoji" w:hAnsi="Segoe UI Emoji"/>
+          <w:szCs w:val="24"/>
+        </w:rPr>
+        <w:t xml:space="preserve">uma melhoria resultante da revisão entre pares; </w:t>
+      </w:r>
+    </w:p>
+    <w:p>
+      <w:pPr>
+        <w:pStyle w:val="Listacommarcas"/>
+        <w:numPr>
+          <w:ilvl w:val="0"/>
+          <w:numId w:val="12"/>
+        </w:numPr>
+        <w:spacing w:after="40"/>
+        <w:rPr>
+          <w:rFonts w:ascii="Segoe UI Emoji" w:hAnsi="Segoe UI Emoji"/>
+          <w:szCs w:val="24"/>
+        </w:rPr>
+      </w:pPr>
+      <w:r>
+        <w:rPr>
+          <w:rFonts w:ascii="Segoe UI Emoji" w:hAnsi="Segoe UI Emoji"/>
+          <w:szCs w:val="24"/>
+        </w:rPr>
+        <w:t xml:space="preserve">o que faria de forma diferente. </w:t>
+      </w:r>
+    </w:p>
+    <w:p>
+      <w:pPr>
+        <w:pStyle w:val="Listacommarcas"/>
+        <w:rPr>
+          <w:rFonts w:ascii="Segoe UI Emoji" w:hAnsi="Segoe UI Emoji"/>
+          <w:szCs w:val="24"/>
+        </w:rPr>
+      </w:pPr>
+      <w:r>
+        <w:rPr>
+          <w:rFonts w:ascii="Segoe UI Emoji" w:hAnsi="Segoe UI Emoji"/>
+          <w:szCs w:val="24"/>
+        </w:rPr>
+        <w:t xml:space="preserve">Guardar o DOCX final e exportar o documento como 2026-07_Projeto_Final_PrimeiroNome.pdf. </w:t>
+      </w:r>
+    </w:p>
+    <w:p>
+      <w:pPr>
+        <w:pStyle w:val="Listacommarcas"/>
+        <w:rPr>
+          <w:rFonts w:ascii="Segoe UI Emoji" w:hAnsi="Segoe UI Emoji"/>
+          <w:szCs w:val="24"/>
+        </w:rPr>
+      </w:pPr>
+      <w:r>
+        <w:rPr>
+          <w:rFonts w:ascii="Segoe UI Emoji" w:hAnsi="Segoe UI Emoji"/>
+          <w:szCs w:val="24"/>
+        </w:rPr>
+        <w:t xml:space="preserve">Abrir e verificar os dois ficheiros, confirmando que o conteúdo e a paginação estão corretos. </w:t>
+      </w:r>
+    </w:p>
+    <w:p>
+      <w:pPr>
+        <w:pStyle w:val="Listacommarcas"/>
+        <w:rPr>
+          <w:rFonts w:ascii="Segoe UI Emoji" w:hAnsi="Segoe UI Emoji"/>
+          <w:szCs w:val="24"/>
+        </w:rPr>
+      </w:pPr>
+      <w:r>
+        <w:rPr>
+          <w:rFonts w:ascii="Segoe UI Emoji" w:hAnsi="Segoe UI Emoji"/>
+          <w:szCs w:val="24"/>
+        </w:rPr>
+        <w:t xml:space="preserve">Guardar o DOCX e o PDF na pasta «Tarefas individuais» do computador e na pasta com o mesmo nome na Drive. </w:t>
+      </w:r>
+    </w:p>
+    <w:p>
+      <w:pPr>
+        <w:pStyle w:val="Listacommarcas"/>
+        <w:rPr>
+          <w:rFonts w:ascii="Segoe UI Emoji" w:hAnsi="Segoe UI Emoji"/>
+          <w:szCs w:val="24"/>
+        </w:rPr>
+      </w:pPr>
+      <w:r>
+        <w:rPr>
+          <w:rFonts w:ascii="Segoe UI Emoji" w:hAnsi="Segoe UI Emoji"/>
+          <w:szCs w:val="24"/>
+        </w:rPr>
+        <w:t xml:space="preserve">Configurar a partilha do PDF como «Qualquer pessoa com a ligação» e «Leitor». </w:t>
+      </w:r>
+    </w:p>
+    <w:p>
+      <w:pPr>
+        <w:pStyle w:val="Listacommarcas"/>
+        <w:rPr>
+          <w:rFonts w:ascii="Segoe UI Emoji" w:hAnsi="Segoe UI Emoji"/>
+          <w:szCs w:val="24"/>
+        </w:rPr>
+      </w:pPr>
+      <w:r>
+        <w:rPr>
+          <w:rFonts w:ascii="Segoe UI Emoji" w:hAnsi="Segoe UI Emoji"/>
+          <w:szCs w:val="24"/>
+        </w:rPr>
+        <w:t xml:space="preserve">Testar a ligação, preferencialmente numa janela privada, e confirmar que o PDF abre sem permitir alterações. </w:t>
+      </w:r>
+    </w:p>
+    <w:p>
+      <w:pPr>
+        <w:pStyle w:val="Listacommarcas"/>
+        <w:rPr>
+          <w:rFonts w:ascii="Segoe UI Emoji" w:hAnsi="Segoe UI Emoji"/>
+          <w:sz w:val="20"/>
+          <w:szCs w:val="24"/>
+        </w:rPr>
+      </w:pPr>
+      <w:r>
+        <w:rPr>
+          <w:rFonts w:ascii="Segoe UI Emoji" w:hAnsi="Segoe UI Emoji"/>
+          <w:sz w:val="20"/>
+          <w:szCs w:val="24"/>
+        </w:rPr>
+        <w:t>Publicar a ligação de leitura no Moodle.</w:t>
       </w:r>
     </w:p>
     <w:p>
@@ -6571,7 +7440,7 @@
           <w:sz w:val="22"/>
           <w:szCs w:val="24"/>
         </w:rPr>
-        <w:t>Publicar a ligação de leitura para o PDF final e confirmar que foi testada sem sessão iniciada.</w:t>
+        <w:t>Publicar a ligação de leitura para o PDF final, confirmar que foi testada sem sessão iniciada e registar as principais decisões relativas ao feedback recebido.</w:t>
       </w:r>
     </w:p>
     <w:p>
@@ -6607,7 +7476,7 @@
           <w:sz w:val="22"/>
           <w:szCs w:val="24"/>
         </w:rPr>
-        <w:t>DOCX final e PDF em Dobra de livro guardados na Drive; ligação de leitura publicada no Moodle.</w:t>
+        <w:t>Projeto Final concluído; DOCX e PDF finais guardados nos dois locais; feedback tratado; reflexão concluída; ligação de leitura configurada, testada e publicada no Moodle.</w:t>
       </w:r>
     </w:p>
     <w:p>
@@ -6625,6 +7494,7 @@
           <w:sz w:val="28"/>
           <w:szCs w:val="28"/>
         </w:rPr>
+        <w:lastRenderedPageBreak/>
         <w:t>Verificação antes de concluir</w:t>
       </w:r>
     </w:p>
@@ -6651,111 +7521,323 @@
         </w:rPr>
         <w:t>☐ Feedback entre pares analisado e correções pertinentes aplicadas.</w:t>
       </w:r>
-    </w:p>
-    <w:p>
-      <w:pPr>
-        <w:pStyle w:val="Listacommarcas"/>
-        <w:numPr>
-          <w:ilvl w:val="0"/>
-          <w:numId w:val="0"/>
-        </w:numPr>
-        <w:spacing w:after="40"/>
-        <w:ind w:left="173"/>
-        <w:rPr>
-          <w:rFonts w:ascii="Segoe UI Emoji" w:hAnsi="Segoe UI Emoji"/>
-          <w:sz w:val="20"/>
-          <w:szCs w:val="24"/>
-        </w:rPr>
-      </w:pPr>
-      <w:r>
-        <w:rPr>
-          <w:rFonts w:ascii="Segoe UI Emoji" w:hAnsi="Segoe UI Emoji"/>
-          <w:sz w:val="20"/>
-          <w:szCs w:val="24"/>
-        </w:rPr>
-        <w:t>☐ Índice, paginação e pré-visualização atualizados.</w:t>
-      </w:r>
-    </w:p>
-    <w:p>
-      <w:pPr>
-        <w:pStyle w:val="Listacommarcas"/>
-        <w:numPr>
-          <w:ilvl w:val="0"/>
-          <w:numId w:val="0"/>
-        </w:numPr>
-        <w:spacing w:after="40"/>
-        <w:ind w:left="173"/>
-        <w:rPr>
-          <w:rFonts w:ascii="Segoe UI Emoji" w:hAnsi="Segoe UI Emoji"/>
-          <w:sz w:val="20"/>
-          <w:szCs w:val="24"/>
-        </w:rPr>
-      </w:pPr>
-      <w:r>
-        <w:rPr>
-          <w:rFonts w:ascii="Segoe UI Emoji" w:hAnsi="Segoe UI Emoji"/>
-          <w:sz w:val="20"/>
-          <w:szCs w:val="24"/>
-        </w:rPr>
-        <w:t>☐ Reflexão entre 150 e 200 palavras.</w:t>
-      </w:r>
-    </w:p>
-    <w:p>
-      <w:pPr>
-        <w:pStyle w:val="Listacommarcas"/>
-        <w:numPr>
-          <w:ilvl w:val="0"/>
-          <w:numId w:val="0"/>
-        </w:numPr>
-        <w:spacing w:after="40"/>
-        <w:ind w:left="173"/>
-        <w:rPr>
-          <w:rFonts w:ascii="Segoe UI Emoji" w:hAnsi="Segoe UI Emoji"/>
-          <w:sz w:val="20"/>
-          <w:szCs w:val="24"/>
-        </w:rPr>
-      </w:pPr>
-      <w:r>
-        <w:rPr>
-          <w:rFonts w:ascii="Segoe UI Emoji" w:hAnsi="Segoe UI Emoji"/>
-          <w:sz w:val="20"/>
-          <w:szCs w:val="24"/>
-        </w:rPr>
-        <w:t>☐ PDF exportado mantendo a Dobra de livro.</w:t>
-      </w:r>
-    </w:p>
-    <w:p>
-      <w:pPr>
-        <w:pStyle w:val="Listacommarcas"/>
-        <w:numPr>
-          <w:ilvl w:val="0"/>
-          <w:numId w:val="0"/>
-        </w:numPr>
-        <w:spacing w:after="40"/>
-        <w:ind w:left="173"/>
-        <w:rPr>
-          <w:rFonts w:ascii="Segoe UI Emoji" w:hAnsi="Segoe UI Emoji"/>
-          <w:sz w:val="20"/>
-          <w:szCs w:val="24"/>
-        </w:rPr>
-      </w:pPr>
-      <w:r>
-        <w:rPr>
-          <w:rFonts w:ascii="Segoe UI Emoji" w:hAnsi="Segoe UI Emoji"/>
-          <w:sz w:val="20"/>
-          <w:szCs w:val="24"/>
-        </w:rPr>
-        <w:t>☐ Ligação configurada como Leitor e testada.</w:t>
+      <w:r>
+        <w:rPr>
+          <w:rFonts w:ascii="Segoe UI Emoji" w:hAnsi="Segoe UI Emoji"/>
+          <w:sz w:val="20"/>
+          <w:szCs w:val="24"/>
+        </w:rPr>
+        <w:br/>
+        <w:t>☐ Sugestões não aplicadas identificadas e justificadas.</w:t>
+      </w:r>
+      <w:r>
+        <w:rPr>
+          <w:rFonts w:ascii="Segoe UI Emoji" w:hAnsi="Segoe UI Emoji"/>
+          <w:sz w:val="20"/>
+          <w:szCs w:val="24"/>
+        </w:rPr>
+        <w:br/>
+        <w:t>☐ Revisão linguística e verificação de acessibilidade realizadas.</w:t>
+      </w:r>
+      <w:r>
+        <w:rPr>
+          <w:rFonts w:ascii="Segoe UI Emoji" w:hAnsi="Segoe UI Emoji"/>
+          <w:sz w:val="20"/>
+          <w:szCs w:val="24"/>
+        </w:rPr>
+        <w:br/>
+        <w:t>☐ Índices, campos, legendas, referências cruzadas, hiperligações e paginação atualizados.</w:t>
+      </w:r>
+      <w:r>
+        <w:rPr>
+          <w:rFonts w:ascii="Segoe UI Emoji" w:hAnsi="Segoe UI Emoji"/>
+          <w:sz w:val="20"/>
+          <w:szCs w:val="24"/>
+        </w:rPr>
+        <w:br/>
+        <w:t>☐ Navegação interna e ligações testadas.</w:t>
+      </w:r>
+      <w:r>
+        <w:rPr>
+          <w:rFonts w:ascii="Segoe UI Emoji" w:hAnsi="Segoe UI Emoji"/>
+          <w:sz w:val="20"/>
+          <w:szCs w:val="24"/>
+        </w:rPr>
+        <w:br/>
+        <w:t>☐ Pré-visualização da impressão verificada.</w:t>
+      </w:r>
+      <w:r>
+        <w:rPr>
+          <w:rFonts w:ascii="Segoe UI Emoji" w:hAnsi="Segoe UI Emoji"/>
+          <w:sz w:val="20"/>
+          <w:szCs w:val="24"/>
+        </w:rPr>
+        <w:br/>
+        <w:t>☐ Limites de páginas confirmados.</w:t>
+      </w:r>
+      <w:r>
+        <w:rPr>
+          <w:rFonts w:ascii="Segoe UI Emoji" w:hAnsi="Segoe UI Emoji"/>
+          <w:sz w:val="20"/>
+          <w:szCs w:val="24"/>
+        </w:rPr>
+        <w:br/>
+        <w:t>☐ Reflexão final com 5 a 8 frases e entre 150 e 200 palavras.</w:t>
+      </w:r>
+      <w:r>
+        <w:rPr>
+          <w:rFonts w:ascii="Segoe UI Emoji" w:hAnsi="Segoe UI Emoji"/>
+          <w:sz w:val="20"/>
+          <w:szCs w:val="24"/>
+        </w:rPr>
+        <w:br/>
+        <w:t>☐ Ficheiros DOCX e PDF abertos e verificados.</w:t>
+      </w:r>
+      <w:r>
+        <w:rPr>
+          <w:rFonts w:ascii="Segoe UI Emoji" w:hAnsi="Segoe UI Emoji"/>
+          <w:sz w:val="20"/>
+          <w:szCs w:val="24"/>
+        </w:rPr>
+        <w:br/>
+        <w:t>☐ Ligação de partilha configurada como Leitor e testada.</w:t>
+      </w:r>
+      <w:r>
+        <w:rPr>
+          <w:rFonts w:ascii="Segoe UI Emoji" w:hAnsi="Segoe UI Emoji"/>
+          <w:sz w:val="20"/>
+          <w:szCs w:val="24"/>
+        </w:rPr>
+        <w:br/>
+        <w:t>☐ Ligação publicada no Moodle.</w:t>
       </w:r>
     </w:p>
     <w:sectPr>
+      <w:footerReference w:type="default" r:id="rId15"/>
       <w:pgSz w:w="11909" w:h="16834"/>
       <w:pgMar w:top="893" w:right="1037" w:bottom="893" w:left="1037" w:header="720" w:footer="720" w:gutter="0"/>
+      <w:pgNumType w:start="1"/>
       <w:cols w:space="720"/>
       <w:docGrid w:linePitch="360"/>
     </w:sectPr>
   </w:body>
 </w:document>
+</file>
+
+<file path=word/endnotes.xml><?xml version="1.0" encoding="utf-8"?>
+<w:endnotes xmlns:wpc="http://schemas.microsoft.com/office/word/2010/wordprocessingCanvas" xmlns:cx="http://schemas.microsoft.com/office/drawing/2014/chartex" xmlns:cx1="http://schemas.microsoft.com/office/drawing/2015/9/8/chartex" xmlns:cx2="http://schemas.microsoft.com/office/drawing/2015/10/21/chartex" xmlns:cx3="http://schemas.microsoft.com/office/drawing/2016/5/9/chartex" xmlns:cx4="http://schemas.microsoft.com/office/drawing/2016/5/10/chartex" xmlns:cx5="http://schemas.microsoft.com/office/drawing/2016/5/11/chartex" xmlns:cx6="http://schemas.microsoft.com/office/drawing/2016/5/12/chartex" xmlns:cx7="http://schemas.microsoft.com/office/drawing/2016/5/13/chartex" xmlns:cx8="http://schemas.microsoft.com/office/drawing/2016/5/14/chartex" xmlns:mc="http://schemas.openxmlformats.org/markup-compatibility/2006" xmlns:aink="http://schemas.microsoft.com/office/drawing/2016/ink" xmlns:am3d="http://schemas.microsoft.com/office/drawing/2017/model3d" xmlns:o="urn:schemas-microsoft-com:office:office" xmlns:oel="http://schemas.microsoft.com/office/2019/extlst" xmlns:r="http://schemas.openxmlformats.org/officeDocument/2006/relationships" xmlns:m="http://schemas.openxmlformats.org/officeDocument/2006/math" xmlns:v="urn:schemas-microsoft-com:vml" xmlns:wp14="http://schemas.microsoft.com/office/word/2010/wordprocessingDrawing" xmlns:wp="http://schemas.openxmlformats.org/drawingml/2006/wordprocessingDrawing" xmlns:w10="urn:schemas-microsoft-com:office:word" xmlns:w="http://schemas.openxmlformats.org/wordprocessingml/2006/main" xmlns:w14="http://schemas.microsoft.com/office/word/2010/wordml" xmlns:w15="http://schemas.microsoft.com/office/word/2012/wordml" xmlns:w16cex="http://schemas.microsoft.com/office/word/2018/wordml/cex" xmlns:w16cid="http://schemas.microsoft.com/office/word/2016/wordml/cid" xmlns:w16="http://schemas.microsoft.com/office/word/2018/wordml" xmlns:w16du="http://schemas.microsoft.com/office/word/2023/wordml/word16du" xmlns:w16sdtdh="http://schemas.microsoft.com/office/word/2020/wordml/sdtdatahash" xmlns:w16sdtfl="http://schemas.microsoft.com/office/word/2024/wordml/sdtformatlock" xmlns:w16se="http://schemas.microsoft.com/office/word/2015/wordml/symex" xmlns:wpg="http://schemas.microsoft.com/office/word/2010/wordprocessingGroup" xmlns:wpi="http://schemas.microsoft.com/office/word/2010/wordprocessingInk" xmlns:wne="http://schemas.microsoft.com/office/word/2006/wordml" xmlns:wps="http://schemas.microsoft.com/office/word/2010/wordprocessingShape" mc:Ignorable="w14 w15 w16se w16cid w16 w16cex w16sdtdh w16sdtfl w16du wp14">
+  <w:endnote w:type="separator" w:id="-1">
+    <w:p>
+      <w:pPr>
+        <w:spacing w:after="0" w:line="240" w:lineRule="auto"/>
+      </w:pPr>
+      <w:r>
+        <w:separator/>
+      </w:r>
+    </w:p>
+  </w:endnote>
+  <w:endnote w:type="continuationSeparator" w:id="0">
+    <w:p>
+      <w:pPr>
+        <w:spacing w:after="0" w:line="240" w:lineRule="auto"/>
+      </w:pPr>
+      <w:r>
+        <w:continuationSeparator/>
+      </w:r>
+    </w:p>
+  </w:endnote>
+</w:endnotes>
+</file>
+
+<file path=word/footer1.xml><?xml version="1.0" encoding="utf-8"?>
+<w:ftr xmlns:wpc="http://schemas.microsoft.com/office/word/2010/wordprocessingCanvas" xmlns:cx="http://schemas.microsoft.com/office/drawing/2014/chartex" xmlns:cx1="http://schemas.microsoft.com/office/drawing/2015/9/8/chartex" xmlns:cx2="http://schemas.microsoft.com/office/drawing/2015/10/21/chartex" xmlns:cx3="http://schemas.microsoft.com/office/drawing/2016/5/9/chartex" xmlns:cx4="http://schemas.microsoft.com/office/drawing/2016/5/10/chartex" xmlns:cx5="http://schemas.microsoft.com/office/drawing/2016/5/11/chartex" xmlns:cx6="http://schemas.microsoft.com/office/drawing/2016/5/12/chartex" xmlns:cx7="http://schemas.microsoft.com/office/drawing/2016/5/13/chartex" xmlns:cx8="http://schemas.microsoft.com/office/drawing/2016/5/14/chartex" xmlns:mc="http://schemas.openxmlformats.org/markup-compatibility/2006" xmlns:aink="http://schemas.microsoft.com/office/drawing/2016/ink" xmlns:am3d="http://schemas.microsoft.com/office/drawing/2017/model3d" xmlns:o="urn:schemas-microsoft-com:office:office" xmlns:oel="http://schemas.microsoft.com/office/2019/extlst" xmlns:r="http://schemas.openxmlformats.org/officeDocument/2006/relationships" xmlns:m="http://schemas.openxmlformats.org/officeDocument/2006/math" xmlns:v="urn:schemas-microsoft-com:vml" xmlns:wp14="http://schemas.microsoft.com/office/word/2010/wordprocessingDrawing" xmlns:wp="http://schemas.openxmlformats.org/drawingml/2006/wordprocessingDrawing" xmlns:w10="urn:schemas-microsoft-com:office:word" xmlns:w="http://schemas.openxmlformats.org/wordprocessingml/2006/main" xmlns:w14="http://schemas.microsoft.com/office/word/2010/wordml" xmlns:w15="http://schemas.microsoft.com/office/word/2012/wordml" xmlns:w16cex="http://schemas.microsoft.com/office/word/2018/wordml/cex" xmlns:w16cid="http://schemas.microsoft.com/office/word/2016/wordml/cid" xmlns:w16="http://schemas.microsoft.com/office/word/2018/wordml" xmlns:w16du="http://schemas.microsoft.com/office/word/2023/wordml/word16du" xmlns:w16sdtdh="http://schemas.microsoft.com/office/word/2020/wordml/sdtdatahash" xmlns:w16sdtfl="http://schemas.microsoft.com/office/word/2024/wordml/sdtformatlock" xmlns:w16se="http://schemas.microsoft.com/office/word/2015/wordml/symex" xmlns:wpg="http://schemas.microsoft.com/office/word/2010/wordprocessingGroup" xmlns:wpi="http://schemas.microsoft.com/office/word/2010/wordprocessingInk" xmlns:wne="http://schemas.microsoft.com/office/word/2006/wordml" xmlns:wps="http://schemas.microsoft.com/office/word/2010/wordprocessingShape" mc:Ignorable="w14 w15 w16se w16cid w16 w16cex w16sdtdh w16sdtfl w16du wp14">
+  <w:p>
+    <w:pPr>
+      <w:pStyle w:val="Rodap"/>
+    </w:pPr>
+  </w:p>
+</w:ftr>
+</file>
+
+<file path=word/footer2.xml><?xml version="1.0" encoding="utf-8"?>
+<w:ftr xmlns:wpc="http://schemas.microsoft.com/office/word/2010/wordprocessingCanvas" xmlns:cx="http://schemas.microsoft.com/office/drawing/2014/chartex" xmlns:cx1="http://schemas.microsoft.com/office/drawing/2015/9/8/chartex" xmlns:cx2="http://schemas.microsoft.com/office/drawing/2015/10/21/chartex" xmlns:cx3="http://schemas.microsoft.com/office/drawing/2016/5/9/chartex" xmlns:cx4="http://schemas.microsoft.com/office/drawing/2016/5/10/chartex" xmlns:cx5="http://schemas.microsoft.com/office/drawing/2016/5/11/chartex" xmlns:cx6="http://schemas.microsoft.com/office/drawing/2016/5/12/chartex" xmlns:cx7="http://schemas.microsoft.com/office/drawing/2016/5/13/chartex" xmlns:cx8="http://schemas.microsoft.com/office/drawing/2016/5/14/chartex" xmlns:mc="http://schemas.openxmlformats.org/markup-compatibility/2006" xmlns:aink="http://schemas.microsoft.com/office/drawing/2016/ink" xmlns:am3d="http://schemas.microsoft.com/office/drawing/2017/model3d" xmlns:o="urn:schemas-microsoft-com:office:office" xmlns:oel="http://schemas.microsoft.com/office/2019/extlst" xmlns:r="http://schemas.openxmlformats.org/officeDocument/2006/relationships" xmlns:m="http://schemas.openxmlformats.org/officeDocument/2006/math" xmlns:v="urn:schemas-microsoft-com:vml" xmlns:wp14="http://schemas.microsoft.com/office/word/2010/wordprocessingDrawing" xmlns:wp="http://schemas.openxmlformats.org/drawingml/2006/wordprocessingDrawing" xmlns:w10="urn:schemas-microsoft-com:office:word" xmlns:w="http://schemas.openxmlformats.org/wordprocessingml/2006/main" xmlns:w14="http://schemas.microsoft.com/office/word/2010/wordml" xmlns:w15="http://schemas.microsoft.com/office/word/2012/wordml" xmlns:w16cex="http://schemas.microsoft.com/office/word/2018/wordml/cex" xmlns:w16cid="http://schemas.microsoft.com/office/word/2016/wordml/cid" xmlns:w16="http://schemas.microsoft.com/office/word/2018/wordml" xmlns:w16du="http://schemas.microsoft.com/office/word/2023/wordml/word16du" xmlns:w16sdtdh="http://schemas.microsoft.com/office/word/2020/wordml/sdtdatahash" xmlns:w16sdtfl="http://schemas.microsoft.com/office/word/2024/wordml/sdtformatlock" xmlns:w16se="http://schemas.microsoft.com/office/word/2015/wordml/symex" xmlns:wpg="http://schemas.microsoft.com/office/word/2010/wordprocessingGroup" xmlns:wpi="http://schemas.microsoft.com/office/word/2010/wordprocessingInk" xmlns:wne="http://schemas.microsoft.com/office/word/2006/wordml" xmlns:wps="http://schemas.microsoft.com/office/word/2010/wordprocessingShape" mc:Ignorable="w14 w15 w16se w16cid w16 w16cex w16sdtdh w16sdtfl w16du wp14">
+  <w:sdt>
+    <w:sdtPr>
+      <w:id w:val="-1565099639"/>
+      <w:docPartObj>
+        <w:docPartGallery w:val="Page Numbers (Bottom of Page)"/>
+        <w:docPartUnique/>
+      </w:docPartObj>
+    </w:sdtPr>
+    <w:sdtContent>
+      <w:p>
+        <w:pPr>
+          <w:pStyle w:val="Rodap"/>
+          <w:jc w:val="right"/>
+        </w:pPr>
+        <w:r>
+          <w:fldChar w:fldCharType="begin"/>
+        </w:r>
+        <w:r>
+          <w:instrText>PAGE   \* MERGEFORMAT</w:instrText>
+        </w:r>
+        <w:r>
+          <w:fldChar w:fldCharType="separate"/>
+        </w:r>
+        <w:r>
+          <w:t>2</w:t>
+        </w:r>
+        <w:r>
+          <w:fldChar w:fldCharType="end"/>
+        </w:r>
+      </w:p>
+    </w:sdtContent>
+  </w:sdt>
+  <w:p>
+    <w:pPr>
+      <w:pStyle w:val="Rodap"/>
+    </w:pPr>
+  </w:p>
+</w:ftr>
+</file>
+
+<file path=word/footer3.xml><?xml version="1.0" encoding="utf-8"?>
+<w:ftr xmlns:wpc="http://schemas.microsoft.com/office/word/2010/wordprocessingCanvas" xmlns:cx="http://schemas.microsoft.com/office/drawing/2014/chartex" xmlns:cx1="http://schemas.microsoft.com/office/drawing/2015/9/8/chartex" xmlns:cx2="http://schemas.microsoft.com/office/drawing/2015/10/21/chartex" xmlns:cx3="http://schemas.microsoft.com/office/drawing/2016/5/9/chartex" xmlns:cx4="http://schemas.microsoft.com/office/drawing/2016/5/10/chartex" xmlns:cx5="http://schemas.microsoft.com/office/drawing/2016/5/11/chartex" xmlns:cx6="http://schemas.microsoft.com/office/drawing/2016/5/12/chartex" xmlns:cx7="http://schemas.microsoft.com/office/drawing/2016/5/13/chartex" xmlns:cx8="http://schemas.microsoft.com/office/drawing/2016/5/14/chartex" xmlns:mc="http://schemas.openxmlformats.org/markup-compatibility/2006" xmlns:aink="http://schemas.microsoft.com/office/drawing/2016/ink" xmlns:am3d="http://schemas.microsoft.com/office/drawing/2017/model3d" xmlns:o="urn:schemas-microsoft-com:office:office" xmlns:oel="http://schemas.microsoft.com/office/2019/extlst" xmlns:r="http://schemas.openxmlformats.org/officeDocument/2006/relationships" xmlns:m="http://schemas.openxmlformats.org/officeDocument/2006/math" xmlns:v="urn:schemas-microsoft-com:vml" xmlns:wp14="http://schemas.microsoft.com/office/word/2010/wordprocessingDrawing" xmlns:wp="http://schemas.openxmlformats.org/drawingml/2006/wordprocessingDrawing" xmlns:w10="urn:schemas-microsoft-com:office:word" xmlns:w="http://schemas.openxmlformats.org/wordprocessingml/2006/main" xmlns:w14="http://schemas.microsoft.com/office/word/2010/wordml" xmlns:w15="http://schemas.microsoft.com/office/word/2012/wordml" xmlns:w16cex="http://schemas.microsoft.com/office/word/2018/wordml/cex" xmlns:w16cid="http://schemas.microsoft.com/office/word/2016/wordml/cid" xmlns:w16="http://schemas.microsoft.com/office/word/2018/wordml" xmlns:w16du="http://schemas.microsoft.com/office/word/2023/wordml/word16du" xmlns:w16sdtdh="http://schemas.microsoft.com/office/word/2020/wordml/sdtdatahash" xmlns:w16sdtfl="http://schemas.microsoft.com/office/word/2024/wordml/sdtformatlock" xmlns:w16se="http://schemas.microsoft.com/office/word/2015/wordml/symex" xmlns:wpg="http://schemas.microsoft.com/office/word/2010/wordprocessingGroup" xmlns:wpi="http://schemas.microsoft.com/office/word/2010/wordprocessingInk" xmlns:wne="http://schemas.microsoft.com/office/word/2006/wordml" xmlns:wps="http://schemas.microsoft.com/office/word/2010/wordprocessingShape" mc:Ignorable="w14 w15 w16se w16cid w16 w16cex w16sdtdh w16sdtfl w16du wp14">
+  <w:p>
+    <w:pPr>
+      <w:pStyle w:val="Rodap"/>
+    </w:pPr>
+  </w:p>
+</w:ftr>
+</file>
+
+<file path=word/footer4.xml><?xml version="1.0" encoding="utf-8"?>
+<w:ftr xmlns:wpc="http://schemas.microsoft.com/office/word/2010/wordprocessingCanvas" xmlns:cx="http://schemas.microsoft.com/office/drawing/2014/chartex" xmlns:cx1="http://schemas.microsoft.com/office/drawing/2015/9/8/chartex" xmlns:cx2="http://schemas.microsoft.com/office/drawing/2015/10/21/chartex" xmlns:cx3="http://schemas.microsoft.com/office/drawing/2016/5/9/chartex" xmlns:cx4="http://schemas.microsoft.com/office/drawing/2016/5/10/chartex" xmlns:cx5="http://schemas.microsoft.com/office/drawing/2016/5/11/chartex" xmlns:cx6="http://schemas.microsoft.com/office/drawing/2016/5/12/chartex" xmlns:cx7="http://schemas.microsoft.com/office/drawing/2016/5/13/chartex" xmlns:cx8="http://schemas.microsoft.com/office/drawing/2016/5/14/chartex" xmlns:mc="http://schemas.openxmlformats.org/markup-compatibility/2006" xmlns:aink="http://schemas.microsoft.com/office/drawing/2016/ink" xmlns:am3d="http://schemas.microsoft.com/office/drawing/2017/model3d" xmlns:o="urn:schemas-microsoft-com:office:office" xmlns:oel="http://schemas.microsoft.com/office/2019/extlst" xmlns:r="http://schemas.openxmlformats.org/officeDocument/2006/relationships" xmlns:m="http://schemas.openxmlformats.org/officeDocument/2006/math" xmlns:v="urn:schemas-microsoft-com:vml" xmlns:wp14="http://schemas.microsoft.com/office/word/2010/wordprocessingDrawing" xmlns:wp="http://schemas.openxmlformats.org/drawingml/2006/wordprocessingDrawing" xmlns:w10="urn:schemas-microsoft-com:office:word" xmlns:w="http://schemas.openxmlformats.org/wordprocessingml/2006/main" xmlns:w14="http://schemas.microsoft.com/office/word/2010/wordml" xmlns:w15="http://schemas.microsoft.com/office/word/2012/wordml" xmlns:w16cex="http://schemas.microsoft.com/office/word/2018/wordml/cex" xmlns:w16cid="http://schemas.microsoft.com/office/word/2016/wordml/cid" xmlns:w16="http://schemas.microsoft.com/office/word/2018/wordml" xmlns:w16du="http://schemas.microsoft.com/office/word/2023/wordml/word16du" xmlns:w16sdtdh="http://schemas.microsoft.com/office/word/2020/wordml/sdtdatahash" xmlns:w16sdtfl="http://schemas.microsoft.com/office/word/2024/wordml/sdtformatlock" xmlns:w16se="http://schemas.microsoft.com/office/word/2015/wordml/symex" xmlns:wpg="http://schemas.microsoft.com/office/word/2010/wordprocessingGroup" xmlns:wpi="http://schemas.microsoft.com/office/word/2010/wordprocessingInk" xmlns:wne="http://schemas.microsoft.com/office/word/2006/wordml" xmlns:wps="http://schemas.microsoft.com/office/word/2010/wordprocessingShape" mc:Ignorable="w14 w15 w16se w16cid w16 w16cex w16sdtdh w16sdtfl w16du wp14">
+  <w:sdt>
+    <w:sdtPr>
+      <w:id w:val="1294559663"/>
+      <w:docPartObj>
+        <w:docPartGallery w:val="Page Numbers (Bottom of Page)"/>
+        <w:docPartUnique/>
+      </w:docPartObj>
+    </w:sdtPr>
+    <w:sdtContent>
+      <w:p>
+        <w:pPr>
+          <w:pStyle w:val="Rodap"/>
+          <w:jc w:val="right"/>
+        </w:pPr>
+        <w:r>
+          <w:fldChar w:fldCharType="begin"/>
+        </w:r>
+        <w:r>
+          <w:instrText>PAGE   \* MERGEFORMAT</w:instrText>
+        </w:r>
+        <w:r>
+          <w:fldChar w:fldCharType="separate"/>
+        </w:r>
+        <w:r>
+          <w:t>2</w:t>
+        </w:r>
+        <w:r>
+          <w:fldChar w:fldCharType="end"/>
+        </w:r>
+      </w:p>
+    </w:sdtContent>
+  </w:sdt>
+</w:ftr>
+</file>
+
+<file path=word/footer5.xml><?xml version="1.0" encoding="utf-8"?>
+<w:ftr xmlns:wpc="http://schemas.microsoft.com/office/word/2010/wordprocessingCanvas" xmlns:cx="http://schemas.microsoft.com/office/drawing/2014/chartex" xmlns:cx1="http://schemas.microsoft.com/office/drawing/2015/9/8/chartex" xmlns:cx2="http://schemas.microsoft.com/office/drawing/2015/10/21/chartex" xmlns:cx3="http://schemas.microsoft.com/office/drawing/2016/5/9/chartex" xmlns:cx4="http://schemas.microsoft.com/office/drawing/2016/5/10/chartex" xmlns:cx5="http://schemas.microsoft.com/office/drawing/2016/5/11/chartex" xmlns:cx6="http://schemas.microsoft.com/office/drawing/2016/5/12/chartex" xmlns:cx7="http://schemas.microsoft.com/office/drawing/2016/5/13/chartex" xmlns:cx8="http://schemas.microsoft.com/office/drawing/2016/5/14/chartex" xmlns:mc="http://schemas.openxmlformats.org/markup-compatibility/2006" xmlns:aink="http://schemas.microsoft.com/office/drawing/2016/ink" xmlns:am3d="http://schemas.microsoft.com/office/drawing/2017/model3d" xmlns:o="urn:schemas-microsoft-com:office:office" xmlns:oel="http://schemas.microsoft.com/office/2019/extlst" xmlns:r="http://schemas.openxmlformats.org/officeDocument/2006/relationships" xmlns:m="http://schemas.openxmlformats.org/officeDocument/2006/math" xmlns:v="urn:schemas-microsoft-com:vml" xmlns:wp14="http://schemas.microsoft.com/office/word/2010/wordprocessingDrawing" xmlns:wp="http://schemas.openxmlformats.org/drawingml/2006/wordprocessingDrawing" xmlns:w10="urn:schemas-microsoft-com:office:word" xmlns:w="http://schemas.openxmlformats.org/wordprocessingml/2006/main" xmlns:w14="http://schemas.microsoft.com/office/word/2010/wordml" xmlns:w15="http://schemas.microsoft.com/office/word/2012/wordml" xmlns:w16cex="http://schemas.microsoft.com/office/word/2018/wordml/cex" xmlns:w16cid="http://schemas.microsoft.com/office/word/2016/wordml/cid" xmlns:w16="http://schemas.microsoft.com/office/word/2018/wordml" xmlns:w16du="http://schemas.microsoft.com/office/word/2023/wordml/word16du" xmlns:w16sdtdh="http://schemas.microsoft.com/office/word/2020/wordml/sdtdatahash" xmlns:w16sdtfl="http://schemas.microsoft.com/office/word/2024/wordml/sdtformatlock" xmlns:w16se="http://schemas.microsoft.com/office/word/2015/wordml/symex" xmlns:wpg="http://schemas.microsoft.com/office/word/2010/wordprocessingGroup" xmlns:wpi="http://schemas.microsoft.com/office/word/2010/wordprocessingInk" xmlns:wne="http://schemas.microsoft.com/office/word/2006/wordml" xmlns:wps="http://schemas.microsoft.com/office/word/2010/wordprocessingShape" mc:Ignorable="w14 w15 w16se w16cid w16 w16cex w16sdtdh w16sdtfl w16du wp14">
+  <w:sdt>
+    <w:sdtPr>
+      <w:id w:val="1810209229"/>
+      <w:docPartObj>
+        <w:docPartGallery w:val="Page Numbers (Bottom of Page)"/>
+        <w:docPartUnique/>
+      </w:docPartObj>
+    </w:sdtPr>
+    <w:sdtContent>
+      <w:p>
+        <w:pPr>
+          <w:pStyle w:val="Rodap"/>
+          <w:jc w:val="right"/>
+        </w:pPr>
+        <w:r>
+          <w:fldChar w:fldCharType="begin"/>
+        </w:r>
+        <w:r>
+          <w:instrText>PAGE   \* MERGEFORMAT</w:instrText>
+        </w:r>
+        <w:r>
+          <w:fldChar w:fldCharType="separate"/>
+        </w:r>
+        <w:r>
+          <w:t>2</w:t>
+        </w:r>
+        <w:r>
+          <w:fldChar w:fldCharType="end"/>
+        </w:r>
+      </w:p>
+    </w:sdtContent>
+  </w:sdt>
+</w:ftr>
+</file>
+
+<file path=word/footnotes.xml><?xml version="1.0" encoding="utf-8"?>
+<w:footnotes xmlns:wpc="http://schemas.microsoft.com/office/word/2010/wordprocessingCanvas" xmlns:cx="http://schemas.microsoft.com/office/drawing/2014/chartex" xmlns:cx1="http://schemas.microsoft.com/office/drawing/2015/9/8/chartex" xmlns:cx2="http://schemas.microsoft.com/office/drawing/2015/10/21/chartex" xmlns:cx3="http://schemas.microsoft.com/office/drawing/2016/5/9/chartex" xmlns:cx4="http://schemas.microsoft.com/office/drawing/2016/5/10/chartex" xmlns:cx5="http://schemas.microsoft.com/office/drawing/2016/5/11/chartex" xmlns:cx6="http://schemas.microsoft.com/office/drawing/2016/5/12/chartex" xmlns:cx7="http://schemas.microsoft.com/office/drawing/2016/5/13/chartex" xmlns:cx8="http://schemas.microsoft.com/office/drawing/2016/5/14/chartex" xmlns:mc="http://schemas.openxmlformats.org/markup-compatibility/2006" xmlns:aink="http://schemas.microsoft.com/office/drawing/2016/ink" xmlns:am3d="http://schemas.microsoft.com/office/drawing/2017/model3d" xmlns:o="urn:schemas-microsoft-com:office:office" xmlns:oel="http://schemas.microsoft.com/office/2019/extlst" xmlns:r="http://schemas.openxmlformats.org/officeDocument/2006/relationships" xmlns:m="http://schemas.openxmlformats.org/officeDocument/2006/math" xmlns:v="urn:schemas-microsoft-com:vml" xmlns:wp14="http://schemas.microsoft.com/office/word/2010/wordprocessingDrawing" xmlns:wp="http://schemas.openxmlformats.org/drawingml/2006/wordprocessingDrawing" xmlns:w10="urn:schemas-microsoft-com:office:word" xmlns:w="http://schemas.openxmlformats.org/wordprocessingml/2006/main" xmlns:w14="http://schemas.microsoft.com/office/word/2010/wordml" xmlns:w15="http://schemas.microsoft.com/office/word/2012/wordml" xmlns:w16cex="http://schemas.microsoft.com/office/word/2018/wordml/cex" xmlns:w16cid="http://schemas.microsoft.com/office/word/2016/wordml/cid" xmlns:w16="http://schemas.microsoft.com/office/word/2018/wordml" xmlns:w16du="http://schemas.microsoft.com/office/word/2023/wordml/word16du" xmlns:w16sdtdh="http://schemas.microsoft.com/office/word/2020/wordml/sdtdatahash" xmlns:w16sdtfl="http://schemas.microsoft.com/office/word/2024/wordml/sdtformatlock" xmlns:w16se="http://schemas.microsoft.com/office/word/2015/wordml/symex" xmlns:wpg="http://schemas.microsoft.com/office/word/2010/wordprocessingGroup" xmlns:wpi="http://schemas.microsoft.com/office/word/2010/wordprocessingInk" xmlns:wne="http://schemas.microsoft.com/office/word/2006/wordml" xmlns:wps="http://schemas.microsoft.com/office/word/2010/wordprocessingShape" mc:Ignorable="w14 w15 w16se w16cid w16 w16cex w16sdtdh w16sdtfl w16du wp14">
+  <w:footnote w:type="separator" w:id="-1">
+    <w:p>
+      <w:pPr>
+        <w:spacing w:after="0" w:line="240" w:lineRule="auto"/>
+      </w:pPr>
+      <w:r>
+        <w:separator/>
+      </w:r>
+    </w:p>
+  </w:footnote>
+  <w:footnote w:type="continuationSeparator" w:id="0">
+    <w:p>
+      <w:pPr>
+        <w:spacing w:after="0" w:line="240" w:lineRule="auto"/>
+      </w:pPr>
+      <w:r>
+        <w:continuationSeparator/>
+      </w:r>
+    </w:p>
+  </w:footnote>
+</w:footnotes>
+</file>
+
+<file path=word/header1.xml><?xml version="1.0" encoding="utf-8"?>
+<w:hdr xmlns:wpc="http://schemas.microsoft.com/office/word/2010/wordprocessingCanvas" xmlns:cx="http://schemas.microsoft.com/office/drawing/2014/chartex" xmlns:cx1="http://schemas.microsoft.com/office/drawing/2015/9/8/chartex" xmlns:cx2="http://schemas.microsoft.com/office/drawing/2015/10/21/chartex" xmlns:cx3="http://schemas.microsoft.com/office/drawing/2016/5/9/chartex" xmlns:cx4="http://schemas.microsoft.com/office/drawing/2016/5/10/chartex" xmlns:cx5="http://schemas.microsoft.com/office/drawing/2016/5/11/chartex" xmlns:cx6="http://schemas.microsoft.com/office/drawing/2016/5/12/chartex" xmlns:cx7="http://schemas.microsoft.com/office/drawing/2016/5/13/chartex" xmlns:cx8="http://schemas.microsoft.com/office/drawing/2016/5/14/chartex" xmlns:mc="http://schemas.openxmlformats.org/markup-compatibility/2006" xmlns:aink="http://schemas.microsoft.com/office/drawing/2016/ink" xmlns:am3d="http://schemas.microsoft.com/office/drawing/2017/model3d" xmlns:o="urn:schemas-microsoft-com:office:office" xmlns:oel="http://schemas.microsoft.com/office/2019/extlst" xmlns:r="http://schemas.openxmlformats.org/officeDocument/2006/relationships" xmlns:m="http://schemas.openxmlformats.org/officeDocument/2006/math" xmlns:v="urn:schemas-microsoft-com:vml" xmlns:wp14="http://schemas.microsoft.com/office/word/2010/wordprocessingDrawing" xmlns:wp="http://schemas.openxmlformats.org/drawingml/2006/wordprocessingDrawing" xmlns:w10="urn:schemas-microsoft-com:office:word" xmlns:w="http://schemas.openxmlformats.org/wordprocessingml/2006/main" xmlns:w14="http://schemas.microsoft.com/office/word/2010/wordml" xmlns:w15="http://schemas.microsoft.com/office/word/2012/wordml" xmlns:w16cex="http://schemas.microsoft.com/office/word/2018/wordml/cex" xmlns:w16cid="http://schemas.microsoft.com/office/word/2016/wordml/cid" xmlns:w16="http://schemas.microsoft.com/office/word/2018/wordml" xmlns:w16du="http://schemas.microsoft.com/office/word/2023/wordml/word16du" xmlns:w16sdtdh="http://schemas.microsoft.com/office/word/2020/wordml/sdtdatahash" xmlns:w16sdtfl="http://schemas.microsoft.com/office/word/2024/wordml/sdtformatlock" xmlns:w16se="http://schemas.microsoft.com/office/word/2015/wordml/symex" xmlns:wpg="http://schemas.microsoft.com/office/word/2010/wordprocessingGroup" xmlns:wpi="http://schemas.microsoft.com/office/word/2010/wordprocessingInk" xmlns:wne="http://schemas.microsoft.com/office/word/2006/wordml" xmlns:wps="http://schemas.microsoft.com/office/word/2010/wordprocessingShape" mc:Ignorable="w14 w15 w16se w16cid w16 w16cex w16sdtdh w16sdtfl w16du wp14">
+  <w:p>
+    <w:pPr>
+      <w:pStyle w:val="Cabealho"/>
+    </w:pPr>
+  </w:p>
+</w:hdr>
+</file>
+
+<file path=word/header2.xml><?xml version="1.0" encoding="utf-8"?>
+<w:hdr xmlns:wpc="http://schemas.microsoft.com/office/word/2010/wordprocessingCanvas" xmlns:cx="http://schemas.microsoft.com/office/drawing/2014/chartex" xmlns:cx1="http://schemas.microsoft.com/office/drawing/2015/9/8/chartex" xmlns:cx2="http://schemas.microsoft.com/office/drawing/2015/10/21/chartex" xmlns:cx3="http://schemas.microsoft.com/office/drawing/2016/5/9/chartex" xmlns:cx4="http://schemas.microsoft.com/office/drawing/2016/5/10/chartex" xmlns:cx5="http://schemas.microsoft.com/office/drawing/2016/5/11/chartex" xmlns:cx6="http://schemas.microsoft.com/office/drawing/2016/5/12/chartex" xmlns:cx7="http://schemas.microsoft.com/office/drawing/2016/5/13/chartex" xmlns:cx8="http://schemas.microsoft.com/office/drawing/2016/5/14/chartex" xmlns:mc="http://schemas.openxmlformats.org/markup-compatibility/2006" xmlns:aink="http://schemas.microsoft.com/office/drawing/2016/ink" xmlns:am3d="http://schemas.microsoft.com/office/drawing/2017/model3d" xmlns:o="urn:schemas-microsoft-com:office:office" xmlns:oel="http://schemas.microsoft.com/office/2019/extlst" xmlns:r="http://schemas.openxmlformats.org/officeDocument/2006/relationships" xmlns:m="http://schemas.openxmlformats.org/officeDocument/2006/math" xmlns:v="urn:schemas-microsoft-com:vml" xmlns:wp14="http://schemas.microsoft.com/office/word/2010/wordprocessingDrawing" xmlns:wp="http://schemas.openxmlformats.org/drawingml/2006/wordprocessingDrawing" xmlns:w10="urn:schemas-microsoft-com:office:word" xmlns:w="http://schemas.openxmlformats.org/wordprocessingml/2006/main" xmlns:w14="http://schemas.microsoft.com/office/word/2010/wordml" xmlns:w15="http://schemas.microsoft.com/office/word/2012/wordml" xmlns:w16cex="http://schemas.microsoft.com/office/word/2018/wordml/cex" xmlns:w16cid="http://schemas.microsoft.com/office/word/2016/wordml/cid" xmlns:w16="http://schemas.microsoft.com/office/word/2018/wordml" xmlns:w16du="http://schemas.microsoft.com/office/word/2023/wordml/word16du" xmlns:w16sdtdh="http://schemas.microsoft.com/office/word/2020/wordml/sdtdatahash" xmlns:w16sdtfl="http://schemas.microsoft.com/office/word/2024/wordml/sdtformatlock" xmlns:w16se="http://schemas.microsoft.com/office/word/2015/wordml/symex" xmlns:wpg="http://schemas.microsoft.com/office/word/2010/wordprocessingGroup" xmlns:wpi="http://schemas.microsoft.com/office/word/2010/wordprocessingInk" xmlns:wne="http://schemas.microsoft.com/office/word/2006/wordml" xmlns:wps="http://schemas.microsoft.com/office/word/2010/wordprocessingShape" mc:Ignorable="w14 w15 w16se w16cid w16 w16cex w16sdtdh w16sdtfl w16du wp14">
+  <w:p>
+    <w:pPr>
+      <w:pStyle w:val="Cabealho"/>
+    </w:pPr>
+  </w:p>
+</w:hdr>
+</file>
+
+<file path=word/header3.xml><?xml version="1.0" encoding="utf-8"?>
+<w:hdr xmlns:wpc="http://schemas.microsoft.com/office/word/2010/wordprocessingCanvas" xmlns:cx="http://schemas.microsoft.com/office/drawing/2014/chartex" xmlns:cx1="http://schemas.microsoft.com/office/drawing/2015/9/8/chartex" xmlns:cx2="http://schemas.microsoft.com/office/drawing/2015/10/21/chartex" xmlns:cx3="http://schemas.microsoft.com/office/drawing/2016/5/9/chartex" xmlns:cx4="http://schemas.microsoft.com/office/drawing/2016/5/10/chartex" xmlns:cx5="http://schemas.microsoft.com/office/drawing/2016/5/11/chartex" xmlns:cx6="http://schemas.microsoft.com/office/drawing/2016/5/12/chartex" xmlns:cx7="http://schemas.microsoft.com/office/drawing/2016/5/13/chartex" xmlns:cx8="http://schemas.microsoft.com/office/drawing/2016/5/14/chartex" xmlns:mc="http://schemas.openxmlformats.org/markup-compatibility/2006" xmlns:aink="http://schemas.microsoft.com/office/drawing/2016/ink" xmlns:am3d="http://schemas.microsoft.com/office/drawing/2017/model3d" xmlns:o="urn:schemas-microsoft-com:office:office" xmlns:oel="http://schemas.microsoft.com/office/2019/extlst" xmlns:r="http://schemas.openxmlformats.org/officeDocument/2006/relationships" xmlns:m="http://schemas.openxmlformats.org/officeDocument/2006/math" xmlns:v="urn:schemas-microsoft-com:vml" xmlns:wp14="http://schemas.microsoft.com/office/word/2010/wordprocessingDrawing" xmlns:wp="http://schemas.openxmlformats.org/drawingml/2006/wordprocessingDrawing" xmlns:w10="urn:schemas-microsoft-com:office:word" xmlns:w="http://schemas.openxmlformats.org/wordprocessingml/2006/main" xmlns:w14="http://schemas.microsoft.com/office/word/2010/wordml" xmlns:w15="http://schemas.microsoft.com/office/word/2012/wordml" xmlns:w16cex="http://schemas.microsoft.com/office/word/2018/wordml/cex" xmlns:w16cid="http://schemas.microsoft.com/office/word/2016/wordml/cid" xmlns:w16="http://schemas.microsoft.com/office/word/2018/wordml" xmlns:w16du="http://schemas.microsoft.com/office/word/2023/wordml/word16du" xmlns:w16sdtdh="http://schemas.microsoft.com/office/word/2020/wordml/sdtdatahash" xmlns:w16sdtfl="http://schemas.microsoft.com/office/word/2024/wordml/sdtformatlock" xmlns:w16se="http://schemas.microsoft.com/office/word/2015/wordml/symex" xmlns:wpg="http://schemas.microsoft.com/office/word/2010/wordprocessingGroup" xmlns:wpi="http://schemas.microsoft.com/office/word/2010/wordprocessingInk" xmlns:wne="http://schemas.microsoft.com/office/word/2006/wordml" xmlns:wps="http://schemas.microsoft.com/office/word/2010/wordprocessingShape" mc:Ignorable="w14 w15 w16se w16cid w16 w16cex w16sdtdh w16sdtfl w16du wp14">
+  <w:p>
+    <w:pPr>
+      <w:pStyle w:val="Cabealho"/>
+    </w:pPr>
+  </w:p>
+</w:hdr>
 </file>
 
 <file path=word/numbering.xml><?xml version="1.0" encoding="utf-8"?>
@@ -6928,6 +8010,715 @@
       </w:pPr>
       <w:rPr>
         <w:rFonts w:ascii="Symbol" w:hAnsi="Symbol" w:hint="default"/>
+      </w:rPr>
+    </w:lvl>
+  </w:abstractNum>
+  <w:abstractNum w:abstractNumId="9" w15:restartNumberingAfterBreak="0">
+    <w:nsid w:val="008E002F"/>
+    <w:multiLevelType w:val="hybridMultilevel"/>
+    <w:tmpl w:val="74240522"/>
+    <w:lvl w:ilvl="0" w:tplc="08160003">
+      <w:start w:val="1"/>
+      <w:numFmt w:val="bullet"/>
+      <w:lvlText w:val="o"/>
+      <w:lvlJc w:val="left"/>
+      <w:pPr>
+        <w:ind w:left="763" w:hanging="360"/>
+      </w:pPr>
+      <w:rPr>
+        <w:rFonts w:ascii="Courier New" w:hAnsi="Courier New" w:cs="Courier New" w:hint="default"/>
+      </w:rPr>
+    </w:lvl>
+    <w:lvl w:ilvl="1" w:tplc="08160003" w:tentative="1">
+      <w:start w:val="1"/>
+      <w:numFmt w:val="bullet"/>
+      <w:lvlText w:val="o"/>
+      <w:lvlJc w:val="left"/>
+      <w:pPr>
+        <w:ind w:left="1483" w:hanging="360"/>
+      </w:pPr>
+      <w:rPr>
+        <w:rFonts w:ascii="Courier New" w:hAnsi="Courier New" w:cs="Courier New" w:hint="default"/>
+      </w:rPr>
+    </w:lvl>
+    <w:lvl w:ilvl="2" w:tplc="08160005" w:tentative="1">
+      <w:start w:val="1"/>
+      <w:numFmt w:val="bullet"/>
+      <w:lvlText w:val=""/>
+      <w:lvlJc w:val="left"/>
+      <w:pPr>
+        <w:ind w:left="2203" w:hanging="360"/>
+      </w:pPr>
+      <w:rPr>
+        <w:rFonts w:ascii="Wingdings" w:hAnsi="Wingdings" w:hint="default"/>
+      </w:rPr>
+    </w:lvl>
+    <w:lvl w:ilvl="3" w:tplc="08160001" w:tentative="1">
+      <w:start w:val="1"/>
+      <w:numFmt w:val="bullet"/>
+      <w:lvlText w:val=""/>
+      <w:lvlJc w:val="left"/>
+      <w:pPr>
+        <w:ind w:left="2923" w:hanging="360"/>
+      </w:pPr>
+      <w:rPr>
+        <w:rFonts w:ascii="Symbol" w:hAnsi="Symbol" w:hint="default"/>
+      </w:rPr>
+    </w:lvl>
+    <w:lvl w:ilvl="4" w:tplc="08160003" w:tentative="1">
+      <w:start w:val="1"/>
+      <w:numFmt w:val="bullet"/>
+      <w:lvlText w:val="o"/>
+      <w:lvlJc w:val="left"/>
+      <w:pPr>
+        <w:ind w:left="3643" w:hanging="360"/>
+      </w:pPr>
+      <w:rPr>
+        <w:rFonts w:ascii="Courier New" w:hAnsi="Courier New" w:cs="Courier New" w:hint="default"/>
+      </w:rPr>
+    </w:lvl>
+    <w:lvl w:ilvl="5" w:tplc="08160005" w:tentative="1">
+      <w:start w:val="1"/>
+      <w:numFmt w:val="bullet"/>
+      <w:lvlText w:val=""/>
+      <w:lvlJc w:val="left"/>
+      <w:pPr>
+        <w:ind w:left="4363" w:hanging="360"/>
+      </w:pPr>
+      <w:rPr>
+        <w:rFonts w:ascii="Wingdings" w:hAnsi="Wingdings" w:hint="default"/>
+      </w:rPr>
+    </w:lvl>
+    <w:lvl w:ilvl="6" w:tplc="08160001" w:tentative="1">
+      <w:start w:val="1"/>
+      <w:numFmt w:val="bullet"/>
+      <w:lvlText w:val=""/>
+      <w:lvlJc w:val="left"/>
+      <w:pPr>
+        <w:ind w:left="5083" w:hanging="360"/>
+      </w:pPr>
+      <w:rPr>
+        <w:rFonts w:ascii="Symbol" w:hAnsi="Symbol" w:hint="default"/>
+      </w:rPr>
+    </w:lvl>
+    <w:lvl w:ilvl="7" w:tplc="08160003" w:tentative="1">
+      <w:start w:val="1"/>
+      <w:numFmt w:val="bullet"/>
+      <w:lvlText w:val="o"/>
+      <w:lvlJc w:val="left"/>
+      <w:pPr>
+        <w:ind w:left="5803" w:hanging="360"/>
+      </w:pPr>
+      <w:rPr>
+        <w:rFonts w:ascii="Courier New" w:hAnsi="Courier New" w:cs="Courier New" w:hint="default"/>
+      </w:rPr>
+    </w:lvl>
+    <w:lvl w:ilvl="8" w:tplc="08160005" w:tentative="1">
+      <w:start w:val="1"/>
+      <w:numFmt w:val="bullet"/>
+      <w:lvlText w:val=""/>
+      <w:lvlJc w:val="left"/>
+      <w:pPr>
+        <w:ind w:left="6523" w:hanging="360"/>
+      </w:pPr>
+      <w:rPr>
+        <w:rFonts w:ascii="Wingdings" w:hAnsi="Wingdings" w:hint="default"/>
+      </w:rPr>
+    </w:lvl>
+  </w:abstractNum>
+  <w:abstractNum w:abstractNumId="10" w15:restartNumberingAfterBreak="0">
+    <w:nsid w:val="0BB42A54"/>
+    <w:multiLevelType w:val="multilevel"/>
+    <w:tmpl w:val="3FD66ECC"/>
+    <w:lvl w:ilvl="0">
+      <w:start w:val="1"/>
+      <w:numFmt w:val="bullet"/>
+      <w:lvlText w:val=""/>
+      <w:lvlJc w:val="left"/>
+      <w:pPr>
+        <w:tabs>
+          <w:tab w:val="num" w:pos="720"/>
+        </w:tabs>
+        <w:ind w:left="720" w:hanging="360"/>
+      </w:pPr>
+      <w:rPr>
+        <w:rFonts w:ascii="Symbol" w:hAnsi="Symbol" w:hint="default"/>
+        <w:sz w:val="20"/>
+      </w:rPr>
+    </w:lvl>
+    <w:lvl w:ilvl="1" w:tentative="1">
+      <w:start w:val="1"/>
+      <w:numFmt w:val="bullet"/>
+      <w:lvlText w:val="o"/>
+      <w:lvlJc w:val="left"/>
+      <w:pPr>
+        <w:tabs>
+          <w:tab w:val="num" w:pos="1440"/>
+        </w:tabs>
+        <w:ind w:left="1440" w:hanging="360"/>
+      </w:pPr>
+      <w:rPr>
+        <w:rFonts w:ascii="Courier New" w:hAnsi="Courier New" w:hint="default"/>
+        <w:sz w:val="20"/>
+      </w:rPr>
+    </w:lvl>
+    <w:lvl w:ilvl="2" w:tentative="1">
+      <w:start w:val="1"/>
+      <w:numFmt w:val="bullet"/>
+      <w:lvlText w:val=""/>
+      <w:lvlJc w:val="left"/>
+      <w:pPr>
+        <w:tabs>
+          <w:tab w:val="num" w:pos="2160"/>
+        </w:tabs>
+        <w:ind w:left="2160" w:hanging="360"/>
+      </w:pPr>
+      <w:rPr>
+        <w:rFonts w:ascii="Wingdings" w:hAnsi="Wingdings" w:hint="default"/>
+        <w:sz w:val="20"/>
+      </w:rPr>
+    </w:lvl>
+    <w:lvl w:ilvl="3" w:tentative="1">
+      <w:start w:val="1"/>
+      <w:numFmt w:val="bullet"/>
+      <w:lvlText w:val=""/>
+      <w:lvlJc w:val="left"/>
+      <w:pPr>
+        <w:tabs>
+          <w:tab w:val="num" w:pos="2880"/>
+        </w:tabs>
+        <w:ind w:left="2880" w:hanging="360"/>
+      </w:pPr>
+      <w:rPr>
+        <w:rFonts w:ascii="Wingdings" w:hAnsi="Wingdings" w:hint="default"/>
+        <w:sz w:val="20"/>
+      </w:rPr>
+    </w:lvl>
+    <w:lvl w:ilvl="4" w:tentative="1">
+      <w:start w:val="1"/>
+      <w:numFmt w:val="bullet"/>
+      <w:lvlText w:val=""/>
+      <w:lvlJc w:val="left"/>
+      <w:pPr>
+        <w:tabs>
+          <w:tab w:val="num" w:pos="3600"/>
+        </w:tabs>
+        <w:ind w:left="3600" w:hanging="360"/>
+      </w:pPr>
+      <w:rPr>
+        <w:rFonts w:ascii="Wingdings" w:hAnsi="Wingdings" w:hint="default"/>
+        <w:sz w:val="20"/>
+      </w:rPr>
+    </w:lvl>
+    <w:lvl w:ilvl="5" w:tentative="1">
+      <w:start w:val="1"/>
+      <w:numFmt w:val="bullet"/>
+      <w:lvlText w:val=""/>
+      <w:lvlJc w:val="left"/>
+      <w:pPr>
+        <w:tabs>
+          <w:tab w:val="num" w:pos="4320"/>
+        </w:tabs>
+        <w:ind w:left="4320" w:hanging="360"/>
+      </w:pPr>
+      <w:rPr>
+        <w:rFonts w:ascii="Wingdings" w:hAnsi="Wingdings" w:hint="default"/>
+        <w:sz w:val="20"/>
+      </w:rPr>
+    </w:lvl>
+    <w:lvl w:ilvl="6" w:tentative="1">
+      <w:start w:val="1"/>
+      <w:numFmt w:val="bullet"/>
+      <w:lvlText w:val=""/>
+      <w:lvlJc w:val="left"/>
+      <w:pPr>
+        <w:tabs>
+          <w:tab w:val="num" w:pos="5040"/>
+        </w:tabs>
+        <w:ind w:left="5040" w:hanging="360"/>
+      </w:pPr>
+      <w:rPr>
+        <w:rFonts w:ascii="Wingdings" w:hAnsi="Wingdings" w:hint="default"/>
+        <w:sz w:val="20"/>
+      </w:rPr>
+    </w:lvl>
+    <w:lvl w:ilvl="7" w:tentative="1">
+      <w:start w:val="1"/>
+      <w:numFmt w:val="bullet"/>
+      <w:lvlText w:val=""/>
+      <w:lvlJc w:val="left"/>
+      <w:pPr>
+        <w:tabs>
+          <w:tab w:val="num" w:pos="5760"/>
+        </w:tabs>
+        <w:ind w:left="5760" w:hanging="360"/>
+      </w:pPr>
+      <w:rPr>
+        <w:rFonts w:ascii="Wingdings" w:hAnsi="Wingdings" w:hint="default"/>
+        <w:sz w:val="20"/>
+      </w:rPr>
+    </w:lvl>
+    <w:lvl w:ilvl="8" w:tentative="1">
+      <w:start w:val="1"/>
+      <w:numFmt w:val="bullet"/>
+      <w:lvlText w:val=""/>
+      <w:lvlJc w:val="left"/>
+      <w:pPr>
+        <w:tabs>
+          <w:tab w:val="num" w:pos="6480"/>
+        </w:tabs>
+        <w:ind w:left="6480" w:hanging="360"/>
+      </w:pPr>
+      <w:rPr>
+        <w:rFonts w:ascii="Wingdings" w:hAnsi="Wingdings" w:hint="default"/>
+        <w:sz w:val="20"/>
+      </w:rPr>
+    </w:lvl>
+  </w:abstractNum>
+  <w:abstractNum w:abstractNumId="11" w15:restartNumberingAfterBreak="0">
+    <w:nsid w:val="2DA67FDF"/>
+    <w:multiLevelType w:val="multilevel"/>
+    <w:tmpl w:val="A88C9F0E"/>
+    <w:lvl w:ilvl="0">
+      <w:start w:val="1"/>
+      <w:numFmt w:val="bullet"/>
+      <w:lvlText w:val=""/>
+      <w:lvlJc w:val="left"/>
+      <w:pPr>
+        <w:tabs>
+          <w:tab w:val="num" w:pos="720"/>
+        </w:tabs>
+        <w:ind w:left="720" w:hanging="360"/>
+      </w:pPr>
+      <w:rPr>
+        <w:rFonts w:ascii="Symbol" w:hAnsi="Symbol" w:hint="default"/>
+        <w:sz w:val="20"/>
+      </w:rPr>
+    </w:lvl>
+    <w:lvl w:ilvl="1" w:tentative="1">
+      <w:start w:val="1"/>
+      <w:numFmt w:val="bullet"/>
+      <w:lvlText w:val="o"/>
+      <w:lvlJc w:val="left"/>
+      <w:pPr>
+        <w:tabs>
+          <w:tab w:val="num" w:pos="1440"/>
+        </w:tabs>
+        <w:ind w:left="1440" w:hanging="360"/>
+      </w:pPr>
+      <w:rPr>
+        <w:rFonts w:ascii="Courier New" w:hAnsi="Courier New" w:hint="default"/>
+        <w:sz w:val="20"/>
+      </w:rPr>
+    </w:lvl>
+    <w:lvl w:ilvl="2" w:tentative="1">
+      <w:start w:val="1"/>
+      <w:numFmt w:val="bullet"/>
+      <w:lvlText w:val=""/>
+      <w:lvlJc w:val="left"/>
+      <w:pPr>
+        <w:tabs>
+          <w:tab w:val="num" w:pos="2160"/>
+        </w:tabs>
+        <w:ind w:left="2160" w:hanging="360"/>
+      </w:pPr>
+      <w:rPr>
+        <w:rFonts w:ascii="Wingdings" w:hAnsi="Wingdings" w:hint="default"/>
+        <w:sz w:val="20"/>
+      </w:rPr>
+    </w:lvl>
+    <w:lvl w:ilvl="3" w:tentative="1">
+      <w:start w:val="1"/>
+      <w:numFmt w:val="bullet"/>
+      <w:lvlText w:val=""/>
+      <w:lvlJc w:val="left"/>
+      <w:pPr>
+        <w:tabs>
+          <w:tab w:val="num" w:pos="2880"/>
+        </w:tabs>
+        <w:ind w:left="2880" w:hanging="360"/>
+      </w:pPr>
+      <w:rPr>
+        <w:rFonts w:ascii="Wingdings" w:hAnsi="Wingdings" w:hint="default"/>
+        <w:sz w:val="20"/>
+      </w:rPr>
+    </w:lvl>
+    <w:lvl w:ilvl="4" w:tentative="1">
+      <w:start w:val="1"/>
+      <w:numFmt w:val="bullet"/>
+      <w:lvlText w:val=""/>
+      <w:lvlJc w:val="left"/>
+      <w:pPr>
+        <w:tabs>
+          <w:tab w:val="num" w:pos="3600"/>
+        </w:tabs>
+        <w:ind w:left="3600" w:hanging="360"/>
+      </w:pPr>
+      <w:rPr>
+        <w:rFonts w:ascii="Wingdings" w:hAnsi="Wingdings" w:hint="default"/>
+        <w:sz w:val="20"/>
+      </w:rPr>
+    </w:lvl>
+    <w:lvl w:ilvl="5" w:tentative="1">
+      <w:start w:val="1"/>
+      <w:numFmt w:val="bullet"/>
+      <w:lvlText w:val=""/>
+      <w:lvlJc w:val="left"/>
+      <w:pPr>
+        <w:tabs>
+          <w:tab w:val="num" w:pos="4320"/>
+        </w:tabs>
+        <w:ind w:left="4320" w:hanging="360"/>
+      </w:pPr>
+      <w:rPr>
+        <w:rFonts w:ascii="Wingdings" w:hAnsi="Wingdings" w:hint="default"/>
+        <w:sz w:val="20"/>
+      </w:rPr>
+    </w:lvl>
+    <w:lvl w:ilvl="6" w:tentative="1">
+      <w:start w:val="1"/>
+      <w:numFmt w:val="bullet"/>
+      <w:lvlText w:val=""/>
+      <w:lvlJc w:val="left"/>
+      <w:pPr>
+        <w:tabs>
+          <w:tab w:val="num" w:pos="5040"/>
+        </w:tabs>
+        <w:ind w:left="5040" w:hanging="360"/>
+      </w:pPr>
+      <w:rPr>
+        <w:rFonts w:ascii="Wingdings" w:hAnsi="Wingdings" w:hint="default"/>
+        <w:sz w:val="20"/>
+      </w:rPr>
+    </w:lvl>
+    <w:lvl w:ilvl="7" w:tentative="1">
+      <w:start w:val="1"/>
+      <w:numFmt w:val="bullet"/>
+      <w:lvlText w:val=""/>
+      <w:lvlJc w:val="left"/>
+      <w:pPr>
+        <w:tabs>
+          <w:tab w:val="num" w:pos="5760"/>
+        </w:tabs>
+        <w:ind w:left="5760" w:hanging="360"/>
+      </w:pPr>
+      <w:rPr>
+        <w:rFonts w:ascii="Wingdings" w:hAnsi="Wingdings" w:hint="default"/>
+        <w:sz w:val="20"/>
+      </w:rPr>
+    </w:lvl>
+    <w:lvl w:ilvl="8" w:tentative="1">
+      <w:start w:val="1"/>
+      <w:numFmt w:val="bullet"/>
+      <w:lvlText w:val=""/>
+      <w:lvlJc w:val="left"/>
+      <w:pPr>
+        <w:tabs>
+          <w:tab w:val="num" w:pos="6480"/>
+        </w:tabs>
+        <w:ind w:left="6480" w:hanging="360"/>
+      </w:pPr>
+      <w:rPr>
+        <w:rFonts w:ascii="Wingdings" w:hAnsi="Wingdings" w:hint="default"/>
+        <w:sz w:val="20"/>
+      </w:rPr>
+    </w:lvl>
+  </w:abstractNum>
+  <w:abstractNum w:abstractNumId="12" w15:restartNumberingAfterBreak="0">
+    <w:nsid w:val="307A74B2"/>
+    <w:multiLevelType w:val="multilevel"/>
+    <w:tmpl w:val="3142FDC8"/>
+    <w:lvl w:ilvl="0">
+      <w:start w:val="1"/>
+      <w:numFmt w:val="bullet"/>
+      <w:lvlText w:val=""/>
+      <w:lvlJc w:val="left"/>
+      <w:pPr>
+        <w:tabs>
+          <w:tab w:val="num" w:pos="720"/>
+        </w:tabs>
+        <w:ind w:left="720" w:hanging="360"/>
+      </w:pPr>
+      <w:rPr>
+        <w:rFonts w:ascii="Symbol" w:hAnsi="Symbol" w:hint="default"/>
+        <w:sz w:val="20"/>
+      </w:rPr>
+    </w:lvl>
+    <w:lvl w:ilvl="1" w:tentative="1">
+      <w:start w:val="1"/>
+      <w:numFmt w:val="bullet"/>
+      <w:lvlText w:val="o"/>
+      <w:lvlJc w:val="left"/>
+      <w:pPr>
+        <w:tabs>
+          <w:tab w:val="num" w:pos="1440"/>
+        </w:tabs>
+        <w:ind w:left="1440" w:hanging="360"/>
+      </w:pPr>
+      <w:rPr>
+        <w:rFonts w:ascii="Courier New" w:hAnsi="Courier New" w:hint="default"/>
+        <w:sz w:val="20"/>
+      </w:rPr>
+    </w:lvl>
+    <w:lvl w:ilvl="2" w:tentative="1">
+      <w:start w:val="1"/>
+      <w:numFmt w:val="bullet"/>
+      <w:lvlText w:val=""/>
+      <w:lvlJc w:val="left"/>
+      <w:pPr>
+        <w:tabs>
+          <w:tab w:val="num" w:pos="2160"/>
+        </w:tabs>
+        <w:ind w:left="2160" w:hanging="360"/>
+      </w:pPr>
+      <w:rPr>
+        <w:rFonts w:ascii="Wingdings" w:hAnsi="Wingdings" w:hint="default"/>
+        <w:sz w:val="20"/>
+      </w:rPr>
+    </w:lvl>
+    <w:lvl w:ilvl="3" w:tentative="1">
+      <w:start w:val="1"/>
+      <w:numFmt w:val="bullet"/>
+      <w:lvlText w:val=""/>
+      <w:lvlJc w:val="left"/>
+      <w:pPr>
+        <w:tabs>
+          <w:tab w:val="num" w:pos="2880"/>
+        </w:tabs>
+        <w:ind w:left="2880" w:hanging="360"/>
+      </w:pPr>
+      <w:rPr>
+        <w:rFonts w:ascii="Wingdings" w:hAnsi="Wingdings" w:hint="default"/>
+        <w:sz w:val="20"/>
+      </w:rPr>
+    </w:lvl>
+    <w:lvl w:ilvl="4" w:tentative="1">
+      <w:start w:val="1"/>
+      <w:numFmt w:val="bullet"/>
+      <w:lvlText w:val=""/>
+      <w:lvlJc w:val="left"/>
+      <w:pPr>
+        <w:tabs>
+          <w:tab w:val="num" w:pos="3600"/>
+        </w:tabs>
+        <w:ind w:left="3600" w:hanging="360"/>
+      </w:pPr>
+      <w:rPr>
+        <w:rFonts w:ascii="Wingdings" w:hAnsi="Wingdings" w:hint="default"/>
+        <w:sz w:val="20"/>
+      </w:rPr>
+    </w:lvl>
+    <w:lvl w:ilvl="5" w:tentative="1">
+      <w:start w:val="1"/>
+      <w:numFmt w:val="bullet"/>
+      <w:lvlText w:val=""/>
+      <w:lvlJc w:val="left"/>
+      <w:pPr>
+        <w:tabs>
+          <w:tab w:val="num" w:pos="4320"/>
+        </w:tabs>
+        <w:ind w:left="4320" w:hanging="360"/>
+      </w:pPr>
+      <w:rPr>
+        <w:rFonts w:ascii="Wingdings" w:hAnsi="Wingdings" w:hint="default"/>
+        <w:sz w:val="20"/>
+      </w:rPr>
+    </w:lvl>
+    <w:lvl w:ilvl="6" w:tentative="1">
+      <w:start w:val="1"/>
+      <w:numFmt w:val="bullet"/>
+      <w:lvlText w:val=""/>
+      <w:lvlJc w:val="left"/>
+      <w:pPr>
+        <w:tabs>
+          <w:tab w:val="num" w:pos="5040"/>
+        </w:tabs>
+        <w:ind w:left="5040" w:hanging="360"/>
+      </w:pPr>
+      <w:rPr>
+        <w:rFonts w:ascii="Wingdings" w:hAnsi="Wingdings" w:hint="default"/>
+        <w:sz w:val="20"/>
+      </w:rPr>
+    </w:lvl>
+    <w:lvl w:ilvl="7" w:tentative="1">
+      <w:start w:val="1"/>
+      <w:numFmt w:val="bullet"/>
+      <w:lvlText w:val=""/>
+      <w:lvlJc w:val="left"/>
+      <w:pPr>
+        <w:tabs>
+          <w:tab w:val="num" w:pos="5760"/>
+        </w:tabs>
+        <w:ind w:left="5760" w:hanging="360"/>
+      </w:pPr>
+      <w:rPr>
+        <w:rFonts w:ascii="Wingdings" w:hAnsi="Wingdings" w:hint="default"/>
+        <w:sz w:val="20"/>
+      </w:rPr>
+    </w:lvl>
+    <w:lvl w:ilvl="8" w:tentative="1">
+      <w:start w:val="1"/>
+      <w:numFmt w:val="bullet"/>
+      <w:lvlText w:val=""/>
+      <w:lvlJc w:val="left"/>
+      <w:pPr>
+        <w:tabs>
+          <w:tab w:val="num" w:pos="6480"/>
+        </w:tabs>
+        <w:ind w:left="6480" w:hanging="360"/>
+      </w:pPr>
+      <w:rPr>
+        <w:rFonts w:ascii="Wingdings" w:hAnsi="Wingdings" w:hint="default"/>
+        <w:sz w:val="20"/>
+      </w:rPr>
+    </w:lvl>
+  </w:abstractNum>
+  <w:abstractNum w:abstractNumId="13" w15:restartNumberingAfterBreak="0">
+    <w:nsid w:val="7F3E2FF6"/>
+    <w:multiLevelType w:val="multilevel"/>
+    <w:tmpl w:val="6BD672CE"/>
+    <w:lvl w:ilvl="0">
+      <w:start w:val="1"/>
+      <w:numFmt w:val="bullet"/>
+      <w:lvlText w:val=""/>
+      <w:lvlJc w:val="left"/>
+      <w:pPr>
+        <w:tabs>
+          <w:tab w:val="num" w:pos="720"/>
+        </w:tabs>
+        <w:ind w:left="720" w:hanging="360"/>
+      </w:pPr>
+      <w:rPr>
+        <w:rFonts w:ascii="Symbol" w:hAnsi="Symbol" w:hint="default"/>
+        <w:sz w:val="20"/>
+      </w:rPr>
+    </w:lvl>
+    <w:lvl w:ilvl="1" w:tentative="1">
+      <w:start w:val="1"/>
+      <w:numFmt w:val="bullet"/>
+      <w:lvlText w:val="o"/>
+      <w:lvlJc w:val="left"/>
+      <w:pPr>
+        <w:tabs>
+          <w:tab w:val="num" w:pos="1440"/>
+        </w:tabs>
+        <w:ind w:left="1440" w:hanging="360"/>
+      </w:pPr>
+      <w:rPr>
+        <w:rFonts w:ascii="Courier New" w:hAnsi="Courier New" w:hint="default"/>
+        <w:sz w:val="20"/>
+      </w:rPr>
+    </w:lvl>
+    <w:lvl w:ilvl="2" w:tentative="1">
+      <w:start w:val="1"/>
+      <w:numFmt w:val="bullet"/>
+      <w:lvlText w:val=""/>
+      <w:lvlJc w:val="left"/>
+      <w:pPr>
+        <w:tabs>
+          <w:tab w:val="num" w:pos="2160"/>
+        </w:tabs>
+        <w:ind w:left="2160" w:hanging="360"/>
+      </w:pPr>
+      <w:rPr>
+        <w:rFonts w:ascii="Wingdings" w:hAnsi="Wingdings" w:hint="default"/>
+        <w:sz w:val="20"/>
+      </w:rPr>
+    </w:lvl>
+    <w:lvl w:ilvl="3" w:tentative="1">
+      <w:start w:val="1"/>
+      <w:numFmt w:val="bullet"/>
+      <w:lvlText w:val=""/>
+      <w:lvlJc w:val="left"/>
+      <w:pPr>
+        <w:tabs>
+          <w:tab w:val="num" w:pos="2880"/>
+        </w:tabs>
+        <w:ind w:left="2880" w:hanging="360"/>
+      </w:pPr>
+      <w:rPr>
+        <w:rFonts w:ascii="Wingdings" w:hAnsi="Wingdings" w:hint="default"/>
+        <w:sz w:val="20"/>
+      </w:rPr>
+    </w:lvl>
+    <w:lvl w:ilvl="4" w:tentative="1">
+      <w:start w:val="1"/>
+      <w:numFmt w:val="bullet"/>
+      <w:lvlText w:val=""/>
+      <w:lvlJc w:val="left"/>
+      <w:pPr>
+        <w:tabs>
+          <w:tab w:val="num" w:pos="3600"/>
+        </w:tabs>
+        <w:ind w:left="3600" w:hanging="360"/>
+      </w:pPr>
+      <w:rPr>
+        <w:rFonts w:ascii="Wingdings" w:hAnsi="Wingdings" w:hint="default"/>
+        <w:sz w:val="20"/>
+      </w:rPr>
+    </w:lvl>
+    <w:lvl w:ilvl="5" w:tentative="1">
+      <w:start w:val="1"/>
+      <w:numFmt w:val="bullet"/>
+      <w:lvlText w:val=""/>
+      <w:lvlJc w:val="left"/>
+      <w:pPr>
+        <w:tabs>
+          <w:tab w:val="num" w:pos="4320"/>
+        </w:tabs>
+        <w:ind w:left="4320" w:hanging="360"/>
+      </w:pPr>
+      <w:rPr>
+        <w:rFonts w:ascii="Wingdings" w:hAnsi="Wingdings" w:hint="default"/>
+        <w:sz w:val="20"/>
+      </w:rPr>
+    </w:lvl>
+    <w:lvl w:ilvl="6" w:tentative="1">
+      <w:start w:val="1"/>
+      <w:numFmt w:val="bullet"/>
+      <w:lvlText w:val=""/>
+      <w:lvlJc w:val="left"/>
+      <w:pPr>
+        <w:tabs>
+          <w:tab w:val="num" w:pos="5040"/>
+        </w:tabs>
+        <w:ind w:left="5040" w:hanging="360"/>
+      </w:pPr>
+      <w:rPr>
+        <w:rFonts w:ascii="Wingdings" w:hAnsi="Wingdings" w:hint="default"/>
+        <w:sz w:val="20"/>
+      </w:rPr>
+    </w:lvl>
+    <w:lvl w:ilvl="7" w:tentative="1">
+      <w:start w:val="1"/>
+      <w:numFmt w:val="bullet"/>
+      <w:lvlText w:val=""/>
+      <w:lvlJc w:val="left"/>
+      <w:pPr>
+        <w:tabs>
+          <w:tab w:val="num" w:pos="5760"/>
+        </w:tabs>
+        <w:ind w:left="5760" w:hanging="360"/>
+      </w:pPr>
+      <w:rPr>
+        <w:rFonts w:ascii="Wingdings" w:hAnsi="Wingdings" w:hint="default"/>
+        <w:sz w:val="20"/>
+      </w:rPr>
+    </w:lvl>
+    <w:lvl w:ilvl="8" w:tentative="1">
+      <w:start w:val="1"/>
+      <w:numFmt w:val="bullet"/>
+      <w:lvlText w:val=""/>
+      <w:lvlJc w:val="left"/>
+      <w:pPr>
+        <w:tabs>
+          <w:tab w:val="num" w:pos="6480"/>
+        </w:tabs>
+        <w:ind w:left="6480" w:hanging="360"/>
+      </w:pPr>
+      <w:rPr>
+        <w:rFonts w:ascii="Wingdings" w:hAnsi="Wingdings" w:hint="default"/>
+        <w:sz w:val="20"/>
       </w:rPr>
     </w:lvl>
   </w:abstractNum>
@@ -6957,6 +8748,30 @@
   </w:num>
   <w:num w:numId="9" w16cid:durableId="62798357">
     <w:abstractNumId w:val="0"/>
+  </w:num>
+  <w:num w:numId="10" w16cid:durableId="944731924">
+    <w:abstractNumId w:val="11"/>
+  </w:num>
+  <w:num w:numId="11" w16cid:durableId="1756590278">
+    <w:abstractNumId w:val="13"/>
+  </w:num>
+  <w:num w:numId="12" w16cid:durableId="1996490998">
+    <w:abstractNumId w:val="9"/>
+  </w:num>
+  <w:num w:numId="13" w16cid:durableId="282544529">
+    <w:abstractNumId w:val="8"/>
+  </w:num>
+  <w:num w:numId="14" w16cid:durableId="177471708">
+    <w:abstractNumId w:val="10"/>
+  </w:num>
+  <w:num w:numId="15" w16cid:durableId="952787615">
+    <w:abstractNumId w:val="12"/>
+  </w:num>
+  <w:num w:numId="16" w16cid:durableId="1675062819">
+    <w:abstractNumId w:val="8"/>
+  </w:num>
+  <w:num w:numId="17" w16cid:durableId="1073627357">
+    <w:abstractNumId w:val="8"/>
   </w:num>
 </w:numbering>
 </file>
@@ -7570,7 +9385,6 @@
   <w:style w:type="character" w:default="1" w:styleId="Tipodeletrapredefinidodopargrafo">
     <w:name w:val="Default Paragraph Font"/>
     <w:uiPriority w:val="1"/>
-    <w:semiHidden/>
     <w:unhideWhenUsed/>
   </w:style>
   <w:style w:type="table" w:default="1" w:styleId="Tabelanormal">
@@ -7884,7 +9698,6 @@
       <w:numPr>
         <w:numId w:val="1"/>
       </w:numPr>
-      <w:ind w:left="403" w:hanging="230"/>
       <w:contextualSpacing/>
     </w:pPr>
     <w:rPr>

</xml_diff>